<commit_message>
I put some imgs in the sprints! Pls countue doing that, aswell as fixing the databse
</commit_message>
<xml_diff>
--- a/L3 Web Application Development Log.docx
+++ b/L3 Web Application Development Log.docx
@@ -361,57 +361,97 @@
                 <w:szCs w:val="22"/>
                 <w:lang w:val="en-US" w:eastAsia="zh-CN" w:bidi="hi-IN"/>
               </w:rPr>
-              <w:t xml:space="preserve">In this project or website </w:t>
-            </w:r>
-            <w:r>
-              <w:rPr>
-                <w:rFonts w:eastAsia="Arial" w:cs="Arial"/>
-                <w:kern w:val="0"/>
-                <w:sz w:val="22"/>
-                <w:szCs w:val="22"/>
-                <w:lang w:val="en-US" w:eastAsia="zh-CN" w:bidi="hi-IN"/>
-              </w:rPr>
-              <w:t>Im</w:t>
-            </w:r>
-            <w:r>
-              <w:rPr>
-                <w:rFonts w:eastAsia="Arial" w:cs="Arial"/>
-                <w:kern w:val="0"/>
-                <w:sz w:val="22"/>
-                <w:szCs w:val="22"/>
-                <w:lang w:val="en-US" w:eastAsia="zh-CN" w:bidi="hi-IN"/>
-              </w:rPr>
-              <w:t xml:space="preserve"> making is about having pages of different type of games from different genres to help people find and show games they they might like. </w:t>
-            </w:r>
-            <w:r>
-              <w:rPr>
-                <w:rFonts w:eastAsia="Arial" w:cs="Arial"/>
-                <w:kern w:val="0"/>
-                <w:sz w:val="22"/>
-                <w:szCs w:val="22"/>
-                <w:lang w:val="en-US" w:eastAsia="zh-CN" w:bidi="hi-IN"/>
-              </w:rPr>
-              <w:t>Website</w:t>
-            </w:r>
-            <w:r>
-              <w:rPr>
-                <w:rFonts w:eastAsia="Arial" w:cs="Arial"/>
-                <w:kern w:val="0"/>
-                <w:sz w:val="22"/>
-                <w:szCs w:val="22"/>
-                <w:lang w:val="en-US" w:eastAsia="zh-CN" w:bidi="hi-IN"/>
-              </w:rPr>
-              <w:t xml:space="preserve"> Gamers and like to talk about </w:t>
-            </w:r>
-            <w:r>
-              <w:rPr>
-                <w:rFonts w:eastAsia="Arial" w:cs="Arial"/>
-                <w:kern w:val="0"/>
-                <w:sz w:val="22"/>
-                <w:szCs w:val="22"/>
-                <w:lang w:val="en-US" w:eastAsia="zh-CN" w:bidi="hi-IN"/>
-              </w:rPr>
-              <w:t>t</w:t>
+              <w:t xml:space="preserve">In this project or website Im making is about having pages of different type of games from different genres to help people find and show games they they might like. </w:t>
+            </w:r>
+            <w:r>
+              <w:rPr>
+                <w:rFonts w:eastAsia="Arial" w:cs="Arial"/>
+                <w:kern w:val="0"/>
+                <w:sz w:val="22"/>
+                <w:szCs w:val="22"/>
+                <w:lang w:val="en-US" w:eastAsia="zh-CN" w:bidi="hi-IN"/>
+              </w:rPr>
+              <w:t>The w</w:t>
+            </w:r>
+            <w:r>
+              <w:rPr>
+                <w:rFonts w:eastAsia="Arial" w:cs="Arial"/>
+                <w:kern w:val="0"/>
+                <w:sz w:val="22"/>
+                <w:szCs w:val="22"/>
+                <w:lang w:val="en-US" w:eastAsia="zh-CN" w:bidi="hi-IN"/>
+              </w:rPr>
+              <w:t xml:space="preserve">ebsite </w:t>
+            </w:r>
+            <w:r>
+              <w:rPr>
+                <w:rFonts w:eastAsia="Arial" w:cs="Arial"/>
+                <w:kern w:val="0"/>
+                <w:sz w:val="22"/>
+                <w:szCs w:val="22"/>
+                <w:lang w:val="en-US" w:eastAsia="zh-CN" w:bidi="hi-IN"/>
+              </w:rPr>
+              <w:t>is for</w:t>
+            </w:r>
+            <w:r>
+              <w:rPr>
+                <w:rFonts w:eastAsia="Arial" w:cs="Arial"/>
+                <w:kern w:val="0"/>
+                <w:sz w:val="22"/>
+                <w:szCs w:val="22"/>
+                <w:lang w:val="en-US" w:eastAsia="zh-CN" w:bidi="hi-IN"/>
+              </w:rPr>
+              <w:t xml:space="preserve"> </w:t>
+            </w:r>
+            <w:r>
+              <w:rPr>
+                <w:rFonts w:eastAsia="Arial" w:cs="Arial"/>
+                <w:kern w:val="0"/>
+                <w:sz w:val="22"/>
+                <w:szCs w:val="22"/>
+                <w:lang w:val="en-US" w:eastAsia="zh-CN" w:bidi="hi-IN"/>
+              </w:rPr>
+              <w:t>g</w:t>
+            </w:r>
+            <w:r>
+              <w:rPr>
+                <w:rFonts w:eastAsia="Arial" w:cs="Arial"/>
+                <w:kern w:val="0"/>
+                <w:sz w:val="22"/>
+                <w:szCs w:val="22"/>
+                <w:lang w:val="en-US" w:eastAsia="zh-CN" w:bidi="hi-IN"/>
+              </w:rPr>
+              <w:t>amer</w:t>
+            </w:r>
+            <w:r>
+              <w:rPr>
+                <w:rFonts w:eastAsia="Arial" w:cs="Arial"/>
+                <w:kern w:val="0"/>
+                <w:sz w:val="22"/>
+                <w:szCs w:val="22"/>
+                <w:lang w:val="en-US" w:eastAsia="zh-CN" w:bidi="hi-IN"/>
+              </w:rPr>
+              <w:t>s</w:t>
+            </w:r>
+            <w:r>
+              <w:rPr>
+                <w:rFonts w:eastAsia="Arial" w:cs="Arial"/>
+                <w:kern w:val="0"/>
+                <w:sz w:val="22"/>
+                <w:szCs w:val="22"/>
+                <w:lang w:val="en-US" w:eastAsia="zh-CN" w:bidi="hi-IN"/>
+              </w:rPr>
+              <w:t xml:space="preserve"> and like to talk about </w:t>
+            </w:r>
+            <w:r>
+              <w:rPr>
+                <w:rFonts w:eastAsia="Arial" w:cs="Arial"/>
+                <w:kern w:val="0"/>
+                <w:sz w:val="22"/>
+                <w:szCs w:val="22"/>
+                <w:lang w:val="en-US" w:eastAsia="zh-CN" w:bidi="hi-IN"/>
+              </w:rPr>
+              <w:t>their</w:t>
             </w:r>
             <w:r>
               <w:rPr>
@@ -1573,8 +1613,8 @@
       </w:tblPr>
       <w:tblGrid>
         <w:gridCol w:w="3480"/>
-        <w:gridCol w:w="2820"/>
-        <w:gridCol w:w="3086"/>
+        <w:gridCol w:w="2467"/>
+        <w:gridCol w:w="3439"/>
         <w:gridCol w:w="1069"/>
       </w:tblGrid>
       <w:tr>
@@ -1618,7 +1658,7 @@
         </w:tc>
         <w:tc>
           <w:tcPr>
-            <w:tcW w:w="2820" w:type="dxa"/>
+            <w:tcW w:w="2467" w:type="dxa"/>
             <w:tcBorders>
               <w:top w:val="single" w:sz="8" w:space="0" w:color="000000"/>
               <w:start w:val="single" w:sz="8" w:space="0" w:color="000000"/>
@@ -1651,7 +1691,7 @@
         </w:tc>
         <w:tc>
           <w:tcPr>
-            <w:tcW w:w="3086" w:type="dxa"/>
+            <w:tcW w:w="3439" w:type="dxa"/>
             <w:tcBorders>
               <w:top w:val="single" w:sz="8" w:space="0" w:color="000000"/>
               <w:start w:val="single" w:sz="8" w:space="0" w:color="000000"/>
@@ -1758,7 +1798,7 @@
         </w:tc>
         <w:tc>
           <w:tcPr>
-            <w:tcW w:w="2820" w:type="dxa"/>
+            <w:tcW w:w="2467" w:type="dxa"/>
             <w:tcBorders>
               <w:top w:val="single" w:sz="8" w:space="0" w:color="000000"/>
               <w:start w:val="single" w:sz="8" w:space="0" w:color="000000"/>
@@ -1796,7 +1836,7 @@
         </w:tc>
         <w:tc>
           <w:tcPr>
-            <w:tcW w:w="3086" w:type="dxa"/>
+            <w:tcW w:w="3439" w:type="dxa"/>
             <w:tcBorders>
               <w:top w:val="single" w:sz="8" w:space="0" w:color="000000"/>
               <w:start w:val="single" w:sz="8" w:space="0" w:color="000000"/>
@@ -1908,7 +1948,7 @@
         </w:tc>
         <w:tc>
           <w:tcPr>
-            <w:tcW w:w="2820" w:type="dxa"/>
+            <w:tcW w:w="2467" w:type="dxa"/>
             <w:tcBorders>
               <w:top w:val="single" w:sz="8" w:space="0" w:color="000000"/>
               <w:start w:val="single" w:sz="8" w:space="0" w:color="000000"/>
@@ -1941,7 +1981,7 @@
         </w:tc>
         <w:tc>
           <w:tcPr>
-            <w:tcW w:w="3086" w:type="dxa"/>
+            <w:tcW w:w="3439" w:type="dxa"/>
             <w:tcBorders>
               <w:top w:val="single" w:sz="8" w:space="0" w:color="000000"/>
               <w:start w:val="single" w:sz="8" w:space="0" w:color="000000"/>
@@ -2038,7 +2078,7 @@
         </w:tc>
         <w:tc>
           <w:tcPr>
-            <w:tcW w:w="2820" w:type="dxa"/>
+            <w:tcW w:w="2467" w:type="dxa"/>
             <w:tcBorders>
               <w:top w:val="single" w:sz="8" w:space="0" w:color="000000"/>
               <w:start w:val="single" w:sz="8" w:space="0" w:color="000000"/>
@@ -2071,7 +2111,7 @@
         </w:tc>
         <w:tc>
           <w:tcPr>
-            <w:tcW w:w="3086" w:type="dxa"/>
+            <w:tcW w:w="3439" w:type="dxa"/>
             <w:tcBorders>
               <w:top w:val="single" w:sz="8" w:space="0" w:color="000000"/>
               <w:start w:val="single" w:sz="8" w:space="0" w:color="000000"/>
@@ -2132,7 +2172,9 @@
         </w:tc>
       </w:tr>
       <w:tr>
-        <w:trPr/>
+        <w:trPr>
+          <w:trHeight w:val="1758" w:hRule="atLeast"/>
+        </w:trPr>
         <w:tc>
           <w:tcPr>
             <w:tcW w:w="3480" w:type="dxa"/>
@@ -2158,47 +2200,112 @@
               <w:rPr>
                 <w:rFonts w:eastAsia="Calibri" w:cs="Calibri" w:ascii="Calibri" w:hAnsi="Calibri"/>
               </w:rPr>
-            </w:r>
-          </w:p>
-        </w:tc>
-        <w:tc>
-          <w:tcPr>
-            <w:tcW w:w="2820" w:type="dxa"/>
-            <w:tcBorders>
-              <w:top w:val="single" w:sz="8" w:space="0" w:color="000000"/>
-              <w:start w:val="single" w:sz="8" w:space="0" w:color="000000"/>
-              <w:bottom w:val="single" w:sz="8" w:space="0" w:color="000000"/>
-              <w:end w:val="single" w:sz="8" w:space="0" w:color="000000"/>
-            </w:tcBorders>
-          </w:tcPr>
-          <w:p>
-            <w:pPr>
-              <w:pStyle w:val="normal1"/>
-              <w:widowControl w:val="false"/>
-              <w:suppressAutoHyphens w:val="true"/>
-              <w:spacing w:lineRule="auto" w:line="240" w:before="0" w:after="0"/>
-              <w:jc w:val="start"/>
-              <w:rPr>
-                <w:rFonts w:ascii="Calibri" w:hAnsi="Calibri" w:eastAsia="Calibri" w:cs="Calibri"/>
-              </w:rPr>
-            </w:pPr>
-            <w:r>
-              <w:rPr>
-                <w:rFonts w:eastAsia="Calibri" w:cs="Calibri" w:ascii="Calibri" w:hAnsi="Calibri"/>
-              </w:rPr>
-            </w:r>
-          </w:p>
-        </w:tc>
-        <w:tc>
-          <w:tcPr>
-            <w:tcW w:w="3086" w:type="dxa"/>
-            <w:tcBorders>
-              <w:top w:val="single" w:sz="8" w:space="0" w:color="000000"/>
-              <w:start w:val="single" w:sz="8" w:space="0" w:color="000000"/>
-              <w:bottom w:val="single" w:sz="8" w:space="0" w:color="000000"/>
-              <w:end w:val="single" w:sz="8" w:space="0" w:color="000000"/>
-            </w:tcBorders>
-          </w:tcPr>
+              <w:t>Navigaiton Bar</w:t>
+            </w:r>
+          </w:p>
+        </w:tc>
+        <w:tc>
+          <w:tcPr>
+            <w:tcW w:w="2467" w:type="dxa"/>
+            <w:tcBorders>
+              <w:top w:val="single" w:sz="8" w:space="0" w:color="000000"/>
+              <w:start w:val="single" w:sz="8" w:space="0" w:color="000000"/>
+              <w:bottom w:val="single" w:sz="8" w:space="0" w:color="000000"/>
+              <w:end w:val="single" w:sz="8" w:space="0" w:color="000000"/>
+            </w:tcBorders>
+          </w:tcPr>
+          <w:p>
+            <w:pPr>
+              <w:pStyle w:val="normal1"/>
+              <w:widowControl w:val="false"/>
+              <w:suppressAutoHyphens w:val="true"/>
+              <w:spacing w:lineRule="auto" w:line="240" w:before="0" w:after="0"/>
+              <w:jc w:val="start"/>
+              <w:rPr>
+                <w:rFonts w:ascii="Calibri" w:hAnsi="Calibri" w:eastAsia="Calibri" w:cs="Calibri"/>
+              </w:rPr>
+            </w:pPr>
+            <w:r>
+              <w:rPr>
+                <w:rFonts w:eastAsia="Calibri" w:cs="Calibri" w:ascii="Calibri" w:hAnsi="Calibri"/>
+              </w:rPr>
+              <w:t>I check if the css of the nagvigation bar.</w:t>
+            </w:r>
+          </w:p>
+        </w:tc>
+        <w:tc>
+          <w:tcPr>
+            <w:tcW w:w="3439" w:type="dxa"/>
+            <w:tcBorders>
+              <w:top w:val="single" w:sz="8" w:space="0" w:color="000000"/>
+              <w:start w:val="single" w:sz="8" w:space="0" w:color="000000"/>
+              <w:bottom w:val="single" w:sz="8" w:space="0" w:color="000000"/>
+              <w:end w:val="single" w:sz="8" w:space="0" w:color="000000"/>
+            </w:tcBorders>
+          </w:tcPr>
+          <w:p>
+            <w:pPr>
+              <w:pStyle w:val="normal1"/>
+              <w:widowControl w:val="false"/>
+              <w:suppressAutoHyphens w:val="true"/>
+              <w:spacing w:lineRule="auto" w:line="240" w:before="0" w:after="0"/>
+              <w:jc w:val="start"/>
+              <w:rPr>
+                <w:rFonts w:ascii="Calibri" w:hAnsi="Calibri" w:eastAsia="Calibri" w:cs="Calibri"/>
+              </w:rPr>
+            </w:pPr>
+            <w:r>
+              <w:rPr>
+                <w:rFonts w:eastAsia="Calibri" w:cs="Calibri" w:ascii="Calibri" w:hAnsi="Calibri"/>
+              </w:rPr>
+              <w:drawing>
+                <wp:anchor distT="0" distB="0" distL="0" distR="0" simplePos="0" relativeHeight="55" behindDoc="0" locked="0" layoutInCell="0" allowOverlap="1">
+                  <wp:simplePos x="0" y="0"/>
+                  <wp:positionH relativeFrom="column">
+                    <wp:posOffset>81915</wp:posOffset>
+                  </wp:positionH>
+                  <wp:positionV relativeFrom="paragraph">
+                    <wp:posOffset>25400</wp:posOffset>
+                  </wp:positionV>
+                  <wp:extent cx="2100580" cy="871855"/>
+                  <wp:effectExtent l="0" t="0" r="0" b="0"/>
+                  <wp:wrapSquare wrapText="largest"/>
+                  <wp:docPr id="4" name="Image14"/>
+                  <wp:cNvGraphicFramePr>
+                    <a:graphicFrameLocks xmlns:a="http://schemas.openxmlformats.org/drawingml/2006/main" noChangeAspect="1"/>
+                  </wp:cNvGraphicFramePr>
+                  <a:graphic xmlns:a="http://schemas.openxmlformats.org/drawingml/2006/main">
+                    <a:graphicData uri="http://schemas.openxmlformats.org/drawingml/2006/picture">
+                      <pic:pic xmlns:pic="http://schemas.openxmlformats.org/drawingml/2006/picture">
+                        <pic:nvPicPr>
+                          <pic:cNvPr id="4" name="Image14"/>
+                          <pic:cNvPicPr>
+                            <a:picLocks noChangeAspect="1" noChangeArrowheads="1"/>
+                          </pic:cNvPicPr>
+                        </pic:nvPicPr>
+                        <pic:blipFill>
+                          <a:blip r:embed="rId5"/>
+                          <a:stretch>
+                            <a:fillRect/>
+                          </a:stretch>
+                        </pic:blipFill>
+                        <pic:spPr bwMode="auto">
+                          <a:xfrm>
+                            <a:off x="0" y="0"/>
+                            <a:ext cx="2100580" cy="871855"/>
+                          </a:xfrm>
+                          <a:prstGeom prst="rect">
+                            <a:avLst/>
+                          </a:prstGeom>
+                          <a:noFill/>
+                        </pic:spPr>
+                      </pic:pic>
+                    </a:graphicData>
+                  </a:graphic>
+                </wp:anchor>
+              </w:drawing>
+            </w:r>
+          </w:p>
           <w:p>
             <w:pPr>
               <w:pStyle w:val="normal1"/>
@@ -2242,24 +2349,176 @@
               <w:rPr>
                 <w:rFonts w:eastAsia="Calibri" w:cs="Calibri" w:ascii="Calibri" w:hAnsi="Calibri"/>
               </w:rPr>
+              <w:t>Fail</w:t>
+            </w:r>
+          </w:p>
+        </w:tc>
+      </w:tr>
+      <w:tr>
+        <w:trPr>
+          <w:trHeight w:val="1758" w:hRule="atLeast"/>
+        </w:trPr>
+        <w:tc>
+          <w:tcPr>
+            <w:tcW w:w="3480" w:type="dxa"/>
+            <w:tcBorders>
+              <w:start w:val="single" w:sz="8" w:space="0" w:color="000000"/>
+              <w:bottom w:val="single" w:sz="8" w:space="0" w:color="000000"/>
+              <w:end w:val="single" w:sz="8" w:space="0" w:color="000000"/>
+            </w:tcBorders>
+          </w:tcPr>
+          <w:p>
+            <w:pPr>
+              <w:pStyle w:val="normal1"/>
+              <w:widowControl w:val="false"/>
+              <w:suppressAutoHyphens w:val="true"/>
+              <w:spacing w:lineRule="auto" w:line="240" w:before="0" w:after="0"/>
+              <w:jc w:val="start"/>
+              <w:rPr>
+                <w:rFonts w:ascii="Calibri" w:hAnsi="Calibri" w:eastAsia="Calibri" w:cs="Calibri"/>
+              </w:rPr>
+            </w:pPr>
+            <w:r>
+              <w:drawing>
+                <wp:anchor distT="0" distB="0" distL="0" distR="0" simplePos="0" relativeHeight="54" behindDoc="0" locked="0" layoutInCell="0" allowOverlap="1">
+                  <wp:simplePos x="0" y="0"/>
+                  <wp:positionH relativeFrom="column">
+                    <wp:posOffset>3728085</wp:posOffset>
+                  </wp:positionH>
+                  <wp:positionV relativeFrom="paragraph">
+                    <wp:posOffset>59690</wp:posOffset>
+                  </wp:positionV>
+                  <wp:extent cx="2091690" cy="280670"/>
+                  <wp:effectExtent l="0" t="0" r="0" b="0"/>
+                  <wp:wrapSquare wrapText="largest"/>
+                  <wp:docPr id="5" name="Image5"/>
+                  <wp:cNvGraphicFramePr>
+                    <a:graphicFrameLocks xmlns:a="http://schemas.openxmlformats.org/drawingml/2006/main" noChangeAspect="1"/>
+                  </wp:cNvGraphicFramePr>
+                  <a:graphic xmlns:a="http://schemas.openxmlformats.org/drawingml/2006/main">
+                    <a:graphicData uri="http://schemas.openxmlformats.org/drawingml/2006/picture">
+                      <pic:pic xmlns:pic="http://schemas.openxmlformats.org/drawingml/2006/picture">
+                        <pic:nvPicPr>
+                          <pic:cNvPr id="5" name="Image5"/>
+                          <pic:cNvPicPr>
+                            <a:picLocks noChangeAspect="1" noChangeArrowheads="1"/>
+                          </pic:cNvPicPr>
+                        </pic:nvPicPr>
+                        <pic:blipFill>
+                          <a:blip r:embed="rId6"/>
+                          <a:stretch>
+                            <a:fillRect/>
+                          </a:stretch>
+                        </pic:blipFill>
+                        <pic:spPr bwMode="auto">
+                          <a:xfrm>
+                            <a:off x="0" y="0"/>
+                            <a:ext cx="2091690" cy="280670"/>
+                          </a:xfrm>
+                          <a:prstGeom prst="rect">
+                            <a:avLst/>
+                          </a:prstGeom>
+                          <a:noFill/>
+                        </pic:spPr>
+                      </pic:pic>
+                    </a:graphicData>
+                  </a:graphic>
+                </wp:anchor>
+              </w:drawing>
+            </w:r>
+            <w:r>
+              <w:rPr>
+                <w:rFonts w:eastAsia="Calibri" w:cs="Calibri" w:ascii="Calibri" w:hAnsi="Calibri"/>
+              </w:rPr>
+              <w:t>Navigaiton Bar</w:t>
+            </w:r>
+          </w:p>
+        </w:tc>
+        <w:tc>
+          <w:tcPr>
+            <w:tcW w:w="2467" w:type="dxa"/>
+            <w:tcBorders>
+              <w:start w:val="single" w:sz="8" w:space="0" w:color="000000"/>
+              <w:bottom w:val="single" w:sz="8" w:space="0" w:color="000000"/>
+              <w:end w:val="single" w:sz="8" w:space="0" w:color="000000"/>
+            </w:tcBorders>
+          </w:tcPr>
+          <w:p>
+            <w:pPr>
+              <w:pStyle w:val="normal1"/>
+              <w:widowControl w:val="false"/>
+              <w:suppressAutoHyphens w:val="true"/>
+              <w:spacing w:lineRule="auto" w:line="240" w:before="0" w:after="0"/>
+              <w:jc w:val="start"/>
+              <w:rPr>
+                <w:rFonts w:ascii="Calibri" w:hAnsi="Calibri" w:eastAsia="Calibri" w:cs="Calibri"/>
+              </w:rPr>
+            </w:pPr>
+            <w:r>
+              <w:rPr>
+                <w:rFonts w:eastAsia="Calibri" w:cs="Calibri" w:ascii="Calibri" w:hAnsi="Calibri"/>
+              </w:rPr>
+              <w:t>I check if the css of the nagvigation bar.</w:t>
+            </w:r>
+          </w:p>
+        </w:tc>
+        <w:tc>
+          <w:tcPr>
+            <w:tcW w:w="3439" w:type="dxa"/>
+            <w:tcBorders>
+              <w:start w:val="single" w:sz="8" w:space="0" w:color="000000"/>
+              <w:bottom w:val="single" w:sz="8" w:space="0" w:color="000000"/>
+              <w:end w:val="single" w:sz="8" w:space="0" w:color="000000"/>
+            </w:tcBorders>
+          </w:tcPr>
+          <w:p>
+            <w:pPr>
+              <w:pStyle w:val="normal1"/>
+              <w:widowControl w:val="false"/>
+              <w:suppressAutoHyphens w:val="true"/>
+              <w:spacing w:lineRule="auto" w:line="240" w:before="0" w:after="0"/>
+              <w:jc w:val="start"/>
+              <w:rPr>
+                <w:rFonts w:ascii="Calibri" w:hAnsi="Calibri" w:eastAsia="Calibri" w:cs="Calibri"/>
+              </w:rPr>
+            </w:pPr>
+            <w:r>
+              <w:rPr>
+                <w:rFonts w:eastAsia="Calibri" w:cs="Calibri" w:ascii="Calibri" w:hAnsi="Calibri"/>
+              </w:rPr>
+            </w:r>
+          </w:p>
+        </w:tc>
+        <w:tc>
+          <w:tcPr>
+            <w:tcW w:w="1069" w:type="dxa"/>
+            <w:tcBorders>
+              <w:start w:val="single" w:sz="8" w:space="0" w:color="000000"/>
+              <w:bottom w:val="single" w:sz="8" w:space="0" w:color="000000"/>
+              <w:end w:val="single" w:sz="8" w:space="0" w:color="000000"/>
+            </w:tcBorders>
+          </w:tcPr>
+          <w:p>
+            <w:pPr>
+              <w:pStyle w:val="normal1"/>
+              <w:widowControl w:val="false"/>
+              <w:suppressAutoHyphens w:val="true"/>
+              <w:spacing w:lineRule="auto" w:line="240" w:before="0" w:after="0"/>
+              <w:jc w:val="start"/>
+              <w:rPr>
+                <w:rFonts w:ascii="Calibri" w:hAnsi="Calibri" w:eastAsia="Calibri" w:cs="Calibri"/>
+              </w:rPr>
+            </w:pPr>
+            <w:r>
+              <w:rPr>
+                <w:rFonts w:eastAsia="Calibri" w:cs="Calibri" w:ascii="Calibri" w:hAnsi="Calibri"/>
+              </w:rPr>
+              <w:t>Pass</w:t>
             </w:r>
           </w:p>
         </w:tc>
       </w:tr>
     </w:tbl>
-    <w:p>
-      <w:pPr>
-        <w:pStyle w:val="normal1"/>
-        <w:rPr>
-          <w:rFonts w:ascii="Calibri" w:hAnsi="Calibri" w:eastAsia="Calibri" w:cs="Calibri"/>
-        </w:rPr>
-      </w:pPr>
-      <w:r>
-        <w:rPr>
-          <w:rFonts w:eastAsia="Calibri" w:cs="Calibri" w:ascii="Calibri" w:hAnsi="Calibri"/>
-        </w:rPr>
-      </w:r>
-    </w:p>
     <w:p>
       <w:pPr>
         <w:pStyle w:val="Heading4"/>
@@ -2417,27 +2676,7 @@
                 <w:szCs w:val="22"/>
                 <w:lang w:val="en-US" w:eastAsia="zh-CN" w:bidi="hi-IN"/>
               </w:rPr>
-              <w:t xml:space="preserve">The only thing I did was the Navigation </w:t>
-            </w:r>
-            <w:r>
-              <w:rPr>
-                <w:rFonts w:eastAsia="Arial" w:cs="Arial"/>
-                <w:kern w:val="0"/>
-                <w:sz w:val="22"/>
-                <w:szCs w:val="22"/>
-                <w:lang w:val="en-US" w:eastAsia="zh-CN" w:bidi="hi-IN"/>
-              </w:rPr>
-              <w:t>bar</w:t>
-            </w:r>
-            <w:r>
-              <w:rPr>
-                <w:rFonts w:eastAsia="Arial" w:cs="Arial"/>
-                <w:kern w:val="0"/>
-                <w:sz w:val="22"/>
-                <w:szCs w:val="22"/>
-                <w:lang w:val="en-US" w:eastAsia="zh-CN" w:bidi="hi-IN"/>
-              </w:rPr>
-              <w:t xml:space="preserve"> and having another page up. Nothing else for other things.</w:t>
+              <w:t>The only thing I did was the Navigation bar and having another page up. Nothing else for other things.</w:t>
             </w:r>
           </w:p>
           <w:p>
@@ -2488,67 +2727,7 @@
                 <w:szCs w:val="22"/>
                 <w:lang w:val="en-US" w:eastAsia="zh-CN" w:bidi="hi-IN"/>
               </w:rPr>
-              <w:t xml:space="preserve">I was unable to work on my website because the laptop I was use made it unusable to get work on in this class (and others too), and it being a </w:t>
-            </w:r>
-            <w:r>
-              <w:rPr>
-                <w:rFonts w:eastAsia="Arial" w:cs="Arial"/>
-                <w:kern w:val="0"/>
-                <w:sz w:val="22"/>
-                <w:szCs w:val="22"/>
-                <w:lang w:val="en-US" w:eastAsia="zh-CN" w:bidi="hi-IN"/>
-              </w:rPr>
-              <w:t>hassle</w:t>
-            </w:r>
-            <w:r>
-              <w:rPr>
-                <w:rFonts w:eastAsia="Arial" w:cs="Arial"/>
-                <w:kern w:val="0"/>
-                <w:sz w:val="22"/>
-                <w:szCs w:val="22"/>
-                <w:lang w:val="en-US" w:eastAsia="zh-CN" w:bidi="hi-IN"/>
-              </w:rPr>
-              <w:t xml:space="preserve"> to trying to figure it out how to use it. I only got the </w:t>
-            </w:r>
-            <w:r>
-              <w:rPr>
-                <w:rFonts w:eastAsia="Arial" w:cs="Arial"/>
-                <w:kern w:val="0"/>
-                <w:sz w:val="22"/>
-                <w:szCs w:val="22"/>
-                <w:lang w:val="en-US" w:eastAsia="zh-CN" w:bidi="hi-IN"/>
-              </w:rPr>
-              <w:t>n</w:t>
-            </w:r>
-            <w:r>
-              <w:rPr>
-                <w:rFonts w:eastAsia="Arial" w:cs="Arial"/>
-                <w:kern w:val="0"/>
-                <w:sz w:val="22"/>
-                <w:szCs w:val="22"/>
-                <w:lang w:val="en-US" w:eastAsia="zh-CN" w:bidi="hi-IN"/>
-              </w:rPr>
-              <w:t xml:space="preserve">avigation  bar to work, but it kind of sucks and looks bad. I was also unable to write and </w:t>
-            </w:r>
-            <w:r>
-              <w:rPr>
-                <w:rFonts w:eastAsia="Arial" w:cs="Arial"/>
-                <w:kern w:val="0"/>
-                <w:sz w:val="22"/>
-                <w:szCs w:val="22"/>
-                <w:lang w:val="en-US" w:eastAsia="zh-CN" w:bidi="hi-IN"/>
-              </w:rPr>
-              <w:t>document</w:t>
-            </w:r>
-            <w:r>
-              <w:rPr>
-                <w:rFonts w:eastAsia="Arial" w:cs="Arial"/>
-                <w:kern w:val="0"/>
-                <w:sz w:val="22"/>
-                <w:szCs w:val="22"/>
-                <w:lang w:val="en-US" w:eastAsia="zh-CN" w:bidi="hi-IN"/>
-              </w:rPr>
-              <w:t xml:space="preserve"> my work (or lack on it) on here because it was slow and I had nothing to show</w:t>
+              <w:t>I was unable to work on my website because the laptop I was use made it unusable to get work on in this class (and others too), and it being a hassle to trying to figure it out how to use it. I only got the navigation  bar to work, but it kind of sucks and looks bad. I was also unable to write and document my work (or lack on it) on here because it was slow and I had nothing to show</w:t>
             </w:r>
           </w:p>
           <w:p>
@@ -2759,27 +2938,7 @@
                 <w:szCs w:val="22"/>
                 <w:lang w:val="en-US" w:eastAsia="zh-CN" w:bidi="hi-IN"/>
               </w:rPr>
-              <w:t xml:space="preserve">functionally Navigation </w:t>
-            </w:r>
-            <w:r>
-              <w:rPr>
-                <w:rFonts w:eastAsia="Arial" w:cs="Arial"/>
-                <w:kern w:val="0"/>
-                <w:sz w:val="22"/>
-                <w:szCs w:val="22"/>
-                <w:lang w:val="en-US" w:eastAsia="zh-CN" w:bidi="hi-IN"/>
-              </w:rPr>
-              <w:t>Bar</w:t>
-            </w:r>
-            <w:r>
-              <w:rPr>
-                <w:rFonts w:eastAsia="Arial" w:cs="Arial"/>
-                <w:kern w:val="0"/>
-                <w:sz w:val="22"/>
-                <w:szCs w:val="22"/>
-                <w:lang w:val="en-US" w:eastAsia="zh-CN" w:bidi="hi-IN"/>
-              </w:rPr>
-              <w:t xml:space="preserve"> </w:t>
+              <w:t xml:space="preserve">functionally Navigation Bar </w:t>
             </w:r>
           </w:p>
           <w:p>
@@ -2809,37 +2968,7 @@
                 <w:szCs w:val="22"/>
                 <w:lang w:val="en-US" w:eastAsia="zh-CN" w:bidi="hi-IN"/>
               </w:rPr>
-              <w:t>T</w:t>
-            </w:r>
-            <w:r>
-              <w:rPr>
-                <w:rFonts w:eastAsia="Arial" w:cs="Arial"/>
-                <w:kern w:val="0"/>
-                <w:sz w:val="22"/>
-                <w:szCs w:val="22"/>
-                <w:lang w:val="en-US" w:eastAsia="zh-CN" w:bidi="hi-IN"/>
-              </w:rPr>
-              <w:t xml:space="preserve">ext box </w:t>
-            </w:r>
-            <w:r>
-              <w:rPr>
-                <w:rFonts w:eastAsia="Arial" w:cs="Arial"/>
-                <w:kern w:val="0"/>
-                <w:sz w:val="22"/>
-                <w:szCs w:val="22"/>
-                <w:lang w:val="en-US" w:eastAsia="zh-CN" w:bidi="hi-IN"/>
-              </w:rPr>
-              <w:t>input</w:t>
-            </w:r>
-            <w:r>
-              <w:rPr>
-                <w:rFonts w:eastAsia="Arial" w:cs="Arial"/>
-                <w:kern w:val="0"/>
-                <w:sz w:val="22"/>
-                <w:szCs w:val="22"/>
-                <w:lang w:val="en-US" w:eastAsia="zh-CN" w:bidi="hi-IN"/>
-              </w:rPr>
-              <w:t xml:space="preserve"> thing for users to type in for stuff.</w:t>
+              <w:t>Text box input thing for users to type in for stuff.</w:t>
             </w:r>
           </w:p>
         </w:tc>
@@ -2954,7 +3083,7 @@
                   <wp:extent cx="6518910" cy="1334770"/>
                   <wp:effectExtent l="0" t="0" r="0" b="0"/>
                   <wp:wrapSquare wrapText="largest"/>
-                  <wp:docPr id="4" name="Image2"/>
+                  <wp:docPr id="6" name="Image2"/>
                   <wp:cNvGraphicFramePr>
                     <a:graphicFrameLocks xmlns:a="http://schemas.openxmlformats.org/drawingml/2006/main" noChangeAspect="1"/>
                   </wp:cNvGraphicFramePr>
@@ -2962,13 +3091,13 @@
                     <a:graphicData uri="http://schemas.openxmlformats.org/drawingml/2006/picture">
                       <pic:pic xmlns:pic="http://schemas.openxmlformats.org/drawingml/2006/picture">
                         <pic:nvPicPr>
-                          <pic:cNvPr id="4" name="Image2"/>
+                          <pic:cNvPr id="6" name="Image2"/>
                           <pic:cNvPicPr>
                             <a:picLocks noChangeAspect="1" noChangeArrowheads="1"/>
                           </pic:cNvPicPr>
                         </pic:nvPicPr>
                         <pic:blipFill>
-                          <a:blip r:embed="rId5"/>
+                          <a:blip r:embed="rId7"/>
                           <a:stretch>
                             <a:fillRect/>
                           </a:stretch>
@@ -3133,7 +3262,7 @@
                 <w:lang w:val="en-US" w:eastAsia="zh-CN" w:bidi="hi-IN"/>
               </w:rPr>
               <w:drawing>
-                <wp:anchor distT="0" distB="0" distL="0" distR="0" simplePos="0" relativeHeight="53" behindDoc="0" locked="0" layoutInCell="0" allowOverlap="1">
+                <wp:anchor distT="0" distB="0" distL="0" distR="0" simplePos="0" relativeHeight="53" behindDoc="0" locked="0" layoutInCell="1" allowOverlap="1">
                   <wp:simplePos x="0" y="0"/>
                   <wp:positionH relativeFrom="column">
                     <wp:align>center</wp:align>
@@ -3144,7 +3273,7 @@
                   <wp:extent cx="6209665" cy="3878580"/>
                   <wp:effectExtent l="0" t="0" r="0" b="0"/>
                   <wp:wrapSquare wrapText="largest"/>
-                  <wp:docPr id="5" name="Image4"/>
+                  <wp:docPr id="7" name="Image4"/>
                   <wp:cNvGraphicFramePr>
                     <a:graphicFrameLocks xmlns:a="http://schemas.openxmlformats.org/drawingml/2006/main" noChangeAspect="1"/>
                   </wp:cNvGraphicFramePr>
@@ -3152,13 +3281,13 @@
                     <a:graphicData uri="http://schemas.openxmlformats.org/drawingml/2006/picture">
                       <pic:pic xmlns:pic="http://schemas.openxmlformats.org/drawingml/2006/picture">
                         <pic:nvPicPr>
-                          <pic:cNvPr id="5" name="Image4"/>
+                          <pic:cNvPr id="7" name="Image4"/>
                           <pic:cNvPicPr>
                             <a:picLocks noChangeAspect="1" noChangeArrowheads="1"/>
                           </pic:cNvPicPr>
                         </pic:nvPicPr>
                         <pic:blipFill>
-                          <a:blip r:embed="rId6"/>
+                          <a:blip r:embed="rId8"/>
                           <a:stretch>
                             <a:fillRect/>
                           </a:stretch>
@@ -3231,16 +3360,16 @@
         <w:tblLook w:val="0600" w:firstRow="0" w:noVBand="1" w:lastRow="0" w:firstColumn="0" w:lastColumn="0" w:noHBand="1"/>
       </w:tblPr>
       <w:tblGrid>
-        <w:gridCol w:w="3475"/>
-        <w:gridCol w:w="2825"/>
-        <w:gridCol w:w="2980"/>
-        <w:gridCol w:w="1055"/>
+        <w:gridCol w:w="3474"/>
+        <w:gridCol w:w="2826"/>
+        <w:gridCol w:w="2979"/>
+        <w:gridCol w:w="1056"/>
       </w:tblGrid>
       <w:tr>
         <w:trPr/>
         <w:tc>
           <w:tcPr>
-            <w:tcW w:w="3475" w:type="dxa"/>
+            <w:tcW w:w="3474" w:type="dxa"/>
             <w:tcBorders>
               <w:top w:val="single" w:sz="8" w:space="0" w:color="000000"/>
               <w:start w:val="single" w:sz="8" w:space="0" w:color="000000"/>
@@ -3277,7 +3406,7 @@
         </w:tc>
         <w:tc>
           <w:tcPr>
-            <w:tcW w:w="2825" w:type="dxa"/>
+            <w:tcW w:w="2826" w:type="dxa"/>
             <w:tcBorders>
               <w:top w:val="single" w:sz="8" w:space="0" w:color="000000"/>
               <w:start w:val="single" w:sz="8" w:space="0" w:color="000000"/>
@@ -3310,7 +3439,7 @@
         </w:tc>
         <w:tc>
           <w:tcPr>
-            <w:tcW w:w="2980" w:type="dxa"/>
+            <w:tcW w:w="2979" w:type="dxa"/>
             <w:tcBorders>
               <w:top w:val="single" w:sz="8" w:space="0" w:color="000000"/>
               <w:start w:val="single" w:sz="8" w:space="0" w:color="000000"/>
@@ -3343,7 +3472,7 @@
         </w:tc>
         <w:tc>
           <w:tcPr>
-            <w:tcW w:w="1055" w:type="dxa"/>
+            <w:tcW w:w="1056" w:type="dxa"/>
             <w:tcBorders>
               <w:top w:val="single" w:sz="8" w:space="0" w:color="000000"/>
               <w:start w:val="single" w:sz="8" w:space="0" w:color="000000"/>
@@ -3379,7 +3508,7 @@
         <w:trPr/>
         <w:tc>
           <w:tcPr>
-            <w:tcW w:w="3475" w:type="dxa"/>
+            <w:tcW w:w="3474" w:type="dxa"/>
             <w:tcBorders>
               <w:top w:val="single" w:sz="8" w:space="0" w:color="000000"/>
               <w:start w:val="single" w:sz="8" w:space="0" w:color="000000"/>
@@ -3417,7 +3546,7 @@
         </w:tc>
         <w:tc>
           <w:tcPr>
-            <w:tcW w:w="2825" w:type="dxa"/>
+            <w:tcW w:w="2826" w:type="dxa"/>
             <w:tcBorders>
               <w:top w:val="single" w:sz="8" w:space="0" w:color="000000"/>
               <w:start w:val="single" w:sz="8" w:space="0" w:color="000000"/>
@@ -3455,7 +3584,7 @@
         </w:tc>
         <w:tc>
           <w:tcPr>
-            <w:tcW w:w="2980" w:type="dxa"/>
+            <w:tcW w:w="2979" w:type="dxa"/>
             <w:tcBorders>
               <w:top w:val="single" w:sz="8" w:space="0" w:color="000000"/>
               <w:start w:val="single" w:sz="8" w:space="0" w:color="000000"/>
@@ -3493,7 +3622,7 @@
         </w:tc>
         <w:tc>
           <w:tcPr>
-            <w:tcW w:w="1055" w:type="dxa"/>
+            <w:tcW w:w="1056" w:type="dxa"/>
             <w:tcBorders>
               <w:top w:val="single" w:sz="8" w:space="0" w:color="000000"/>
               <w:start w:val="single" w:sz="8" w:space="0" w:color="000000"/>
@@ -3534,68 +3663,99 @@
         <w:trPr/>
         <w:tc>
           <w:tcPr>
-            <w:tcW w:w="3475" w:type="dxa"/>
-            <w:tcBorders>
-              <w:top w:val="single" w:sz="8" w:space="0" w:color="000000"/>
-              <w:start w:val="single" w:sz="8" w:space="0" w:color="000000"/>
-              <w:bottom w:val="single" w:sz="8" w:space="0" w:color="000000"/>
-              <w:end w:val="single" w:sz="8" w:space="0" w:color="000000"/>
-            </w:tcBorders>
-          </w:tcPr>
-          <w:p>
-            <w:pPr>
-              <w:pStyle w:val="normal1"/>
-              <w:widowControl w:val="false"/>
-              <w:suppressAutoHyphens w:val="true"/>
-              <w:spacing w:lineRule="auto" w:line="240" w:before="0" w:after="0"/>
-              <w:jc w:val="start"/>
-              <w:rPr>
-                <w:rFonts w:ascii="Calibri" w:hAnsi="Calibri" w:eastAsia="Calibri" w:cs="Calibri"/>
-              </w:rPr>
-            </w:pPr>
-            <w:r>
-              <w:rPr>
-                <w:rFonts w:eastAsia="Calibri" w:cs="Calibri" w:ascii="Calibri" w:hAnsi="Calibri"/>
-                <w:kern w:val="0"/>
-                <w:sz w:val="22"/>
-                <w:szCs w:val="22"/>
-                <w:lang w:val="en-US" w:eastAsia="zh-CN" w:bidi="hi-IN"/>
-              </w:rPr>
-              <w:t>Textbox | gird area</w:t>
-            </w:r>
-          </w:p>
-        </w:tc>
-        <w:tc>
-          <w:tcPr>
-            <w:tcW w:w="2825" w:type="dxa"/>
-            <w:tcBorders>
-              <w:top w:val="single" w:sz="8" w:space="0" w:color="000000"/>
-              <w:start w:val="single" w:sz="8" w:space="0" w:color="000000"/>
-              <w:bottom w:val="single" w:sz="8" w:space="0" w:color="000000"/>
-              <w:end w:val="single" w:sz="8" w:space="0" w:color="000000"/>
-            </w:tcBorders>
-          </w:tcPr>
-          <w:p>
-            <w:pPr>
-              <w:pStyle w:val="normal1"/>
-              <w:widowControl w:val="false"/>
-              <w:suppressAutoHyphens w:val="true"/>
-              <w:spacing w:lineRule="auto" w:line="240" w:before="0" w:after="0"/>
-              <w:jc w:val="start"/>
-              <w:rPr>
-                <w:rFonts w:ascii="Calibri" w:hAnsi="Calibri" w:eastAsia="Calibri" w:cs="Calibri"/>
-              </w:rPr>
-            </w:pPr>
-            <w:r>
-              <w:rPr>
-                <w:rFonts w:eastAsia="Calibri" w:cs="Calibri" w:ascii="Calibri" w:hAnsi="Calibri"/>
-              </w:rPr>
-            </w:r>
-          </w:p>
-        </w:tc>
-        <w:tc>
-          <w:tcPr>
-            <w:tcW w:w="2980" w:type="dxa"/>
+            <w:tcW w:w="3474" w:type="dxa"/>
+            <w:tcBorders>
+              <w:top w:val="single" w:sz="8" w:space="0" w:color="000000"/>
+              <w:start w:val="single" w:sz="8" w:space="0" w:color="000000"/>
+              <w:bottom w:val="single" w:sz="8" w:space="0" w:color="000000"/>
+              <w:end w:val="single" w:sz="8" w:space="0" w:color="000000"/>
+            </w:tcBorders>
+          </w:tcPr>
+          <w:p>
+            <w:pPr>
+              <w:pStyle w:val="normal1"/>
+              <w:widowControl w:val="false"/>
+              <w:suppressAutoHyphens w:val="true"/>
+              <w:spacing w:lineRule="auto" w:line="240" w:before="0" w:after="0"/>
+              <w:jc w:val="start"/>
+              <w:rPr>
+                <w:rFonts w:ascii="Calibri" w:hAnsi="Calibri" w:eastAsia="Calibri" w:cs="Calibri"/>
+              </w:rPr>
+            </w:pPr>
+            <w:r>
+              <w:rPr>
+                <w:rFonts w:eastAsia="Calibri" w:cs="Calibri" w:ascii="Calibri" w:hAnsi="Calibri"/>
+                <w:kern w:val="0"/>
+                <w:sz w:val="22"/>
+                <w:szCs w:val="22"/>
+                <w:lang w:val="en-US" w:eastAsia="zh-CN" w:bidi="hi-IN"/>
+              </w:rPr>
+              <w:t>Text box</w:t>
+            </w:r>
+            <w:r>
+              <w:rPr>
+                <w:rFonts w:eastAsia="Calibri" w:cs="Calibri" w:ascii="Calibri" w:hAnsi="Calibri"/>
+                <w:kern w:val="0"/>
+                <w:sz w:val="22"/>
+                <w:szCs w:val="22"/>
+                <w:lang w:val="en-US" w:eastAsia="zh-CN" w:bidi="hi-IN"/>
+              </w:rPr>
+              <w:t xml:space="preserve"> | </w:t>
+            </w:r>
+            <w:r>
+              <w:rPr>
+                <w:rFonts w:eastAsia="Calibri" w:cs="Calibri" w:ascii="Calibri" w:hAnsi="Calibri"/>
+                <w:kern w:val="0"/>
+                <w:sz w:val="22"/>
+                <w:szCs w:val="22"/>
+                <w:lang w:val="en-US" w:eastAsia="zh-CN" w:bidi="hi-IN"/>
+              </w:rPr>
+              <w:t>grid</w:t>
+            </w:r>
+            <w:r>
+              <w:rPr>
+                <w:rFonts w:eastAsia="Calibri" w:cs="Calibri" w:ascii="Calibri" w:hAnsi="Calibri"/>
+                <w:kern w:val="0"/>
+                <w:sz w:val="22"/>
+                <w:szCs w:val="22"/>
+                <w:lang w:val="en-US" w:eastAsia="zh-CN" w:bidi="hi-IN"/>
+              </w:rPr>
+              <w:t xml:space="preserve"> area</w:t>
+            </w:r>
+          </w:p>
+        </w:tc>
+        <w:tc>
+          <w:tcPr>
+            <w:tcW w:w="2826" w:type="dxa"/>
+            <w:tcBorders>
+              <w:top w:val="single" w:sz="8" w:space="0" w:color="000000"/>
+              <w:start w:val="single" w:sz="8" w:space="0" w:color="000000"/>
+              <w:bottom w:val="single" w:sz="8" w:space="0" w:color="000000"/>
+              <w:end w:val="single" w:sz="8" w:space="0" w:color="000000"/>
+            </w:tcBorders>
+          </w:tcPr>
+          <w:p>
+            <w:pPr>
+              <w:pStyle w:val="normal1"/>
+              <w:widowControl w:val="false"/>
+              <w:suppressAutoHyphens w:val="true"/>
+              <w:spacing w:lineRule="auto" w:line="240" w:before="0" w:after="0"/>
+              <w:jc w:val="start"/>
+              <w:rPr>
+                <w:rFonts w:ascii="Calibri" w:hAnsi="Calibri" w:eastAsia="Calibri" w:cs="Calibri"/>
+              </w:rPr>
+            </w:pPr>
+            <w:r>
+              <w:rPr>
+                <w:rFonts w:eastAsia="Calibri" w:cs="Calibri" w:ascii="Calibri" w:hAnsi="Calibri"/>
+              </w:rPr>
+              <w:t>I check if the grid box is working the way I want it to be.</w:t>
+            </w:r>
+          </w:p>
+        </w:tc>
+        <w:tc>
+          <w:tcPr>
+            <w:tcW w:w="2979" w:type="dxa"/>
             <w:tcBorders>
               <w:top w:val="single" w:sz="8" w:space="0" w:color="000000"/>
               <w:start w:val="single" w:sz="8" w:space="0" w:color="000000"/>
@@ -3630,7 +3790,7 @@
                   <wp:extent cx="1765935" cy="226060"/>
                   <wp:effectExtent l="0" t="0" r="0" b="0"/>
                   <wp:wrapSquare wrapText="largest"/>
-                  <wp:docPr id="6" name="Image10"/>
+                  <wp:docPr id="8" name="Image10"/>
                   <wp:cNvGraphicFramePr>
                     <a:graphicFrameLocks xmlns:a="http://schemas.openxmlformats.org/drawingml/2006/main" noChangeAspect="1"/>
                   </wp:cNvGraphicFramePr>
@@ -3638,13 +3798,13 @@
                     <a:graphicData uri="http://schemas.openxmlformats.org/drawingml/2006/picture">
                       <pic:pic xmlns:pic="http://schemas.openxmlformats.org/drawingml/2006/picture">
                         <pic:nvPicPr>
-                          <pic:cNvPr id="6" name="Image10"/>
+                          <pic:cNvPr id="8" name="Image10"/>
                           <pic:cNvPicPr>
                             <a:picLocks noChangeAspect="1" noChangeArrowheads="1"/>
                           </pic:cNvPicPr>
                         </pic:nvPicPr>
                         <pic:blipFill>
-                          <a:blip r:embed="rId7"/>
+                          <a:blip r:embed="rId9"/>
                           <a:stretch>
                             <a:fillRect/>
                           </a:stretch>
@@ -3669,29 +3829,30 @@
         </w:tc>
         <w:tc>
           <w:tcPr>
-            <w:tcW w:w="1055" w:type="dxa"/>
-            <w:tcBorders>
-              <w:top w:val="single" w:sz="8" w:space="0" w:color="000000"/>
-              <w:start w:val="single" w:sz="8" w:space="0" w:color="000000"/>
-              <w:bottom w:val="single" w:sz="8" w:space="0" w:color="000000"/>
-              <w:end w:val="single" w:sz="8" w:space="0" w:color="000000"/>
-            </w:tcBorders>
-          </w:tcPr>
-          <w:p>
-            <w:pPr>
-              <w:pStyle w:val="normal1"/>
-              <w:widowControl w:val="false"/>
-              <w:suppressAutoHyphens w:val="true"/>
-              <w:spacing w:lineRule="auto" w:line="240" w:before="0" w:after="0"/>
-              <w:jc w:val="start"/>
-              <w:rPr>
-                <w:rFonts w:ascii="Calibri" w:hAnsi="Calibri" w:eastAsia="Calibri" w:cs="Calibri"/>
-              </w:rPr>
-            </w:pPr>
-            <w:r>
-              <w:rPr>
-                <w:rFonts w:eastAsia="Calibri" w:cs="Calibri" w:ascii="Calibri" w:hAnsi="Calibri"/>
-              </w:rPr>
+            <w:tcW w:w="1056" w:type="dxa"/>
+            <w:tcBorders>
+              <w:top w:val="single" w:sz="8" w:space="0" w:color="000000"/>
+              <w:start w:val="single" w:sz="8" w:space="0" w:color="000000"/>
+              <w:bottom w:val="single" w:sz="8" w:space="0" w:color="000000"/>
+              <w:end w:val="single" w:sz="8" w:space="0" w:color="000000"/>
+            </w:tcBorders>
+          </w:tcPr>
+          <w:p>
+            <w:pPr>
+              <w:pStyle w:val="normal1"/>
+              <w:widowControl w:val="false"/>
+              <w:suppressAutoHyphens w:val="true"/>
+              <w:spacing w:lineRule="auto" w:line="240" w:before="0" w:after="0"/>
+              <w:jc w:val="start"/>
+              <w:rPr>
+                <w:rFonts w:ascii="Calibri" w:hAnsi="Calibri" w:eastAsia="Calibri" w:cs="Calibri"/>
+              </w:rPr>
+            </w:pPr>
+            <w:r>
+              <w:rPr>
+                <w:rFonts w:eastAsia="Calibri" w:cs="Calibri" w:ascii="Calibri" w:hAnsi="Calibri"/>
+              </w:rPr>
+              <w:t>Fail</w:t>
             </w:r>
           </w:p>
         </w:tc>
@@ -3700,128 +3861,188 @@
         <w:trPr/>
         <w:tc>
           <w:tcPr>
-            <w:tcW w:w="3475" w:type="dxa"/>
-            <w:tcBorders>
-              <w:top w:val="single" w:sz="8" w:space="0" w:color="000000"/>
-              <w:start w:val="single" w:sz="8" w:space="0" w:color="000000"/>
-              <w:bottom w:val="single" w:sz="8" w:space="0" w:color="000000"/>
-              <w:end w:val="single" w:sz="8" w:space="0" w:color="000000"/>
-            </w:tcBorders>
-          </w:tcPr>
-          <w:p>
-            <w:pPr>
-              <w:pStyle w:val="normal1"/>
-              <w:widowControl w:val="false"/>
-              <w:suppressAutoHyphens w:val="true"/>
-              <w:spacing w:lineRule="auto" w:line="240" w:before="0" w:after="0"/>
-              <w:jc w:val="start"/>
-              <w:rPr>
-                <w:rFonts w:ascii="Calibri" w:hAnsi="Calibri" w:eastAsia="Calibri" w:cs="Calibri"/>
-              </w:rPr>
-            </w:pPr>
-            <w:r>
-              <w:rPr>
-                <w:rFonts w:eastAsia="Calibri" w:cs="Calibri" w:ascii="Calibri" w:hAnsi="Calibri"/>
-                <w:kern w:val="0"/>
-                <w:sz w:val="22"/>
-                <w:szCs w:val="22"/>
-                <w:lang w:val="en-US" w:eastAsia="zh-CN" w:bidi="hi-IN"/>
-              </w:rPr>
-              <w:t>buttom</w:t>
-            </w:r>
-          </w:p>
-        </w:tc>
-        <w:tc>
-          <w:tcPr>
-            <w:tcW w:w="2825" w:type="dxa"/>
-            <w:tcBorders>
-              <w:top w:val="single" w:sz="8" w:space="0" w:color="000000"/>
-              <w:start w:val="single" w:sz="8" w:space="0" w:color="000000"/>
-              <w:bottom w:val="single" w:sz="8" w:space="0" w:color="000000"/>
-              <w:end w:val="single" w:sz="8" w:space="0" w:color="000000"/>
-            </w:tcBorders>
-          </w:tcPr>
-          <w:p>
-            <w:pPr>
-              <w:pStyle w:val="normal1"/>
-              <w:widowControl w:val="false"/>
-              <w:suppressAutoHyphens w:val="true"/>
-              <w:spacing w:lineRule="auto" w:line="240" w:before="0" w:after="0"/>
-              <w:jc w:val="start"/>
-              <w:rPr>
-                <w:rFonts w:ascii="Calibri" w:hAnsi="Calibri" w:eastAsia="Calibri" w:cs="Calibri"/>
-              </w:rPr>
-            </w:pPr>
-            <w:r>
-              <w:rPr>
-                <w:rFonts w:eastAsia="Calibri" w:cs="Calibri" w:ascii="Calibri" w:hAnsi="Calibri"/>
-              </w:rPr>
-            </w:r>
-          </w:p>
-        </w:tc>
-        <w:tc>
-          <w:tcPr>
-            <w:tcW w:w="2980" w:type="dxa"/>
-            <w:tcBorders>
-              <w:top w:val="single" w:sz="8" w:space="0" w:color="000000"/>
-              <w:start w:val="single" w:sz="8" w:space="0" w:color="000000"/>
-              <w:bottom w:val="single" w:sz="8" w:space="0" w:color="000000"/>
-              <w:end w:val="single" w:sz="8" w:space="0" w:color="000000"/>
-            </w:tcBorders>
-          </w:tcPr>
-          <w:p>
-            <w:pPr>
-              <w:pStyle w:val="normal1"/>
-              <w:widowControl w:val="false"/>
-              <w:suppressAutoHyphens w:val="true"/>
-              <w:spacing w:lineRule="auto" w:line="240" w:before="0" w:after="0"/>
-              <w:jc w:val="start"/>
-              <w:rPr>
-                <w:rFonts w:ascii="Calibri" w:hAnsi="Calibri" w:eastAsia="Calibri" w:cs="Calibri"/>
-              </w:rPr>
-            </w:pPr>
-            <w:r>
-              <w:rPr>
-                <w:rFonts w:eastAsia="Calibri" w:cs="Calibri" w:ascii="Calibri" w:hAnsi="Calibri"/>
-                <w:kern w:val="0"/>
-                <w:sz w:val="22"/>
-                <w:szCs w:val="22"/>
-                <w:lang w:val="en-US" w:eastAsia="zh-CN" w:bidi="hi-IN"/>
-              </w:rPr>
-              <w:t>Enter thing. But send you tp anpther page</w:t>
-            </w:r>
-          </w:p>
-        </w:tc>
-        <w:tc>
-          <w:tcPr>
-            <w:tcW w:w="1055" w:type="dxa"/>
-            <w:tcBorders>
-              <w:top w:val="single" w:sz="8" w:space="0" w:color="000000"/>
-              <w:start w:val="single" w:sz="8" w:space="0" w:color="000000"/>
-              <w:bottom w:val="single" w:sz="8" w:space="0" w:color="000000"/>
-              <w:end w:val="single" w:sz="8" w:space="0" w:color="000000"/>
-            </w:tcBorders>
-          </w:tcPr>
-          <w:p>
-            <w:pPr>
-              <w:pStyle w:val="normal1"/>
-              <w:widowControl w:val="false"/>
-              <w:suppressAutoHyphens w:val="true"/>
-              <w:spacing w:lineRule="auto" w:line="240" w:before="0" w:after="0"/>
-              <w:jc w:val="start"/>
-              <w:rPr>
-                <w:rFonts w:ascii="Calibri" w:hAnsi="Calibri" w:eastAsia="Calibri" w:cs="Calibri"/>
-              </w:rPr>
-            </w:pPr>
-            <w:r>
-              <w:rPr>
-                <w:rFonts w:eastAsia="Calibri" w:cs="Calibri" w:ascii="Calibri" w:hAnsi="Calibri"/>
-                <w:kern w:val="0"/>
-                <w:sz w:val="22"/>
-                <w:szCs w:val="22"/>
-                <w:lang w:val="en-US" w:eastAsia="zh-CN" w:bidi="hi-IN"/>
-              </w:rPr>
-              <w:t>no</w:t>
+            <w:tcW w:w="3474" w:type="dxa"/>
+            <w:tcBorders>
+              <w:start w:val="single" w:sz="8" w:space="0" w:color="000000"/>
+              <w:bottom w:val="single" w:sz="8" w:space="0" w:color="000000"/>
+              <w:end w:val="single" w:sz="8" w:space="0" w:color="000000"/>
+            </w:tcBorders>
+          </w:tcPr>
+          <w:p>
+            <w:pPr>
+              <w:pStyle w:val="normal1"/>
+              <w:widowControl w:val="false"/>
+              <w:suppressAutoHyphens w:val="true"/>
+              <w:spacing w:lineRule="auto" w:line="240" w:before="0" w:after="0"/>
+              <w:jc w:val="start"/>
+              <w:rPr>
+                <w:rFonts w:ascii="Calibri" w:hAnsi="Calibri" w:eastAsia="Calibri" w:cs="Calibri"/>
+              </w:rPr>
+            </w:pPr>
+            <w:r>
+              <w:rPr>
+                <w:kern w:val="0"/>
+                <w:sz w:val="22"/>
+                <w:szCs w:val="22"/>
+                <w:lang w:val="en-US" w:eastAsia="zh-CN" w:bidi="hi-IN"/>
+              </w:rPr>
+              <w:t>Text box</w:t>
+            </w:r>
+            <w:r>
+              <w:rPr>
+                <w:kern w:val="0"/>
+                <w:sz w:val="22"/>
+                <w:szCs w:val="22"/>
+                <w:lang w:val="en-US" w:eastAsia="zh-CN" w:bidi="hi-IN"/>
+              </w:rPr>
+              <w:t xml:space="preserve"> | </w:t>
+            </w:r>
+            <w:r>
+              <w:rPr>
+                <w:kern w:val="0"/>
+                <w:sz w:val="22"/>
+                <w:szCs w:val="22"/>
+                <w:lang w:val="en-US" w:eastAsia="zh-CN" w:bidi="hi-IN"/>
+              </w:rPr>
+              <w:t>grid</w:t>
+            </w:r>
+            <w:r>
+              <w:rPr>
+                <w:kern w:val="0"/>
+                <w:sz w:val="22"/>
+                <w:szCs w:val="22"/>
+                <w:lang w:val="en-US" w:eastAsia="zh-CN" w:bidi="hi-IN"/>
+              </w:rPr>
+              <w:t xml:space="preserve"> area</w:t>
+            </w:r>
+          </w:p>
+        </w:tc>
+        <w:tc>
+          <w:tcPr>
+            <w:tcW w:w="2826" w:type="dxa"/>
+            <w:tcBorders>
+              <w:start w:val="single" w:sz="8" w:space="0" w:color="000000"/>
+              <w:bottom w:val="single" w:sz="8" w:space="0" w:color="000000"/>
+              <w:end w:val="single" w:sz="8" w:space="0" w:color="000000"/>
+            </w:tcBorders>
+          </w:tcPr>
+          <w:p>
+            <w:pPr>
+              <w:pStyle w:val="normal1"/>
+              <w:widowControl w:val="false"/>
+              <w:suppressAutoHyphens w:val="true"/>
+              <w:spacing w:lineRule="auto" w:line="240" w:before="0" w:after="0"/>
+              <w:jc w:val="start"/>
+              <w:rPr>
+                <w:rFonts w:ascii="Calibri" w:hAnsi="Calibri" w:eastAsia="Calibri" w:cs="Calibri"/>
+              </w:rPr>
+            </w:pPr>
+            <w:r>
+              <w:rPr>
+                <w:rFonts w:eastAsia="Calibri" w:cs="Calibri" w:ascii="Calibri" w:hAnsi="Calibri"/>
+              </w:rPr>
+              <w:t>I check if the grid box is working the way I want it to be.</w:t>
+            </w:r>
+          </w:p>
+        </w:tc>
+        <w:tc>
+          <w:tcPr>
+            <w:tcW w:w="2979" w:type="dxa"/>
+            <w:tcBorders>
+              <w:start w:val="single" w:sz="8" w:space="0" w:color="000000"/>
+              <w:bottom w:val="single" w:sz="8" w:space="0" w:color="000000"/>
+              <w:end w:val="single" w:sz="8" w:space="0" w:color="000000"/>
+            </w:tcBorders>
+          </w:tcPr>
+          <w:p>
+            <w:pPr>
+              <w:pStyle w:val="normal1"/>
+              <w:widowControl w:val="false"/>
+              <w:suppressAutoHyphens w:val="true"/>
+              <w:spacing w:lineRule="auto" w:line="240" w:before="0" w:after="0"/>
+              <w:jc w:val="start"/>
+              <w:rPr>
+                <w:rFonts w:ascii="Calibri" w:hAnsi="Calibri" w:eastAsia="Calibri" w:cs="Calibri"/>
+              </w:rPr>
+            </w:pPr>
+            <w:r>
+              <w:rPr>
+                <w:rFonts w:eastAsia="Calibri" w:cs="Calibri" w:ascii="Calibri" w:hAnsi="Calibri"/>
+              </w:rPr>
+              <w:drawing>
+                <wp:anchor distT="0" distB="0" distL="0" distR="0" simplePos="0" relativeHeight="57" behindDoc="0" locked="0" layoutInCell="0" allowOverlap="1">
+                  <wp:simplePos x="0" y="0"/>
+                  <wp:positionH relativeFrom="column">
+                    <wp:align>center</wp:align>
+                  </wp:positionH>
+                  <wp:positionV relativeFrom="paragraph">
+                    <wp:posOffset>635</wp:posOffset>
+                  </wp:positionV>
+                  <wp:extent cx="1764665" cy="1101725"/>
+                  <wp:effectExtent l="0" t="0" r="0" b="0"/>
+                  <wp:wrapSquare wrapText="largest"/>
+                  <wp:docPr id="9" name="Image16"/>
+                  <wp:cNvGraphicFramePr>
+                    <a:graphicFrameLocks xmlns:a="http://schemas.openxmlformats.org/drawingml/2006/main" noChangeAspect="1"/>
+                  </wp:cNvGraphicFramePr>
+                  <a:graphic xmlns:a="http://schemas.openxmlformats.org/drawingml/2006/main">
+                    <a:graphicData uri="http://schemas.openxmlformats.org/drawingml/2006/picture">
+                      <pic:pic xmlns:pic="http://schemas.openxmlformats.org/drawingml/2006/picture">
+                        <pic:nvPicPr>
+                          <pic:cNvPr id="9" name="Image16"/>
+                          <pic:cNvPicPr>
+                            <a:picLocks noChangeAspect="1" noChangeArrowheads="1"/>
+                          </pic:cNvPicPr>
+                        </pic:nvPicPr>
+                        <pic:blipFill>
+                          <a:blip r:embed="rId10"/>
+                          <a:stretch>
+                            <a:fillRect/>
+                          </a:stretch>
+                        </pic:blipFill>
+                        <pic:spPr bwMode="auto">
+                          <a:xfrm>
+                            <a:off x="0" y="0"/>
+                            <a:ext cx="1764665" cy="1101725"/>
+                          </a:xfrm>
+                          <a:prstGeom prst="rect">
+                            <a:avLst/>
+                          </a:prstGeom>
+                          <a:noFill/>
+                        </pic:spPr>
+                      </pic:pic>
+                    </a:graphicData>
+                  </a:graphic>
+                </wp:anchor>
+              </w:drawing>
+            </w:r>
+          </w:p>
+        </w:tc>
+        <w:tc>
+          <w:tcPr>
+            <w:tcW w:w="1056" w:type="dxa"/>
+            <w:tcBorders>
+              <w:start w:val="single" w:sz="8" w:space="0" w:color="000000"/>
+              <w:bottom w:val="single" w:sz="8" w:space="0" w:color="000000"/>
+              <w:end w:val="single" w:sz="8" w:space="0" w:color="000000"/>
+            </w:tcBorders>
+          </w:tcPr>
+          <w:p>
+            <w:pPr>
+              <w:pStyle w:val="normal1"/>
+              <w:widowControl w:val="false"/>
+              <w:suppressAutoHyphens w:val="true"/>
+              <w:spacing w:lineRule="auto" w:line="240" w:before="0" w:after="0"/>
+              <w:jc w:val="start"/>
+              <w:rPr>
+                <w:rFonts w:ascii="Calibri" w:hAnsi="Calibri" w:eastAsia="Calibri" w:cs="Calibri"/>
+              </w:rPr>
+            </w:pPr>
+            <w:r>
+              <w:rPr>
+                <w:rFonts w:eastAsia="Calibri" w:cs="Calibri" w:ascii="Calibri" w:hAnsi="Calibri"/>
+              </w:rPr>
+              <w:t>Fail</w:t>
             </w:r>
           </w:p>
         </w:tc>
@@ -3830,118 +4051,188 @@
         <w:trPr/>
         <w:tc>
           <w:tcPr>
-            <w:tcW w:w="3475" w:type="dxa"/>
-            <w:tcBorders>
-              <w:top w:val="single" w:sz="8" w:space="0" w:color="000000"/>
-              <w:start w:val="single" w:sz="8" w:space="0" w:color="000000"/>
-              <w:bottom w:val="single" w:sz="8" w:space="0" w:color="000000"/>
-              <w:end w:val="single" w:sz="8" w:space="0" w:color="000000"/>
-            </w:tcBorders>
-          </w:tcPr>
-          <w:p>
-            <w:pPr>
-              <w:pStyle w:val="normal1"/>
-              <w:widowControl w:val="false"/>
-              <w:suppressAutoHyphens w:val="true"/>
-              <w:spacing w:lineRule="auto" w:line="240" w:before="0" w:after="0"/>
-              <w:jc w:val="start"/>
-              <w:rPr>
-                <w:rFonts w:ascii="Calibri" w:hAnsi="Calibri" w:eastAsia="Calibri" w:cs="Calibri"/>
-              </w:rPr>
-            </w:pPr>
-            <w:r>
-              <w:rPr>
-                <w:rFonts w:eastAsia="Calibri" w:cs="Calibri" w:ascii="Calibri" w:hAnsi="Calibri"/>
-                <w:kern w:val="0"/>
-                <w:sz w:val="22"/>
-                <w:szCs w:val="22"/>
-                <w:lang w:val="en-US" w:eastAsia="zh-CN" w:bidi="hi-IN"/>
-              </w:rPr>
-              <w:t>Sign up textbox</w:t>
-            </w:r>
-          </w:p>
-        </w:tc>
-        <w:tc>
-          <w:tcPr>
-            <w:tcW w:w="2825" w:type="dxa"/>
-            <w:tcBorders>
-              <w:top w:val="single" w:sz="8" w:space="0" w:color="000000"/>
-              <w:start w:val="single" w:sz="8" w:space="0" w:color="000000"/>
-              <w:bottom w:val="single" w:sz="8" w:space="0" w:color="000000"/>
-              <w:end w:val="single" w:sz="8" w:space="0" w:color="000000"/>
-            </w:tcBorders>
-          </w:tcPr>
-          <w:p>
-            <w:pPr>
-              <w:pStyle w:val="normal1"/>
-              <w:widowControl w:val="false"/>
-              <w:suppressAutoHyphens w:val="true"/>
-              <w:spacing w:lineRule="auto" w:line="240" w:before="0" w:after="0"/>
-              <w:jc w:val="start"/>
-              <w:rPr>
-                <w:rFonts w:ascii="Calibri" w:hAnsi="Calibri" w:eastAsia="Calibri" w:cs="Calibri"/>
-              </w:rPr>
-            </w:pPr>
-            <w:r>
-              <w:rPr>
-                <w:rFonts w:eastAsia="Calibri" w:cs="Calibri" w:ascii="Calibri" w:hAnsi="Calibri"/>
-              </w:rPr>
-            </w:r>
-          </w:p>
-        </w:tc>
-        <w:tc>
-          <w:tcPr>
-            <w:tcW w:w="2980" w:type="dxa"/>
-            <w:tcBorders>
-              <w:top w:val="single" w:sz="8" w:space="0" w:color="000000"/>
-              <w:start w:val="single" w:sz="8" w:space="0" w:color="000000"/>
-              <w:bottom w:val="single" w:sz="8" w:space="0" w:color="000000"/>
-              <w:end w:val="single" w:sz="8" w:space="0" w:color="000000"/>
-            </w:tcBorders>
-          </w:tcPr>
-          <w:p>
-            <w:pPr>
-              <w:pStyle w:val="normal1"/>
-              <w:widowControl w:val="false"/>
-              <w:suppressAutoHyphens w:val="true"/>
-              <w:spacing w:lineRule="auto" w:line="240" w:before="0" w:after="0"/>
-              <w:jc w:val="start"/>
-              <w:rPr>
-                <w:rFonts w:ascii="Calibri" w:hAnsi="Calibri" w:eastAsia="Calibri" w:cs="Calibri"/>
-              </w:rPr>
-            </w:pPr>
-            <w:r>
-              <w:rPr>
-                <w:rFonts w:eastAsia="Calibri" w:cs="Calibri" w:ascii="Calibri" w:hAnsi="Calibri"/>
-              </w:rPr>
-            </w:r>
-          </w:p>
-        </w:tc>
-        <w:tc>
-          <w:tcPr>
-            <w:tcW w:w="1055" w:type="dxa"/>
-            <w:tcBorders>
-              <w:top w:val="single" w:sz="8" w:space="0" w:color="000000"/>
-              <w:start w:val="single" w:sz="8" w:space="0" w:color="000000"/>
-              <w:bottom w:val="single" w:sz="8" w:space="0" w:color="000000"/>
-              <w:end w:val="single" w:sz="8" w:space="0" w:color="000000"/>
-            </w:tcBorders>
-          </w:tcPr>
-          <w:p>
-            <w:pPr>
-              <w:pStyle w:val="normal1"/>
-              <w:widowControl w:val="false"/>
-              <w:suppressAutoHyphens w:val="true"/>
-              <w:spacing w:lineRule="auto" w:line="240" w:before="0" w:after="0"/>
-              <w:jc w:val="start"/>
-              <w:rPr>
-                <w:rFonts w:ascii="Calibri" w:hAnsi="Calibri" w:eastAsia="Calibri" w:cs="Calibri"/>
-              </w:rPr>
-            </w:pPr>
-            <w:r>
-              <w:rPr>
-                <w:rFonts w:eastAsia="Calibri" w:cs="Calibri" w:ascii="Calibri" w:hAnsi="Calibri"/>
-              </w:rPr>
+            <w:tcW w:w="3474" w:type="dxa"/>
+            <w:tcBorders>
+              <w:start w:val="single" w:sz="8" w:space="0" w:color="000000"/>
+              <w:bottom w:val="single" w:sz="8" w:space="0" w:color="000000"/>
+              <w:end w:val="single" w:sz="8" w:space="0" w:color="000000"/>
+            </w:tcBorders>
+          </w:tcPr>
+          <w:p>
+            <w:pPr>
+              <w:pStyle w:val="normal1"/>
+              <w:widowControl w:val="false"/>
+              <w:suppressAutoHyphens w:val="true"/>
+              <w:spacing w:lineRule="auto" w:line="240" w:before="0" w:after="0"/>
+              <w:jc w:val="start"/>
+              <w:rPr>
+                <w:rFonts w:ascii="Calibri" w:hAnsi="Calibri" w:eastAsia="Calibri" w:cs="Calibri"/>
+              </w:rPr>
+            </w:pPr>
+            <w:r>
+              <w:rPr>
+                <w:kern w:val="0"/>
+                <w:sz w:val="22"/>
+                <w:szCs w:val="22"/>
+                <w:lang w:val="en-US" w:eastAsia="zh-CN" w:bidi="hi-IN"/>
+              </w:rPr>
+              <w:t>Text box</w:t>
+            </w:r>
+            <w:r>
+              <w:rPr>
+                <w:kern w:val="0"/>
+                <w:sz w:val="22"/>
+                <w:szCs w:val="22"/>
+                <w:lang w:val="en-US" w:eastAsia="zh-CN" w:bidi="hi-IN"/>
+              </w:rPr>
+              <w:t xml:space="preserve"> | </w:t>
+            </w:r>
+            <w:r>
+              <w:rPr>
+                <w:kern w:val="0"/>
+                <w:sz w:val="22"/>
+                <w:szCs w:val="22"/>
+                <w:lang w:val="en-US" w:eastAsia="zh-CN" w:bidi="hi-IN"/>
+              </w:rPr>
+              <w:t>grid</w:t>
+            </w:r>
+            <w:r>
+              <w:rPr>
+                <w:kern w:val="0"/>
+                <w:sz w:val="22"/>
+                <w:szCs w:val="22"/>
+                <w:lang w:val="en-US" w:eastAsia="zh-CN" w:bidi="hi-IN"/>
+              </w:rPr>
+              <w:t xml:space="preserve"> area</w:t>
+            </w:r>
+          </w:p>
+        </w:tc>
+        <w:tc>
+          <w:tcPr>
+            <w:tcW w:w="2826" w:type="dxa"/>
+            <w:tcBorders>
+              <w:start w:val="single" w:sz="8" w:space="0" w:color="000000"/>
+              <w:bottom w:val="single" w:sz="8" w:space="0" w:color="000000"/>
+              <w:end w:val="single" w:sz="8" w:space="0" w:color="000000"/>
+            </w:tcBorders>
+          </w:tcPr>
+          <w:p>
+            <w:pPr>
+              <w:pStyle w:val="normal1"/>
+              <w:widowControl w:val="false"/>
+              <w:suppressAutoHyphens w:val="true"/>
+              <w:spacing w:lineRule="auto" w:line="240" w:before="0" w:after="0"/>
+              <w:jc w:val="start"/>
+              <w:rPr>
+                <w:rFonts w:ascii="Calibri" w:hAnsi="Calibri" w:eastAsia="Calibri" w:cs="Calibri"/>
+              </w:rPr>
+            </w:pPr>
+            <w:r>
+              <w:rPr>
+                <w:rFonts w:eastAsia="Calibri" w:cs="Calibri" w:ascii="Calibri" w:hAnsi="Calibri"/>
+              </w:rPr>
+              <w:t>I check if the grid box is working the way I want it to be.</w:t>
+            </w:r>
+          </w:p>
+        </w:tc>
+        <w:tc>
+          <w:tcPr>
+            <w:tcW w:w="2979" w:type="dxa"/>
+            <w:tcBorders>
+              <w:start w:val="single" w:sz="8" w:space="0" w:color="000000"/>
+              <w:bottom w:val="single" w:sz="8" w:space="0" w:color="000000"/>
+              <w:end w:val="single" w:sz="8" w:space="0" w:color="000000"/>
+            </w:tcBorders>
+          </w:tcPr>
+          <w:p>
+            <w:pPr>
+              <w:pStyle w:val="normal1"/>
+              <w:widowControl w:val="false"/>
+              <w:suppressAutoHyphens w:val="true"/>
+              <w:spacing w:lineRule="auto" w:line="240" w:before="0" w:after="0"/>
+              <w:jc w:val="start"/>
+              <w:rPr>
+                <w:rFonts w:ascii="Calibri" w:hAnsi="Calibri" w:eastAsia="Calibri" w:cs="Calibri"/>
+              </w:rPr>
+            </w:pPr>
+            <w:r>
+              <w:rPr>
+                <w:rFonts w:eastAsia="Calibri" w:cs="Calibri" w:ascii="Calibri" w:hAnsi="Calibri"/>
+              </w:rPr>
+              <w:drawing>
+                <wp:anchor distT="0" distB="0" distL="0" distR="0" simplePos="0" relativeHeight="56" behindDoc="0" locked="0" layoutInCell="0" allowOverlap="1">
+                  <wp:simplePos x="0" y="0"/>
+                  <wp:positionH relativeFrom="column">
+                    <wp:align>center</wp:align>
+                  </wp:positionH>
+                  <wp:positionV relativeFrom="paragraph">
+                    <wp:posOffset>635</wp:posOffset>
+                  </wp:positionV>
+                  <wp:extent cx="1764665" cy="1539240"/>
+                  <wp:effectExtent l="0" t="0" r="0" b="0"/>
+                  <wp:wrapSquare wrapText="largest"/>
+                  <wp:docPr id="10" name="Image15"/>
+                  <wp:cNvGraphicFramePr>
+                    <a:graphicFrameLocks xmlns:a="http://schemas.openxmlformats.org/drawingml/2006/main" noChangeAspect="1"/>
+                  </wp:cNvGraphicFramePr>
+                  <a:graphic xmlns:a="http://schemas.openxmlformats.org/drawingml/2006/main">
+                    <a:graphicData uri="http://schemas.openxmlformats.org/drawingml/2006/picture">
+                      <pic:pic xmlns:pic="http://schemas.openxmlformats.org/drawingml/2006/picture">
+                        <pic:nvPicPr>
+                          <pic:cNvPr id="10" name="Image15"/>
+                          <pic:cNvPicPr>
+                            <a:picLocks noChangeAspect="1" noChangeArrowheads="1"/>
+                          </pic:cNvPicPr>
+                        </pic:nvPicPr>
+                        <pic:blipFill>
+                          <a:blip r:embed="rId11"/>
+                          <a:stretch>
+                            <a:fillRect/>
+                          </a:stretch>
+                        </pic:blipFill>
+                        <pic:spPr bwMode="auto">
+                          <a:xfrm>
+                            <a:off x="0" y="0"/>
+                            <a:ext cx="1764665" cy="1539240"/>
+                          </a:xfrm>
+                          <a:prstGeom prst="rect">
+                            <a:avLst/>
+                          </a:prstGeom>
+                          <a:noFill/>
+                        </pic:spPr>
+                      </pic:pic>
+                    </a:graphicData>
+                  </a:graphic>
+                </wp:anchor>
+              </w:drawing>
+            </w:r>
+          </w:p>
+        </w:tc>
+        <w:tc>
+          <w:tcPr>
+            <w:tcW w:w="1056" w:type="dxa"/>
+            <w:tcBorders>
+              <w:start w:val="single" w:sz="8" w:space="0" w:color="000000"/>
+              <w:bottom w:val="single" w:sz="8" w:space="0" w:color="000000"/>
+              <w:end w:val="single" w:sz="8" w:space="0" w:color="000000"/>
+            </w:tcBorders>
+          </w:tcPr>
+          <w:p>
+            <w:pPr>
+              <w:pStyle w:val="normal1"/>
+              <w:widowControl w:val="false"/>
+              <w:suppressAutoHyphens w:val="true"/>
+              <w:spacing w:lineRule="auto" w:line="240" w:before="0" w:after="0"/>
+              <w:jc w:val="start"/>
+              <w:rPr>
+                <w:rFonts w:ascii="Calibri" w:hAnsi="Calibri" w:eastAsia="Calibri" w:cs="Calibri"/>
+              </w:rPr>
+            </w:pPr>
+            <w:r>
+              <w:rPr>
+                <w:rFonts w:eastAsia="Calibri" w:cs="Calibri" w:ascii="Calibri" w:hAnsi="Calibri"/>
+              </w:rPr>
+              <w:t>pass</w:t>
             </w:r>
           </w:p>
         </w:tc>
@@ -3950,91 +4241,341 @@
         <w:trPr/>
         <w:tc>
           <w:tcPr>
-            <w:tcW w:w="3475" w:type="dxa"/>
-            <w:tcBorders>
-              <w:top w:val="single" w:sz="8" w:space="0" w:color="000000"/>
-              <w:start w:val="single" w:sz="8" w:space="0" w:color="000000"/>
-              <w:bottom w:val="single" w:sz="8" w:space="0" w:color="000000"/>
-              <w:end w:val="single" w:sz="8" w:space="0" w:color="000000"/>
-            </w:tcBorders>
-          </w:tcPr>
-          <w:p>
-            <w:pPr>
-              <w:pStyle w:val="normal1"/>
-              <w:widowControl w:val="false"/>
-              <w:suppressAutoHyphens w:val="true"/>
-              <w:spacing w:lineRule="auto" w:line="240" w:before="0" w:after="0"/>
-              <w:jc w:val="start"/>
-              <w:rPr>
-                <w:rFonts w:ascii="Calibri" w:hAnsi="Calibri" w:eastAsia="Calibri" w:cs="Calibri"/>
-              </w:rPr>
-            </w:pPr>
-            <w:r>
-              <w:rPr>
-                <w:rFonts w:eastAsia="Calibri" w:cs="Calibri" w:ascii="Calibri" w:hAnsi="Calibri"/>
-              </w:rPr>
-            </w:r>
-          </w:p>
-        </w:tc>
-        <w:tc>
-          <w:tcPr>
-            <w:tcW w:w="2825" w:type="dxa"/>
-            <w:tcBorders>
-              <w:top w:val="single" w:sz="8" w:space="0" w:color="000000"/>
-              <w:start w:val="single" w:sz="8" w:space="0" w:color="000000"/>
-              <w:bottom w:val="single" w:sz="8" w:space="0" w:color="000000"/>
-              <w:end w:val="single" w:sz="8" w:space="0" w:color="000000"/>
-            </w:tcBorders>
-          </w:tcPr>
-          <w:p>
-            <w:pPr>
-              <w:pStyle w:val="normal1"/>
-              <w:widowControl w:val="false"/>
-              <w:suppressAutoHyphens w:val="true"/>
-              <w:spacing w:lineRule="auto" w:line="240" w:before="0" w:after="0"/>
-              <w:jc w:val="start"/>
-              <w:rPr>
-                <w:rFonts w:ascii="Calibri" w:hAnsi="Calibri" w:eastAsia="Calibri" w:cs="Calibri"/>
-              </w:rPr>
-            </w:pPr>
-            <w:r>
-              <w:rPr>
-                <w:rFonts w:eastAsia="Calibri" w:cs="Calibri" w:ascii="Calibri" w:hAnsi="Calibri"/>
-              </w:rPr>
-            </w:r>
-          </w:p>
-        </w:tc>
-        <w:tc>
-          <w:tcPr>
-            <w:tcW w:w="2980" w:type="dxa"/>
-            <w:tcBorders>
-              <w:top w:val="single" w:sz="8" w:space="0" w:color="000000"/>
-              <w:start w:val="single" w:sz="8" w:space="0" w:color="000000"/>
-              <w:bottom w:val="single" w:sz="8" w:space="0" w:color="000000"/>
-              <w:end w:val="single" w:sz="8" w:space="0" w:color="000000"/>
-            </w:tcBorders>
-          </w:tcPr>
-          <w:p>
-            <w:pPr>
-              <w:pStyle w:val="normal1"/>
-              <w:widowControl w:val="false"/>
-              <w:suppressAutoHyphens w:val="true"/>
-              <w:spacing w:lineRule="auto" w:line="240" w:before="0" w:after="0"/>
-              <w:jc w:val="start"/>
-              <w:rPr>
-                <w:rFonts w:ascii="Calibri" w:hAnsi="Calibri" w:eastAsia="Calibri" w:cs="Calibri"/>
-              </w:rPr>
-            </w:pPr>
-            <w:r>
-              <w:rPr>
-                <w:rFonts w:eastAsia="Calibri" w:cs="Calibri" w:ascii="Calibri" w:hAnsi="Calibri"/>
-              </w:rPr>
-            </w:r>
-          </w:p>
-        </w:tc>
-        <w:tc>
-          <w:tcPr>
-            <w:tcW w:w="1055" w:type="dxa"/>
+            <w:tcW w:w="3474" w:type="dxa"/>
+            <w:tcBorders>
+              <w:top w:val="single" w:sz="8" w:space="0" w:color="000000"/>
+              <w:start w:val="single" w:sz="8" w:space="0" w:color="000000"/>
+              <w:bottom w:val="single" w:sz="8" w:space="0" w:color="000000"/>
+              <w:end w:val="single" w:sz="8" w:space="0" w:color="000000"/>
+            </w:tcBorders>
+          </w:tcPr>
+          <w:p>
+            <w:pPr>
+              <w:pStyle w:val="normal1"/>
+              <w:widowControl w:val="false"/>
+              <w:suppressAutoHyphens w:val="true"/>
+              <w:spacing w:lineRule="auto" w:line="240" w:before="0" w:after="0"/>
+              <w:jc w:val="start"/>
+              <w:rPr>
+                <w:rFonts w:ascii="Calibri" w:hAnsi="Calibri" w:eastAsia="Calibri" w:cs="Calibri"/>
+              </w:rPr>
+            </w:pPr>
+            <w:r>
+              <w:rPr>
+                <w:rFonts w:eastAsia="Calibri" w:cs="Calibri" w:ascii="Calibri" w:hAnsi="Calibri"/>
+                <w:kern w:val="0"/>
+                <w:sz w:val="22"/>
+                <w:szCs w:val="22"/>
+                <w:lang w:val="en-US" w:eastAsia="zh-CN" w:bidi="hi-IN"/>
+              </w:rPr>
+              <w:t>buttom</w:t>
+            </w:r>
+          </w:p>
+        </w:tc>
+        <w:tc>
+          <w:tcPr>
+            <w:tcW w:w="2826" w:type="dxa"/>
+            <w:tcBorders>
+              <w:top w:val="single" w:sz="8" w:space="0" w:color="000000"/>
+              <w:start w:val="single" w:sz="8" w:space="0" w:color="000000"/>
+              <w:bottom w:val="single" w:sz="8" w:space="0" w:color="000000"/>
+              <w:end w:val="single" w:sz="8" w:space="0" w:color="000000"/>
+            </w:tcBorders>
+          </w:tcPr>
+          <w:p>
+            <w:pPr>
+              <w:pStyle w:val="normal1"/>
+              <w:widowControl w:val="false"/>
+              <w:suppressAutoHyphens w:val="true"/>
+              <w:spacing w:lineRule="auto" w:line="240" w:before="0" w:after="0"/>
+              <w:jc w:val="start"/>
+              <w:rPr>
+                <w:rFonts w:ascii="Calibri" w:hAnsi="Calibri" w:eastAsia="Calibri" w:cs="Calibri"/>
+              </w:rPr>
+            </w:pPr>
+            <w:r>
+              <w:rPr>
+                <w:rFonts w:eastAsia="Calibri" w:cs="Calibri" w:ascii="Calibri" w:hAnsi="Calibri"/>
+              </w:rPr>
+            </w:r>
+          </w:p>
+        </w:tc>
+        <w:tc>
+          <w:tcPr>
+            <w:tcW w:w="2979" w:type="dxa"/>
+            <w:tcBorders>
+              <w:top w:val="single" w:sz="8" w:space="0" w:color="000000"/>
+              <w:start w:val="single" w:sz="8" w:space="0" w:color="000000"/>
+              <w:bottom w:val="single" w:sz="8" w:space="0" w:color="000000"/>
+              <w:end w:val="single" w:sz="8" w:space="0" w:color="000000"/>
+            </w:tcBorders>
+          </w:tcPr>
+          <w:p>
+            <w:pPr>
+              <w:pStyle w:val="normal1"/>
+              <w:widowControl w:val="false"/>
+              <w:suppressAutoHyphens w:val="true"/>
+              <w:spacing w:lineRule="auto" w:line="240" w:before="0" w:after="0"/>
+              <w:jc w:val="start"/>
+              <w:rPr>
+                <w:rFonts w:ascii="Calibri" w:hAnsi="Calibri" w:eastAsia="Calibri" w:cs="Calibri"/>
+              </w:rPr>
+            </w:pPr>
+            <w:r>
+              <w:rPr>
+                <w:rFonts w:eastAsia="Calibri" w:cs="Calibri" w:ascii="Calibri" w:hAnsi="Calibri"/>
+                <w:kern w:val="0"/>
+                <w:sz w:val="22"/>
+                <w:szCs w:val="22"/>
+                <w:lang w:val="en-US" w:eastAsia="zh-CN" w:bidi="hi-IN"/>
+              </w:rPr>
+              <w:t>Enter thing. But send you tp anpther page</w:t>
+            </w:r>
+          </w:p>
+        </w:tc>
+        <w:tc>
+          <w:tcPr>
+            <w:tcW w:w="1056" w:type="dxa"/>
+            <w:tcBorders>
+              <w:top w:val="single" w:sz="8" w:space="0" w:color="000000"/>
+              <w:start w:val="single" w:sz="8" w:space="0" w:color="000000"/>
+              <w:bottom w:val="single" w:sz="8" w:space="0" w:color="000000"/>
+              <w:end w:val="single" w:sz="8" w:space="0" w:color="000000"/>
+            </w:tcBorders>
+          </w:tcPr>
+          <w:p>
+            <w:pPr>
+              <w:pStyle w:val="normal1"/>
+              <w:widowControl w:val="false"/>
+              <w:suppressAutoHyphens w:val="true"/>
+              <w:spacing w:lineRule="auto" w:line="240" w:before="0" w:after="0"/>
+              <w:jc w:val="start"/>
+              <w:rPr>
+                <w:rFonts w:ascii="Calibri" w:hAnsi="Calibri" w:eastAsia="Calibri" w:cs="Calibri"/>
+              </w:rPr>
+            </w:pPr>
+            <w:r>
+              <w:rPr>
+                <w:rFonts w:eastAsia="Calibri" w:cs="Calibri" w:ascii="Calibri" w:hAnsi="Calibri"/>
+                <w:kern w:val="0"/>
+                <w:sz w:val="22"/>
+                <w:szCs w:val="22"/>
+                <w:lang w:val="en-US" w:eastAsia="zh-CN" w:bidi="hi-IN"/>
+              </w:rPr>
+              <w:t>no</w:t>
+            </w:r>
+          </w:p>
+        </w:tc>
+      </w:tr>
+      <w:tr>
+        <w:trPr/>
+        <w:tc>
+          <w:tcPr>
+            <w:tcW w:w="3474" w:type="dxa"/>
+            <w:tcBorders>
+              <w:top w:val="single" w:sz="8" w:space="0" w:color="000000"/>
+              <w:start w:val="single" w:sz="8" w:space="0" w:color="000000"/>
+              <w:bottom w:val="single" w:sz="8" w:space="0" w:color="000000"/>
+              <w:end w:val="single" w:sz="8" w:space="0" w:color="000000"/>
+            </w:tcBorders>
+          </w:tcPr>
+          <w:p>
+            <w:pPr>
+              <w:pStyle w:val="normal1"/>
+              <w:widowControl w:val="false"/>
+              <w:suppressAutoHyphens w:val="true"/>
+              <w:spacing w:lineRule="auto" w:line="240" w:before="0" w:after="0"/>
+              <w:jc w:val="start"/>
+              <w:rPr>
+                <w:rFonts w:ascii="Calibri" w:hAnsi="Calibri" w:eastAsia="Calibri" w:cs="Calibri"/>
+              </w:rPr>
+            </w:pPr>
+            <w:r>
+              <w:rPr>
+                <w:rFonts w:eastAsia="Calibri" w:cs="Calibri" w:ascii="Calibri" w:hAnsi="Calibri"/>
+                <w:kern w:val="0"/>
+                <w:sz w:val="22"/>
+                <w:szCs w:val="22"/>
+                <w:lang w:val="en-US" w:eastAsia="zh-CN" w:bidi="hi-IN"/>
+              </w:rPr>
+              <w:t>Sign up text box</w:t>
+            </w:r>
+          </w:p>
+        </w:tc>
+        <w:tc>
+          <w:tcPr>
+            <w:tcW w:w="2826" w:type="dxa"/>
+            <w:tcBorders>
+              <w:top w:val="single" w:sz="8" w:space="0" w:color="000000"/>
+              <w:start w:val="single" w:sz="8" w:space="0" w:color="000000"/>
+              <w:bottom w:val="single" w:sz="8" w:space="0" w:color="000000"/>
+              <w:end w:val="single" w:sz="8" w:space="0" w:color="000000"/>
+            </w:tcBorders>
+          </w:tcPr>
+          <w:p>
+            <w:pPr>
+              <w:pStyle w:val="normal1"/>
+              <w:widowControl w:val="false"/>
+              <w:suppressAutoHyphens w:val="true"/>
+              <w:spacing w:lineRule="auto" w:line="240" w:before="0" w:after="0"/>
+              <w:jc w:val="start"/>
+              <w:rPr>
+                <w:rFonts w:ascii="Calibri" w:hAnsi="Calibri" w:eastAsia="Calibri" w:cs="Calibri"/>
+              </w:rPr>
+            </w:pPr>
+            <w:r>
+              <w:rPr>
+                <w:rFonts w:eastAsia="Calibri" w:cs="Calibri" w:ascii="Calibri" w:hAnsi="Calibri"/>
+              </w:rPr>
+            </w:r>
+          </w:p>
+        </w:tc>
+        <w:tc>
+          <w:tcPr>
+            <w:tcW w:w="2979" w:type="dxa"/>
+            <w:tcBorders>
+              <w:top w:val="single" w:sz="8" w:space="0" w:color="000000"/>
+              <w:start w:val="single" w:sz="8" w:space="0" w:color="000000"/>
+              <w:bottom w:val="single" w:sz="8" w:space="0" w:color="000000"/>
+              <w:end w:val="single" w:sz="8" w:space="0" w:color="000000"/>
+            </w:tcBorders>
+          </w:tcPr>
+          <w:p>
+            <w:pPr>
+              <w:pStyle w:val="normal1"/>
+              <w:widowControl w:val="false"/>
+              <w:suppressAutoHyphens w:val="true"/>
+              <w:spacing w:lineRule="auto" w:line="240" w:before="0" w:after="0"/>
+              <w:jc w:val="start"/>
+              <w:rPr>
+                <w:rFonts w:ascii="Calibri" w:hAnsi="Calibri" w:eastAsia="Calibri" w:cs="Calibri"/>
+              </w:rPr>
+            </w:pPr>
+            <w:r>
+              <w:rPr>
+                <w:rFonts w:eastAsia="Calibri" w:cs="Calibri" w:ascii="Calibri" w:hAnsi="Calibri"/>
+              </w:rPr>
+            </w:r>
+          </w:p>
+        </w:tc>
+        <w:tc>
+          <w:tcPr>
+            <w:tcW w:w="1056" w:type="dxa"/>
+            <w:tcBorders>
+              <w:top w:val="single" w:sz="8" w:space="0" w:color="000000"/>
+              <w:start w:val="single" w:sz="8" w:space="0" w:color="000000"/>
+              <w:bottom w:val="single" w:sz="8" w:space="0" w:color="000000"/>
+              <w:end w:val="single" w:sz="8" w:space="0" w:color="000000"/>
+            </w:tcBorders>
+          </w:tcPr>
+          <w:p>
+            <w:pPr>
+              <w:pStyle w:val="normal1"/>
+              <w:widowControl w:val="false"/>
+              <w:suppressAutoHyphens w:val="true"/>
+              <w:spacing w:lineRule="auto" w:line="240" w:before="0" w:after="0"/>
+              <w:jc w:val="start"/>
+              <w:rPr>
+                <w:rFonts w:ascii="Calibri" w:hAnsi="Calibri" w:eastAsia="Calibri" w:cs="Calibri"/>
+              </w:rPr>
+            </w:pPr>
+            <w:r>
+              <w:rPr>
+                <w:rFonts w:eastAsia="Calibri" w:cs="Calibri" w:ascii="Calibri" w:hAnsi="Calibri"/>
+              </w:rPr>
+            </w:r>
+          </w:p>
+        </w:tc>
+      </w:tr>
+      <w:tr>
+        <w:trPr/>
+        <w:tc>
+          <w:tcPr>
+            <w:tcW w:w="3474" w:type="dxa"/>
+            <w:tcBorders>
+              <w:top w:val="single" w:sz="8" w:space="0" w:color="000000"/>
+              <w:start w:val="single" w:sz="8" w:space="0" w:color="000000"/>
+              <w:bottom w:val="single" w:sz="8" w:space="0" w:color="000000"/>
+              <w:end w:val="single" w:sz="8" w:space="0" w:color="000000"/>
+            </w:tcBorders>
+          </w:tcPr>
+          <w:p>
+            <w:pPr>
+              <w:pStyle w:val="normal1"/>
+              <w:widowControl w:val="false"/>
+              <w:suppressAutoHyphens w:val="true"/>
+              <w:spacing w:lineRule="auto" w:line="240" w:before="0" w:after="0"/>
+              <w:jc w:val="start"/>
+              <w:rPr>
+                <w:rFonts w:ascii="Calibri" w:hAnsi="Calibri" w:eastAsia="Calibri" w:cs="Calibri"/>
+              </w:rPr>
+            </w:pPr>
+            <w:r>
+              <w:rPr>
+                <w:rFonts w:eastAsia="Calibri" w:cs="Calibri" w:ascii="Calibri" w:hAnsi="Calibri"/>
+              </w:rPr>
+            </w:r>
+          </w:p>
+        </w:tc>
+        <w:tc>
+          <w:tcPr>
+            <w:tcW w:w="2826" w:type="dxa"/>
+            <w:tcBorders>
+              <w:top w:val="single" w:sz="8" w:space="0" w:color="000000"/>
+              <w:start w:val="single" w:sz="8" w:space="0" w:color="000000"/>
+              <w:bottom w:val="single" w:sz="8" w:space="0" w:color="000000"/>
+              <w:end w:val="single" w:sz="8" w:space="0" w:color="000000"/>
+            </w:tcBorders>
+          </w:tcPr>
+          <w:p>
+            <w:pPr>
+              <w:pStyle w:val="normal1"/>
+              <w:widowControl w:val="false"/>
+              <w:suppressAutoHyphens w:val="true"/>
+              <w:spacing w:lineRule="auto" w:line="240" w:before="0" w:after="0"/>
+              <w:jc w:val="start"/>
+              <w:rPr>
+                <w:rFonts w:ascii="Calibri" w:hAnsi="Calibri" w:eastAsia="Calibri" w:cs="Calibri"/>
+              </w:rPr>
+            </w:pPr>
+            <w:r>
+              <w:rPr>
+                <w:rFonts w:eastAsia="Calibri" w:cs="Calibri" w:ascii="Calibri" w:hAnsi="Calibri"/>
+              </w:rPr>
+            </w:r>
+          </w:p>
+        </w:tc>
+        <w:tc>
+          <w:tcPr>
+            <w:tcW w:w="2979" w:type="dxa"/>
+            <w:tcBorders>
+              <w:top w:val="single" w:sz="8" w:space="0" w:color="000000"/>
+              <w:start w:val="single" w:sz="8" w:space="0" w:color="000000"/>
+              <w:bottom w:val="single" w:sz="8" w:space="0" w:color="000000"/>
+              <w:end w:val="single" w:sz="8" w:space="0" w:color="000000"/>
+            </w:tcBorders>
+          </w:tcPr>
+          <w:p>
+            <w:pPr>
+              <w:pStyle w:val="normal1"/>
+              <w:widowControl w:val="false"/>
+              <w:suppressAutoHyphens w:val="true"/>
+              <w:spacing w:lineRule="auto" w:line="240" w:before="0" w:after="0"/>
+              <w:jc w:val="start"/>
+              <w:rPr>
+                <w:rFonts w:ascii="Calibri" w:hAnsi="Calibri" w:eastAsia="Calibri" w:cs="Calibri"/>
+              </w:rPr>
+            </w:pPr>
+            <w:r>
+              <w:rPr>
+                <w:rFonts w:eastAsia="Calibri" w:cs="Calibri" w:ascii="Calibri" w:hAnsi="Calibri"/>
+              </w:rPr>
+            </w:r>
+          </w:p>
+        </w:tc>
+        <w:tc>
+          <w:tcPr>
+            <w:tcW w:w="1056" w:type="dxa"/>
             <w:tcBorders>
               <w:top w:val="single" w:sz="8" w:space="0" w:color="000000"/>
               <w:start w:val="single" w:sz="8" w:space="0" w:color="000000"/>
@@ -5671,8 +6212,8 @@
         <w:tblLook w:val="0600" w:firstRow="0" w:noVBand="1" w:lastRow="0" w:firstColumn="0" w:lastColumn="0" w:noHBand="1"/>
       </w:tblPr>
       <w:tblGrid>
-        <w:gridCol w:w="3475"/>
-        <w:gridCol w:w="2825"/>
+        <w:gridCol w:w="3474"/>
+        <w:gridCol w:w="2826"/>
         <w:gridCol w:w="3402"/>
         <w:gridCol w:w="633"/>
       </w:tblGrid>
@@ -5680,7 +6221,7 @@
         <w:trPr/>
         <w:tc>
           <w:tcPr>
-            <w:tcW w:w="3475" w:type="dxa"/>
+            <w:tcW w:w="3474" w:type="dxa"/>
             <w:tcBorders>
               <w:top w:val="single" w:sz="8" w:space="0" w:color="000000"/>
               <w:start w:val="single" w:sz="8" w:space="0" w:color="000000"/>
@@ -5717,7 +6258,7 @@
         </w:tc>
         <w:tc>
           <w:tcPr>
-            <w:tcW w:w="2825" w:type="dxa"/>
+            <w:tcW w:w="2826" w:type="dxa"/>
             <w:tcBorders>
               <w:top w:val="single" w:sz="8" w:space="0" w:color="000000"/>
               <w:start w:val="single" w:sz="8" w:space="0" w:color="000000"/>
@@ -5819,7 +6360,7 @@
         <w:trPr/>
         <w:tc>
           <w:tcPr>
-            <w:tcW w:w="3475" w:type="dxa"/>
+            <w:tcW w:w="3474" w:type="dxa"/>
             <w:tcBorders>
               <w:top w:val="single" w:sz="8" w:space="0" w:color="000000"/>
               <w:start w:val="single" w:sz="8" w:space="0" w:color="000000"/>
@@ -5857,7 +6398,7 @@
         </w:tc>
         <w:tc>
           <w:tcPr>
-            <w:tcW w:w="2825" w:type="dxa"/>
+            <w:tcW w:w="2826" w:type="dxa"/>
             <w:tcBorders>
               <w:top w:val="single" w:sz="8" w:space="0" w:color="000000"/>
               <w:start w:val="single" w:sz="8" w:space="0" w:color="000000"/>
@@ -5974,7 +6515,7 @@
         <w:trPr/>
         <w:tc>
           <w:tcPr>
-            <w:tcW w:w="3475" w:type="dxa"/>
+            <w:tcW w:w="3474" w:type="dxa"/>
             <w:tcBorders>
               <w:top w:val="single" w:sz="8" w:space="0" w:color="000000"/>
               <w:start w:val="single" w:sz="8" w:space="0" w:color="000000"/>
@@ -6003,7 +6544,7 @@
         </w:tc>
         <w:tc>
           <w:tcPr>
-            <w:tcW w:w="2825" w:type="dxa"/>
+            <w:tcW w:w="2826" w:type="dxa"/>
             <w:tcBorders>
               <w:top w:val="single" w:sz="8" w:space="0" w:color="000000"/>
               <w:start w:val="single" w:sz="8" w:space="0" w:color="000000"/>
@@ -6066,7 +6607,7 @@
                   <wp:extent cx="2033270" cy="272415"/>
                   <wp:effectExtent l="0" t="0" r="0" b="0"/>
                   <wp:wrapSquare wrapText="largest"/>
-                  <wp:docPr id="7" name="Image11"/>
+                  <wp:docPr id="11" name="Image11"/>
                   <wp:cNvGraphicFramePr>
                     <a:graphicFrameLocks xmlns:a="http://schemas.openxmlformats.org/drawingml/2006/main" noChangeAspect="1"/>
                   </wp:cNvGraphicFramePr>
@@ -6074,13 +6615,13 @@
                     <a:graphicData uri="http://schemas.openxmlformats.org/drawingml/2006/picture">
                       <pic:pic xmlns:pic="http://schemas.openxmlformats.org/drawingml/2006/picture">
                         <pic:nvPicPr>
-                          <pic:cNvPr id="7" name="Image11"/>
+                          <pic:cNvPr id="11" name="Image11"/>
                           <pic:cNvPicPr>
                             <a:picLocks noChangeAspect="1" noChangeArrowheads="1"/>
                           </pic:cNvPicPr>
                         </pic:nvPicPr>
                         <pic:blipFill>
-                          <a:blip r:embed="rId8"/>
+                          <a:blip r:embed="rId12"/>
                           <a:stretch>
                             <a:fillRect/>
                           </a:stretch>
@@ -6136,7 +6677,7 @@
         <w:trPr/>
         <w:tc>
           <w:tcPr>
-            <w:tcW w:w="3475" w:type="dxa"/>
+            <w:tcW w:w="3474" w:type="dxa"/>
             <w:tcBorders>
               <w:start w:val="single" w:sz="8" w:space="0" w:color="000000"/>
               <w:bottom w:val="single" w:sz="8" w:space="0" w:color="000000"/>
@@ -6164,7 +6705,7 @@
         </w:tc>
         <w:tc>
           <w:tcPr>
-            <w:tcW w:w="2825" w:type="dxa"/>
+            <w:tcW w:w="2826" w:type="dxa"/>
             <w:tcBorders>
               <w:start w:val="single" w:sz="8" w:space="0" w:color="000000"/>
               <w:bottom w:val="single" w:sz="8" w:space="0" w:color="000000"/>
@@ -6225,7 +6766,7 @@
                   <wp:extent cx="2033270" cy="791210"/>
                   <wp:effectExtent l="0" t="0" r="0" b="0"/>
                   <wp:wrapSquare wrapText="largest"/>
-                  <wp:docPr id="8" name="Image7"/>
+                  <wp:docPr id="12" name="Image7"/>
                   <wp:cNvGraphicFramePr>
                     <a:graphicFrameLocks xmlns:a="http://schemas.openxmlformats.org/drawingml/2006/main" noChangeAspect="1"/>
                   </wp:cNvGraphicFramePr>
@@ -6233,13 +6774,13 @@
                     <a:graphicData uri="http://schemas.openxmlformats.org/drawingml/2006/picture">
                       <pic:pic xmlns:pic="http://schemas.openxmlformats.org/drawingml/2006/picture">
                         <pic:nvPicPr>
-                          <pic:cNvPr id="8" name="Image7"/>
+                          <pic:cNvPr id="12" name="Image7"/>
                           <pic:cNvPicPr>
                             <a:picLocks noChangeAspect="1" noChangeArrowheads="1"/>
                           </pic:cNvPicPr>
                         </pic:nvPicPr>
                         <pic:blipFill>
-                          <a:blip r:embed="rId9"/>
+                          <a:blip r:embed="rId13"/>
                           <a:stretch>
                             <a:fillRect/>
                           </a:stretch>
@@ -6297,7 +6838,7 @@
         </w:trPr>
         <w:tc>
           <w:tcPr>
-            <w:tcW w:w="3475" w:type="dxa"/>
+            <w:tcW w:w="3474" w:type="dxa"/>
             <w:tcBorders>
               <w:top w:val="single" w:sz="8" w:space="0" w:color="000000"/>
               <w:start w:val="single" w:sz="8" w:space="0" w:color="000000"/>
@@ -6326,7 +6867,7 @@
         </w:tc>
         <w:tc>
           <w:tcPr>
-            <w:tcW w:w="2825" w:type="dxa"/>
+            <w:tcW w:w="2826" w:type="dxa"/>
             <w:tcBorders>
               <w:top w:val="single" w:sz="8" w:space="0" w:color="000000"/>
               <w:start w:val="single" w:sz="8" w:space="0" w:color="000000"/>
@@ -6389,7 +6930,7 @@
                   <wp:extent cx="2033270" cy="1061720"/>
                   <wp:effectExtent l="0" t="0" r="0" b="0"/>
                   <wp:wrapSquare wrapText="largest"/>
-                  <wp:docPr id="9" name="Image9"/>
+                  <wp:docPr id="13" name="Image9"/>
                   <wp:cNvGraphicFramePr>
                     <a:graphicFrameLocks xmlns:a="http://schemas.openxmlformats.org/drawingml/2006/main" noChangeAspect="1"/>
                   </wp:cNvGraphicFramePr>
@@ -6397,13 +6938,13 @@
                     <a:graphicData uri="http://schemas.openxmlformats.org/drawingml/2006/picture">
                       <pic:pic xmlns:pic="http://schemas.openxmlformats.org/drawingml/2006/picture">
                         <pic:nvPicPr>
-                          <pic:cNvPr id="9" name="Image9"/>
+                          <pic:cNvPr id="13" name="Image9"/>
                           <pic:cNvPicPr>
                             <a:picLocks noChangeAspect="1" noChangeArrowheads="1"/>
                           </pic:cNvPicPr>
                         </pic:nvPicPr>
                         <pic:blipFill>
-                          <a:blip r:embed="rId10"/>
+                          <a:blip r:embed="rId14"/>
                           <a:stretch>
                             <a:fillRect/>
                           </a:stretch>
@@ -6459,7 +7000,7 @@
         <w:trPr/>
         <w:tc>
           <w:tcPr>
-            <w:tcW w:w="3475" w:type="dxa"/>
+            <w:tcW w:w="3474" w:type="dxa"/>
             <w:tcBorders>
               <w:top w:val="single" w:sz="8" w:space="0" w:color="000000"/>
               <w:start w:val="single" w:sz="8" w:space="0" w:color="000000"/>
@@ -6488,7 +7029,7 @@
         </w:tc>
         <w:tc>
           <w:tcPr>
-            <w:tcW w:w="2825" w:type="dxa"/>
+            <w:tcW w:w="2826" w:type="dxa"/>
             <w:tcBorders>
               <w:top w:val="single" w:sz="8" w:space="0" w:color="000000"/>
               <w:start w:val="single" w:sz="8" w:space="0" w:color="000000"/>
@@ -6551,7 +7092,7 @@
                   <wp:extent cx="2033270" cy="552450"/>
                   <wp:effectExtent l="0" t="0" r="0" b="0"/>
                   <wp:wrapSquare wrapText="largest"/>
-                  <wp:docPr id="10" name="Image8"/>
+                  <wp:docPr id="14" name="Image8"/>
                   <wp:cNvGraphicFramePr>
                     <a:graphicFrameLocks xmlns:a="http://schemas.openxmlformats.org/drawingml/2006/main" noChangeAspect="1"/>
                   </wp:cNvGraphicFramePr>
@@ -6559,13 +7100,13 @@
                     <a:graphicData uri="http://schemas.openxmlformats.org/drawingml/2006/picture">
                       <pic:pic xmlns:pic="http://schemas.openxmlformats.org/drawingml/2006/picture">
                         <pic:nvPicPr>
-                          <pic:cNvPr id="10" name="Image8"/>
+                          <pic:cNvPr id="14" name="Image8"/>
                           <pic:cNvPicPr>
                             <a:picLocks noChangeAspect="1" noChangeArrowheads="1"/>
                           </pic:cNvPicPr>
                         </pic:nvPicPr>
                         <pic:blipFill>
-                          <a:blip r:embed="rId11"/>
+                          <a:blip r:embed="rId15"/>
                           <a:stretch>
                             <a:fillRect/>
                           </a:stretch>
@@ -6622,7 +7163,7 @@
         <w:trPr/>
         <w:tc>
           <w:tcPr>
-            <w:tcW w:w="3475" w:type="dxa"/>
+            <w:tcW w:w="3474" w:type="dxa"/>
             <w:tcBorders>
               <w:top w:val="single" w:sz="8" w:space="0" w:color="000000"/>
               <w:start w:val="single" w:sz="8" w:space="0" w:color="000000"/>
@@ -6651,7 +7192,7 @@
         </w:tc>
         <w:tc>
           <w:tcPr>
-            <w:tcW w:w="2825" w:type="dxa"/>
+            <w:tcW w:w="2826" w:type="dxa"/>
             <w:tcBorders>
               <w:top w:val="single" w:sz="8" w:space="0" w:color="000000"/>
               <w:start w:val="single" w:sz="8" w:space="0" w:color="000000"/>
@@ -6712,7 +7253,7 @@
                   <wp:extent cx="2033270" cy="576580"/>
                   <wp:effectExtent l="0" t="0" r="0" b="0"/>
                   <wp:wrapSquare wrapText="largest"/>
-                  <wp:docPr id="11" name="Image1 Copy 1"/>
+                  <wp:docPr id="15" name="Image1 Copy 1"/>
                   <wp:cNvGraphicFramePr>
                     <a:graphicFrameLocks xmlns:a="http://schemas.openxmlformats.org/drawingml/2006/main" noChangeAspect="1"/>
                   </wp:cNvGraphicFramePr>
@@ -6720,13 +7261,13 @@
                     <a:graphicData uri="http://schemas.openxmlformats.org/drawingml/2006/picture">
                       <pic:pic xmlns:pic="http://schemas.openxmlformats.org/drawingml/2006/picture">
                         <pic:nvPicPr>
-                          <pic:cNvPr id="11" name="Image1 Copy 1"/>
+                          <pic:cNvPr id="15" name="Image1 Copy 1"/>
                           <pic:cNvPicPr>
                             <a:picLocks noChangeAspect="1" noChangeArrowheads="1"/>
                           </pic:cNvPicPr>
                         </pic:nvPicPr>
                         <pic:blipFill>
-                          <a:blip r:embed="rId12"/>
+                          <a:blip r:embed="rId16"/>
                           <a:stretch>
                             <a:fillRect/>
                           </a:stretch>
@@ -6789,35 +7330,35 @@
         <w:trPr/>
         <w:tc>
           <w:tcPr>
-            <w:tcW w:w="3475" w:type="dxa"/>
-            <w:tcBorders>
-              <w:top w:val="single" w:sz="8" w:space="0" w:color="000000"/>
-              <w:start w:val="single" w:sz="8" w:space="0" w:color="000000"/>
-              <w:bottom w:val="single" w:sz="8" w:space="0" w:color="000000"/>
-              <w:end w:val="single" w:sz="8" w:space="0" w:color="000000"/>
-            </w:tcBorders>
-          </w:tcPr>
-          <w:p>
-            <w:pPr>
-              <w:pStyle w:val="normal1"/>
-              <w:widowControl w:val="false"/>
-              <w:suppressAutoHyphens w:val="true"/>
-              <w:spacing w:lineRule="auto" w:line="240" w:before="0" w:after="0"/>
-              <w:jc w:val="start"/>
-              <w:rPr>
-                <w:rFonts w:ascii="Calibri" w:hAnsi="Calibri" w:eastAsia="Calibri" w:cs="Calibri"/>
-              </w:rPr>
-            </w:pPr>
-            <w:r>
-              <w:rPr>
-                <w:rFonts w:eastAsia="Calibri" w:cs="Calibri" w:ascii="Calibri" w:hAnsi="Calibri"/>
-              </w:rPr>
-            </w:r>
-          </w:p>
-        </w:tc>
-        <w:tc>
-          <w:tcPr>
-            <w:tcW w:w="2825" w:type="dxa"/>
+            <w:tcW w:w="3474" w:type="dxa"/>
+            <w:tcBorders>
+              <w:top w:val="single" w:sz="8" w:space="0" w:color="000000"/>
+              <w:start w:val="single" w:sz="8" w:space="0" w:color="000000"/>
+              <w:bottom w:val="single" w:sz="8" w:space="0" w:color="000000"/>
+              <w:end w:val="single" w:sz="8" w:space="0" w:color="000000"/>
+            </w:tcBorders>
+          </w:tcPr>
+          <w:p>
+            <w:pPr>
+              <w:pStyle w:val="normal1"/>
+              <w:widowControl w:val="false"/>
+              <w:suppressAutoHyphens w:val="true"/>
+              <w:spacing w:lineRule="auto" w:line="240" w:before="0" w:after="0"/>
+              <w:jc w:val="start"/>
+              <w:rPr>
+                <w:rFonts w:ascii="Calibri" w:hAnsi="Calibri" w:eastAsia="Calibri" w:cs="Calibri"/>
+              </w:rPr>
+            </w:pPr>
+            <w:r>
+              <w:rPr>
+                <w:rFonts w:eastAsia="Calibri" w:cs="Calibri" w:ascii="Calibri" w:hAnsi="Calibri"/>
+              </w:rPr>
+            </w:r>
+          </w:p>
+        </w:tc>
+        <w:tc>
+          <w:tcPr>
+            <w:tcW w:w="2826" w:type="dxa"/>
             <w:tcBorders>
               <w:top w:val="single" w:sz="8" w:space="0" w:color="000000"/>
               <w:start w:val="single" w:sz="8" w:space="0" w:color="000000"/>
@@ -6904,35 +7445,35 @@
         <w:trPr/>
         <w:tc>
           <w:tcPr>
-            <w:tcW w:w="3475" w:type="dxa"/>
-            <w:tcBorders>
-              <w:top w:val="single" w:sz="8" w:space="0" w:color="000000"/>
-              <w:start w:val="single" w:sz="8" w:space="0" w:color="000000"/>
-              <w:bottom w:val="single" w:sz="8" w:space="0" w:color="000000"/>
-              <w:end w:val="single" w:sz="8" w:space="0" w:color="000000"/>
-            </w:tcBorders>
-          </w:tcPr>
-          <w:p>
-            <w:pPr>
-              <w:pStyle w:val="normal1"/>
-              <w:widowControl w:val="false"/>
-              <w:suppressAutoHyphens w:val="true"/>
-              <w:spacing w:lineRule="auto" w:line="240" w:before="0" w:after="0"/>
-              <w:jc w:val="start"/>
-              <w:rPr>
-                <w:rFonts w:ascii="Calibri" w:hAnsi="Calibri" w:eastAsia="Calibri" w:cs="Calibri"/>
-              </w:rPr>
-            </w:pPr>
-            <w:r>
-              <w:rPr>
-                <w:rFonts w:eastAsia="Calibri" w:cs="Calibri" w:ascii="Calibri" w:hAnsi="Calibri"/>
-              </w:rPr>
-            </w:r>
-          </w:p>
-        </w:tc>
-        <w:tc>
-          <w:tcPr>
-            <w:tcW w:w="2825" w:type="dxa"/>
+            <w:tcW w:w="3474" w:type="dxa"/>
+            <w:tcBorders>
+              <w:top w:val="single" w:sz="8" w:space="0" w:color="000000"/>
+              <w:start w:val="single" w:sz="8" w:space="0" w:color="000000"/>
+              <w:bottom w:val="single" w:sz="8" w:space="0" w:color="000000"/>
+              <w:end w:val="single" w:sz="8" w:space="0" w:color="000000"/>
+            </w:tcBorders>
+          </w:tcPr>
+          <w:p>
+            <w:pPr>
+              <w:pStyle w:val="normal1"/>
+              <w:widowControl w:val="false"/>
+              <w:suppressAutoHyphens w:val="true"/>
+              <w:spacing w:lineRule="auto" w:line="240" w:before="0" w:after="0"/>
+              <w:jc w:val="start"/>
+              <w:rPr>
+                <w:rFonts w:ascii="Calibri" w:hAnsi="Calibri" w:eastAsia="Calibri" w:cs="Calibri"/>
+              </w:rPr>
+            </w:pPr>
+            <w:r>
+              <w:rPr>
+                <w:rFonts w:eastAsia="Calibri" w:cs="Calibri" w:ascii="Calibri" w:hAnsi="Calibri"/>
+              </w:rPr>
+            </w:r>
+          </w:p>
+        </w:tc>
+        <w:tc>
+          <w:tcPr>
+            <w:tcW w:w="2826" w:type="dxa"/>
             <w:tcBorders>
               <w:top w:val="single" w:sz="8" w:space="0" w:color="000000"/>
               <w:start w:val="single" w:sz="8" w:space="0" w:color="000000"/>
@@ -7943,7 +8484,7 @@
         </w:rPr>
         <w:tab/>
       </w:r>
-      <w:hyperlink r:id="rId13">
+      <w:hyperlink r:id="rId17">
         <w:r>
           <w:rPr>
             <w:rStyle w:val="Style3"/>
@@ -7989,8 +8530,8 @@
       </w:tblPr>
       <w:tblGrid>
         <w:gridCol w:w="4425"/>
-        <w:gridCol w:w="4945"/>
-        <w:gridCol w:w="545"/>
+        <w:gridCol w:w="4944"/>
+        <w:gridCol w:w="546"/>
       </w:tblGrid>
       <w:tr>
         <w:trPr/>
@@ -8033,7 +8574,7 @@
         </w:tc>
         <w:tc>
           <w:tcPr>
-            <w:tcW w:w="4945" w:type="dxa"/>
+            <w:tcW w:w="4944" w:type="dxa"/>
             <w:tcBorders>
               <w:top w:val="single" w:sz="8" w:space="0" w:color="000000"/>
               <w:start w:val="single" w:sz="8" w:space="0" w:color="000000"/>
@@ -8070,7 +8611,7 @@
         </w:tc>
         <w:tc>
           <w:tcPr>
-            <w:tcW w:w="545" w:type="dxa"/>
+            <w:tcW w:w="546" w:type="dxa"/>
             <w:tcBorders>
               <w:top w:val="single" w:sz="8" w:space="0" w:color="000000"/>
               <w:start w:val="single" w:sz="8" w:space="0" w:color="000000"/>
@@ -8142,7 +8683,7 @@
         </w:tc>
         <w:tc>
           <w:tcPr>
-            <w:tcW w:w="4945" w:type="dxa"/>
+            <w:tcW w:w="4944" w:type="dxa"/>
             <w:tcBorders>
               <w:top w:val="single" w:sz="8" w:space="0" w:color="000000"/>
               <w:start w:val="single" w:sz="8" w:space="0" w:color="000000"/>
@@ -8176,7 +8717,7 @@
         </w:tc>
         <w:tc>
           <w:tcPr>
-            <w:tcW w:w="545" w:type="dxa"/>
+            <w:tcW w:w="546" w:type="dxa"/>
             <w:tcBorders>
               <w:top w:val="single" w:sz="8" w:space="0" w:color="000000"/>
               <w:start w:val="single" w:sz="8" w:space="0" w:color="000000"/>
@@ -8243,7 +8784,7 @@
         </w:tc>
         <w:tc>
           <w:tcPr>
-            <w:tcW w:w="4945" w:type="dxa"/>
+            <w:tcW w:w="4944" w:type="dxa"/>
             <w:tcBorders>
               <w:top w:val="single" w:sz="8" w:space="0" w:color="000000"/>
               <w:start w:val="single" w:sz="8" w:space="0" w:color="000000"/>
@@ -8342,7 +8883,7 @@
         </w:tc>
         <w:tc>
           <w:tcPr>
-            <w:tcW w:w="545" w:type="dxa"/>
+            <w:tcW w:w="546" w:type="dxa"/>
             <w:tcBorders>
               <w:top w:val="single" w:sz="8" w:space="0" w:color="000000"/>
               <w:start w:val="single" w:sz="8" w:space="0" w:color="000000"/>
@@ -8409,7 +8950,7 @@
         </w:tc>
         <w:tc>
           <w:tcPr>
-            <w:tcW w:w="4945" w:type="dxa"/>
+            <w:tcW w:w="4944" w:type="dxa"/>
             <w:tcBorders>
               <w:top w:val="single" w:sz="8" w:space="0" w:color="000000"/>
               <w:start w:val="single" w:sz="8" w:space="0" w:color="000000"/>
@@ -8443,7 +8984,7 @@
         </w:tc>
         <w:tc>
           <w:tcPr>
-            <w:tcW w:w="545" w:type="dxa"/>
+            <w:tcW w:w="546" w:type="dxa"/>
             <w:tcBorders>
               <w:top w:val="single" w:sz="8" w:space="0" w:color="000000"/>
               <w:start w:val="single" w:sz="8" w:space="0" w:color="000000"/>
@@ -8510,7 +9051,7 @@
         </w:tc>
         <w:tc>
           <w:tcPr>
-            <w:tcW w:w="4945" w:type="dxa"/>
+            <w:tcW w:w="4944" w:type="dxa"/>
             <w:tcBorders>
               <w:top w:val="single" w:sz="8" w:space="0" w:color="000000"/>
               <w:start w:val="single" w:sz="8" w:space="0" w:color="000000"/>
@@ -8544,7 +9085,7 @@
         </w:tc>
         <w:tc>
           <w:tcPr>
-            <w:tcW w:w="545" w:type="dxa"/>
+            <w:tcW w:w="546" w:type="dxa"/>
             <w:tcBorders>
               <w:top w:val="single" w:sz="8" w:space="0" w:color="000000"/>
               <w:start w:val="single" w:sz="8" w:space="0" w:color="000000"/>
@@ -8614,7 +9155,7 @@
         </w:tc>
         <w:tc>
           <w:tcPr>
-            <w:tcW w:w="4945" w:type="dxa"/>
+            <w:tcW w:w="4944" w:type="dxa"/>
             <w:tcBorders>
               <w:top w:val="single" w:sz="8" w:space="0" w:color="000000"/>
               <w:start w:val="single" w:sz="8" w:space="0" w:color="000000"/>
@@ -8645,7 +9186,7 @@
         </w:tc>
         <w:tc>
           <w:tcPr>
-            <w:tcW w:w="545" w:type="dxa"/>
+            <w:tcW w:w="546" w:type="dxa"/>
             <w:tcBorders>
               <w:top w:val="single" w:sz="8" w:space="0" w:color="000000"/>
               <w:start w:val="single" w:sz="8" w:space="0" w:color="000000"/>
@@ -8713,7 +9254,7 @@
         </w:tc>
         <w:tc>
           <w:tcPr>
-            <w:tcW w:w="4945" w:type="dxa"/>
+            <w:tcW w:w="4944" w:type="dxa"/>
             <w:tcBorders>
               <w:top w:val="single" w:sz="8" w:space="0" w:color="000000"/>
               <w:start w:val="single" w:sz="8" w:space="0" w:color="000000"/>
@@ -8770,7 +9311,7 @@
         </w:tc>
         <w:tc>
           <w:tcPr>
-            <w:tcW w:w="545" w:type="dxa"/>
+            <w:tcW w:w="546" w:type="dxa"/>
             <w:tcBorders>
               <w:top w:val="single" w:sz="8" w:space="0" w:color="000000"/>
               <w:start w:val="single" w:sz="8" w:space="0" w:color="000000"/>
@@ -8837,7 +9378,7 @@
         </w:tc>
         <w:tc>
           <w:tcPr>
-            <w:tcW w:w="4945" w:type="dxa"/>
+            <w:tcW w:w="4944" w:type="dxa"/>
             <w:tcBorders>
               <w:top w:val="single" w:sz="8" w:space="0" w:color="000000"/>
               <w:start w:val="single" w:sz="8" w:space="0" w:color="000000"/>
@@ -8894,7 +9435,7 @@
         </w:tc>
         <w:tc>
           <w:tcPr>
-            <w:tcW w:w="545" w:type="dxa"/>
+            <w:tcW w:w="546" w:type="dxa"/>
             <w:tcBorders>
               <w:top w:val="single" w:sz="8" w:space="0" w:color="000000"/>
               <w:start w:val="single" w:sz="8" w:space="0" w:color="000000"/>
@@ -8964,7 +9505,7 @@
         </w:tc>
         <w:tc>
           <w:tcPr>
-            <w:tcW w:w="4945" w:type="dxa"/>
+            <w:tcW w:w="4944" w:type="dxa"/>
             <w:tcBorders>
               <w:top w:val="single" w:sz="8" w:space="0" w:color="000000"/>
               <w:start w:val="single" w:sz="8" w:space="0" w:color="000000"/>
@@ -8995,7 +9536,7 @@
         </w:tc>
         <w:tc>
           <w:tcPr>
-            <w:tcW w:w="545" w:type="dxa"/>
+            <w:tcW w:w="546" w:type="dxa"/>
             <w:tcBorders>
               <w:top w:val="single" w:sz="8" w:space="0" w:color="000000"/>
               <w:start w:val="single" w:sz="8" w:space="0" w:color="000000"/>
@@ -9063,7 +9604,7 @@
         </w:tc>
         <w:tc>
           <w:tcPr>
-            <w:tcW w:w="4945" w:type="dxa"/>
+            <w:tcW w:w="4944" w:type="dxa"/>
             <w:tcBorders>
               <w:top w:val="single" w:sz="8" w:space="0" w:color="000000"/>
               <w:start w:val="single" w:sz="8" w:space="0" w:color="000000"/>
@@ -9097,7 +9638,7 @@
         </w:tc>
         <w:tc>
           <w:tcPr>
-            <w:tcW w:w="545" w:type="dxa"/>
+            <w:tcW w:w="546" w:type="dxa"/>
             <w:tcBorders>
               <w:top w:val="single" w:sz="8" w:space="0" w:color="000000"/>
               <w:start w:val="single" w:sz="8" w:space="0" w:color="000000"/>
@@ -9167,7 +9708,7 @@
         </w:tc>
         <w:tc>
           <w:tcPr>
-            <w:tcW w:w="4945" w:type="dxa"/>
+            <w:tcW w:w="4944" w:type="dxa"/>
             <w:tcBorders>
               <w:top w:val="single" w:sz="8" w:space="0" w:color="000000"/>
               <w:start w:val="single" w:sz="8" w:space="0" w:color="000000"/>
@@ -9201,7 +9742,7 @@
         </w:tc>
         <w:tc>
           <w:tcPr>
-            <w:tcW w:w="545" w:type="dxa"/>
+            <w:tcW w:w="546" w:type="dxa"/>
             <w:tcBorders>
               <w:top w:val="single" w:sz="8" w:space="0" w:color="000000"/>
               <w:start w:val="single" w:sz="8" w:space="0" w:color="000000"/>
@@ -9269,7 +9810,7 @@
         </w:tc>
         <w:tc>
           <w:tcPr>
-            <w:tcW w:w="4945" w:type="dxa"/>
+            <w:tcW w:w="4944" w:type="dxa"/>
             <w:tcBorders>
               <w:top w:val="single" w:sz="8" w:space="0" w:color="000000"/>
               <w:start w:val="single" w:sz="8" w:space="0" w:color="000000"/>
@@ -9303,7 +9844,7 @@
         </w:tc>
         <w:tc>
           <w:tcPr>
-            <w:tcW w:w="545" w:type="dxa"/>
+            <w:tcW w:w="546" w:type="dxa"/>
             <w:tcBorders>
               <w:top w:val="single" w:sz="8" w:space="0" w:color="000000"/>
               <w:start w:val="single" w:sz="8" w:space="0" w:color="000000"/>
@@ -9437,7 +9978,7 @@
         </w:rPr>
         <w:tab/>
       </w:r>
-      <w:hyperlink r:id="rId14">
+      <w:hyperlink r:id="rId18">
         <w:r>
           <w:rPr>
             <w:rStyle w:val="Style3"/>
@@ -9489,15 +10030,15 @@
         <w:tblLook w:val="0600" w:firstRow="0" w:noVBand="1" w:lastRow="0" w:firstColumn="0" w:lastColumn="0" w:noHBand="1"/>
       </w:tblPr>
       <w:tblGrid>
-        <w:gridCol w:w="4495"/>
+        <w:gridCol w:w="4494"/>
         <w:gridCol w:w="4965"/>
-        <w:gridCol w:w="560"/>
+        <w:gridCol w:w="561"/>
       </w:tblGrid>
       <w:tr>
         <w:trPr/>
         <w:tc>
           <w:tcPr>
-            <w:tcW w:w="4495" w:type="dxa"/>
+            <w:tcW w:w="4494" w:type="dxa"/>
             <w:tcBorders>
               <w:top w:val="single" w:sz="8" w:space="0" w:color="000000"/>
               <w:start w:val="single" w:sz="8" w:space="0" w:color="000000"/>
@@ -9571,7 +10112,7 @@
         </w:tc>
         <w:tc>
           <w:tcPr>
-            <w:tcW w:w="560" w:type="dxa"/>
+            <w:tcW w:w="561" w:type="dxa"/>
             <w:tcBorders>
               <w:top w:val="single" w:sz="8" w:space="0" w:color="000000"/>
               <w:start w:val="single" w:sz="8" w:space="0" w:color="000000"/>
@@ -9605,7 +10146,7 @@
         <w:trPr/>
         <w:tc>
           <w:tcPr>
-            <w:tcW w:w="4495" w:type="dxa"/>
+            <w:tcW w:w="4494" w:type="dxa"/>
             <w:tcBorders>
               <w:top w:val="single" w:sz="8" w:space="0" w:color="000000"/>
               <w:start w:val="single" w:sz="8" w:space="0" w:color="000000"/>
@@ -9673,7 +10214,7 @@
         </w:tc>
         <w:tc>
           <w:tcPr>
-            <w:tcW w:w="560" w:type="dxa"/>
+            <w:tcW w:w="561" w:type="dxa"/>
             <w:tcBorders>
               <w:top w:val="single" w:sz="8" w:space="0" w:color="000000"/>
               <w:start w:val="single" w:sz="8" w:space="0" w:color="000000"/>
@@ -9706,7 +10247,7 @@
         <w:trPr/>
         <w:tc>
           <w:tcPr>
-            <w:tcW w:w="4495" w:type="dxa"/>
+            <w:tcW w:w="4494" w:type="dxa"/>
             <w:tcBorders>
               <w:top w:val="single" w:sz="8" w:space="0" w:color="000000"/>
               <w:start w:val="single" w:sz="8" w:space="0" w:color="000000"/>
@@ -9774,7 +10315,7 @@
         </w:tc>
         <w:tc>
           <w:tcPr>
-            <w:tcW w:w="560" w:type="dxa"/>
+            <w:tcW w:w="561" w:type="dxa"/>
             <w:tcBorders>
               <w:top w:val="single" w:sz="8" w:space="0" w:color="000000"/>
               <w:start w:val="single" w:sz="8" w:space="0" w:color="000000"/>
@@ -9807,7 +10348,7 @@
         <w:trPr/>
         <w:tc>
           <w:tcPr>
-            <w:tcW w:w="4495" w:type="dxa"/>
+            <w:tcW w:w="4494" w:type="dxa"/>
             <w:tcBorders>
               <w:top w:val="single" w:sz="8" w:space="0" w:color="000000"/>
               <w:start w:val="single" w:sz="8" w:space="0" w:color="000000"/>
@@ -9875,7 +10416,7 @@
         </w:tc>
         <w:tc>
           <w:tcPr>
-            <w:tcW w:w="560" w:type="dxa"/>
+            <w:tcW w:w="561" w:type="dxa"/>
             <w:tcBorders>
               <w:top w:val="single" w:sz="8" w:space="0" w:color="000000"/>
               <w:start w:val="single" w:sz="8" w:space="0" w:color="000000"/>
@@ -9908,7 +10449,7 @@
         <w:trPr/>
         <w:tc>
           <w:tcPr>
-            <w:tcW w:w="4495" w:type="dxa"/>
+            <w:tcW w:w="4494" w:type="dxa"/>
             <w:tcBorders>
               <w:top w:val="single" w:sz="8" w:space="0" w:color="000000"/>
               <w:start w:val="single" w:sz="8" w:space="0" w:color="000000"/>
@@ -9976,7 +10517,7 @@
         </w:tc>
         <w:tc>
           <w:tcPr>
-            <w:tcW w:w="560" w:type="dxa"/>
+            <w:tcW w:w="561" w:type="dxa"/>
             <w:tcBorders>
               <w:top w:val="single" w:sz="8" w:space="0" w:color="000000"/>
               <w:start w:val="single" w:sz="8" w:space="0" w:color="000000"/>
@@ -10009,7 +10550,7 @@
         <w:trPr/>
         <w:tc>
           <w:tcPr>
-            <w:tcW w:w="4495" w:type="dxa"/>
+            <w:tcW w:w="4494" w:type="dxa"/>
             <w:tcBorders>
               <w:top w:val="single" w:sz="8" w:space="0" w:color="000000"/>
               <w:start w:val="single" w:sz="8" w:space="0" w:color="000000"/>
@@ -10077,7 +10618,7 @@
         </w:tc>
         <w:tc>
           <w:tcPr>
-            <w:tcW w:w="560" w:type="dxa"/>
+            <w:tcW w:w="561" w:type="dxa"/>
             <w:tcBorders>
               <w:top w:val="single" w:sz="8" w:space="0" w:color="000000"/>
               <w:start w:val="single" w:sz="8" w:space="0" w:color="000000"/>
@@ -10111,7 +10652,7 @@
         <w:trPr/>
         <w:tc>
           <w:tcPr>
-            <w:tcW w:w="4495" w:type="dxa"/>
+            <w:tcW w:w="4494" w:type="dxa"/>
             <w:tcBorders>
               <w:top w:val="single" w:sz="8" w:space="0" w:color="000000"/>
               <w:start w:val="single" w:sz="8" w:space="0" w:color="000000"/>
@@ -10179,7 +10720,7 @@
         </w:tc>
         <w:tc>
           <w:tcPr>
-            <w:tcW w:w="560" w:type="dxa"/>
+            <w:tcW w:w="561" w:type="dxa"/>
             <w:tcBorders>
               <w:top w:val="single" w:sz="8" w:space="0" w:color="000000"/>
               <w:start w:val="single" w:sz="8" w:space="0" w:color="000000"/>
@@ -10212,7 +10753,7 @@
         <w:trPr/>
         <w:tc>
           <w:tcPr>
-            <w:tcW w:w="4495" w:type="dxa"/>
+            <w:tcW w:w="4494" w:type="dxa"/>
             <w:tcBorders>
               <w:top w:val="single" w:sz="8" w:space="0" w:color="000000"/>
               <w:start w:val="single" w:sz="8" w:space="0" w:color="000000"/>
@@ -10280,7 +10821,7 @@
         </w:tc>
         <w:tc>
           <w:tcPr>
-            <w:tcW w:w="560" w:type="dxa"/>
+            <w:tcW w:w="561" w:type="dxa"/>
             <w:tcBorders>
               <w:top w:val="single" w:sz="8" w:space="0" w:color="000000"/>
               <w:start w:val="single" w:sz="8" w:space="0" w:color="000000"/>
@@ -10313,7 +10854,7 @@
         <w:trPr/>
         <w:tc>
           <w:tcPr>
-            <w:tcW w:w="4495" w:type="dxa"/>
+            <w:tcW w:w="4494" w:type="dxa"/>
             <w:tcBorders>
               <w:top w:val="single" w:sz="8" w:space="0" w:color="000000"/>
               <w:start w:val="single" w:sz="8" w:space="0" w:color="000000"/>
@@ -10383,7 +10924,7 @@
         </w:tc>
         <w:tc>
           <w:tcPr>
-            <w:tcW w:w="560" w:type="dxa"/>
+            <w:tcW w:w="561" w:type="dxa"/>
             <w:tcBorders>
               <w:top w:val="single" w:sz="8" w:space="0" w:color="000000"/>
               <w:start w:val="single" w:sz="8" w:space="0" w:color="000000"/>
@@ -10417,7 +10958,7 @@
         <w:trPr/>
         <w:tc>
           <w:tcPr>
-            <w:tcW w:w="4495" w:type="dxa"/>
+            <w:tcW w:w="4494" w:type="dxa"/>
             <w:tcBorders>
               <w:top w:val="single" w:sz="8" w:space="0" w:color="000000"/>
               <w:start w:val="single" w:sz="8" w:space="0" w:color="000000"/>
@@ -10485,7 +11026,7 @@
         </w:tc>
         <w:tc>
           <w:tcPr>
-            <w:tcW w:w="560" w:type="dxa"/>
+            <w:tcW w:w="561" w:type="dxa"/>
             <w:tcBorders>
               <w:top w:val="single" w:sz="8" w:space="0" w:color="000000"/>
               <w:start w:val="single" w:sz="8" w:space="0" w:color="000000"/>
@@ -10523,7 +11064,7 @@
         <w:trPr/>
         <w:tc>
           <w:tcPr>
-            <w:tcW w:w="4495" w:type="dxa"/>
+            <w:tcW w:w="4494" w:type="dxa"/>
             <w:tcBorders>
               <w:top w:val="single" w:sz="8" w:space="0" w:color="000000"/>
               <w:start w:val="single" w:sz="8" w:space="0" w:color="000000"/>
@@ -10591,7 +11132,7 @@
         </w:tc>
         <w:tc>
           <w:tcPr>
-            <w:tcW w:w="560" w:type="dxa"/>
+            <w:tcW w:w="561" w:type="dxa"/>
             <w:tcBorders>
               <w:top w:val="single" w:sz="8" w:space="0" w:color="000000"/>
               <w:start w:val="single" w:sz="8" w:space="0" w:color="000000"/>
@@ -10740,7 +11281,7 @@
         </w:rPr>
         <w:tab/>
       </w:r>
-      <w:hyperlink r:id="rId15">
+      <w:hyperlink r:id="rId19">
         <w:r>
           <w:rPr>
             <w:rStyle w:val="Style3"/>
@@ -10792,15 +11333,15 @@
         <w:tblLook w:val="0600" w:firstRow="0" w:noVBand="1" w:lastRow="0" w:firstColumn="0" w:lastColumn="0" w:noHBand="1"/>
       </w:tblPr>
       <w:tblGrid>
-        <w:gridCol w:w="4495"/>
-        <w:gridCol w:w="5045"/>
+        <w:gridCol w:w="4494"/>
+        <w:gridCol w:w="5046"/>
         <w:gridCol w:w="480"/>
       </w:tblGrid>
       <w:tr>
         <w:trPr/>
         <w:tc>
           <w:tcPr>
-            <w:tcW w:w="4495" w:type="dxa"/>
+            <w:tcW w:w="4494" w:type="dxa"/>
             <w:tcBorders>
               <w:top w:val="single" w:sz="8" w:space="0" w:color="000000"/>
               <w:start w:val="single" w:sz="8" w:space="0" w:color="000000"/>
@@ -10837,7 +11378,7 @@
         </w:tc>
         <w:tc>
           <w:tcPr>
-            <w:tcW w:w="5045" w:type="dxa"/>
+            <w:tcW w:w="5046" w:type="dxa"/>
             <w:tcBorders>
               <w:top w:val="single" w:sz="8" w:space="0" w:color="000000"/>
               <w:start w:val="single" w:sz="8" w:space="0" w:color="000000"/>
@@ -10908,7 +11449,7 @@
         <w:trPr/>
         <w:tc>
           <w:tcPr>
-            <w:tcW w:w="4495" w:type="dxa"/>
+            <w:tcW w:w="4494" w:type="dxa"/>
             <w:tcBorders>
               <w:top w:val="single" w:sz="8" w:space="0" w:color="000000"/>
               <w:start w:val="single" w:sz="8" w:space="0" w:color="000000"/>
@@ -10942,7 +11483,7 @@
         </w:tc>
         <w:tc>
           <w:tcPr>
-            <w:tcW w:w="5045" w:type="dxa"/>
+            <w:tcW w:w="5046" w:type="dxa"/>
             <w:tcBorders>
               <w:top w:val="single" w:sz="8" w:space="0" w:color="000000"/>
               <w:start w:val="single" w:sz="8" w:space="0" w:color="000000"/>
@@ -11009,7 +11550,7 @@
         <w:trPr/>
         <w:tc>
           <w:tcPr>
-            <w:tcW w:w="4495" w:type="dxa"/>
+            <w:tcW w:w="4494" w:type="dxa"/>
             <w:tcBorders>
               <w:top w:val="single" w:sz="8" w:space="0" w:color="000000"/>
               <w:start w:val="single" w:sz="8" w:space="0" w:color="000000"/>
@@ -11043,7 +11584,7 @@
         </w:tc>
         <w:tc>
           <w:tcPr>
-            <w:tcW w:w="5045" w:type="dxa"/>
+            <w:tcW w:w="5046" w:type="dxa"/>
             <w:tcBorders>
               <w:top w:val="single" w:sz="8" w:space="0" w:color="000000"/>
               <w:start w:val="single" w:sz="8" w:space="0" w:color="000000"/>
@@ -11186,7 +11727,7 @@
         <w:trPr/>
         <w:tc>
           <w:tcPr>
-            <w:tcW w:w="4495" w:type="dxa"/>
+            <w:tcW w:w="4494" w:type="dxa"/>
             <w:tcBorders>
               <w:top w:val="single" w:sz="8" w:space="0" w:color="000000"/>
               <w:start w:val="single" w:sz="8" w:space="0" w:color="000000"/>
@@ -11220,7 +11761,7 @@
         </w:tc>
         <w:tc>
           <w:tcPr>
-            <w:tcW w:w="5045" w:type="dxa"/>
+            <w:tcW w:w="5046" w:type="dxa"/>
             <w:tcBorders>
               <w:top w:val="single" w:sz="8" w:space="0" w:color="000000"/>
               <w:start w:val="single" w:sz="8" w:space="0" w:color="000000"/>
@@ -11287,7 +11828,7 @@
         <w:trPr/>
         <w:tc>
           <w:tcPr>
-            <w:tcW w:w="4495" w:type="dxa"/>
+            <w:tcW w:w="4494" w:type="dxa"/>
             <w:tcBorders>
               <w:top w:val="single" w:sz="8" w:space="0" w:color="000000"/>
               <w:start w:val="single" w:sz="8" w:space="0" w:color="000000"/>
@@ -11321,7 +11862,7 @@
         </w:tc>
         <w:tc>
           <w:tcPr>
-            <w:tcW w:w="5045" w:type="dxa"/>
+            <w:tcW w:w="5046" w:type="dxa"/>
             <w:tcBorders>
               <w:top w:val="single" w:sz="8" w:space="0" w:color="000000"/>
               <w:start w:val="single" w:sz="8" w:space="0" w:color="000000"/>
@@ -11388,7 +11929,7 @@
         <w:trPr/>
         <w:tc>
           <w:tcPr>
-            <w:tcW w:w="4495" w:type="dxa"/>
+            <w:tcW w:w="4494" w:type="dxa"/>
             <w:tcBorders>
               <w:top w:val="single" w:sz="8" w:space="0" w:color="000000"/>
               <w:start w:val="single" w:sz="8" w:space="0" w:color="000000"/>
@@ -11425,7 +11966,7 @@
         </w:tc>
         <w:tc>
           <w:tcPr>
-            <w:tcW w:w="5045" w:type="dxa"/>
+            <w:tcW w:w="5046" w:type="dxa"/>
             <w:tcBorders>
               <w:top w:val="single" w:sz="8" w:space="0" w:color="000000"/>
               <w:start w:val="single" w:sz="8" w:space="0" w:color="000000"/>
@@ -11490,7 +12031,7 @@
         <w:trPr/>
         <w:tc>
           <w:tcPr>
-            <w:tcW w:w="4495" w:type="dxa"/>
+            <w:tcW w:w="4494" w:type="dxa"/>
             <w:tcBorders>
               <w:top w:val="single" w:sz="8" w:space="0" w:color="000000"/>
               <w:start w:val="single" w:sz="8" w:space="0" w:color="000000"/>
@@ -11524,7 +12065,7 @@
         </w:tc>
         <w:tc>
           <w:tcPr>
-            <w:tcW w:w="5045" w:type="dxa"/>
+            <w:tcW w:w="5046" w:type="dxa"/>
             <w:tcBorders>
               <w:top w:val="single" w:sz="8" w:space="0" w:color="000000"/>
               <w:start w:val="single" w:sz="8" w:space="0" w:color="000000"/>
@@ -11591,7 +12132,7 @@
         <w:trPr/>
         <w:tc>
           <w:tcPr>
-            <w:tcW w:w="4495" w:type="dxa"/>
+            <w:tcW w:w="4494" w:type="dxa"/>
             <w:tcBorders>
               <w:top w:val="single" w:sz="8" w:space="0" w:color="000000"/>
               <w:start w:val="single" w:sz="8" w:space="0" w:color="000000"/>
@@ -11627,7 +12168,7 @@
         </w:tc>
         <w:tc>
           <w:tcPr>
-            <w:tcW w:w="5045" w:type="dxa"/>
+            <w:tcW w:w="5046" w:type="dxa"/>
             <w:tcBorders>
               <w:top w:val="single" w:sz="8" w:space="0" w:color="000000"/>
               <w:start w:val="single" w:sz="8" w:space="0" w:color="000000"/>
@@ -11694,7 +12235,7 @@
         <w:trPr/>
         <w:tc>
           <w:tcPr>
-            <w:tcW w:w="4495" w:type="dxa"/>
+            <w:tcW w:w="4494" w:type="dxa"/>
             <w:tcBorders>
               <w:top w:val="single" w:sz="8" w:space="0" w:color="000000"/>
               <w:start w:val="single" w:sz="8" w:space="0" w:color="000000"/>
@@ -11728,7 +12269,7 @@
         </w:tc>
         <w:tc>
           <w:tcPr>
-            <w:tcW w:w="5045" w:type="dxa"/>
+            <w:tcW w:w="5046" w:type="dxa"/>
             <w:tcBorders>
               <w:top w:val="single" w:sz="8" w:space="0" w:color="000000"/>
               <w:start w:val="single" w:sz="8" w:space="0" w:color="000000"/>
@@ -11795,7 +12336,7 @@
         <w:trPr/>
         <w:tc>
           <w:tcPr>
-            <w:tcW w:w="4495" w:type="dxa"/>
+            <w:tcW w:w="4494" w:type="dxa"/>
             <w:tcBorders>
               <w:top w:val="single" w:sz="8" w:space="0" w:color="000000"/>
               <w:start w:val="single" w:sz="8" w:space="0" w:color="000000"/>
@@ -11832,7 +12373,7 @@
         </w:tc>
         <w:tc>
           <w:tcPr>
-            <w:tcW w:w="5045" w:type="dxa"/>
+            <w:tcW w:w="5046" w:type="dxa"/>
             <w:tcBorders>
               <w:top w:val="single" w:sz="8" w:space="0" w:color="000000"/>
               <w:start w:val="single" w:sz="8" w:space="0" w:color="000000"/>
@@ -11897,7 +12438,7 @@
         <w:trPr/>
         <w:tc>
           <w:tcPr>
-            <w:tcW w:w="4495" w:type="dxa"/>
+            <w:tcW w:w="4494" w:type="dxa"/>
             <w:tcBorders>
               <w:top w:val="single" w:sz="8" w:space="0" w:color="000000"/>
               <w:start w:val="single" w:sz="8" w:space="0" w:color="000000"/>
@@ -11931,7 +12472,7 @@
         </w:tc>
         <w:tc>
           <w:tcPr>
-            <w:tcW w:w="5045" w:type="dxa"/>
+            <w:tcW w:w="5046" w:type="dxa"/>
             <w:tcBorders>
               <w:top w:val="single" w:sz="8" w:space="0" w:color="000000"/>
               <w:start w:val="single" w:sz="8" w:space="0" w:color="000000"/>
@@ -11999,7 +12540,7 @@
         <w:trPr/>
         <w:tc>
           <w:tcPr>
-            <w:tcW w:w="4495" w:type="dxa"/>
+            <w:tcW w:w="4494" w:type="dxa"/>
             <w:tcBorders>
               <w:top w:val="single" w:sz="8" w:space="0" w:color="000000"/>
               <w:start w:val="single" w:sz="8" w:space="0" w:color="000000"/>
@@ -12033,7 +12574,7 @@
         </w:tc>
         <w:tc>
           <w:tcPr>
-            <w:tcW w:w="5045" w:type="dxa"/>
+            <w:tcW w:w="5046" w:type="dxa"/>
             <w:tcBorders>
               <w:top w:val="single" w:sz="8" w:space="0" w:color="000000"/>
               <w:start w:val="single" w:sz="8" w:space="0" w:color="000000"/>
@@ -12101,7 +12642,7 @@
         <w:trPr/>
         <w:tc>
           <w:tcPr>
-            <w:tcW w:w="4495" w:type="dxa"/>
+            <w:tcW w:w="4494" w:type="dxa"/>
             <w:tcBorders>
               <w:top w:val="single" w:sz="8" w:space="0" w:color="000000"/>
               <w:start w:val="single" w:sz="8" w:space="0" w:color="000000"/>
@@ -12135,7 +12676,7 @@
         </w:tc>
         <w:tc>
           <w:tcPr>
-            <w:tcW w:w="5045" w:type="dxa"/>
+            <w:tcW w:w="5046" w:type="dxa"/>
             <w:tcBorders>
               <w:top w:val="single" w:sz="8" w:space="0" w:color="000000"/>
               <w:start w:val="single" w:sz="8" w:space="0" w:color="000000"/>
@@ -12225,12 +12766,12 @@
       </w:r>
     </w:p>
     <w:sectPr>
-      <w:headerReference w:type="even" r:id="rId16"/>
-      <w:headerReference w:type="default" r:id="rId17"/>
-      <w:headerReference w:type="first" r:id="rId18"/>
-      <w:footerReference w:type="even" r:id="rId19"/>
-      <w:footerReference w:type="default" r:id="rId20"/>
-      <w:footerReference w:type="first" r:id="rId21"/>
+      <w:headerReference w:type="even" r:id="rId20"/>
+      <w:headerReference w:type="default" r:id="rId21"/>
+      <w:headerReference w:type="first" r:id="rId22"/>
+      <w:footerReference w:type="even" r:id="rId23"/>
+      <w:footerReference w:type="default" r:id="rId24"/>
+      <w:footerReference w:type="first" r:id="rId25"/>
       <w:type w:val="nextPage"/>
       <w:pgSz w:w="11906" w:h="16838"/>
       <w:pgMar w:left="720" w:right="720" w:gutter="0" w:header="720" w:top="777" w:footer="720" w:bottom="777"/>
@@ -12271,7 +12812,7 @@
         <wp:inline distT="0" distB="0" distL="0" distR="0">
           <wp:extent cx="877570" cy="307340"/>
           <wp:effectExtent l="0" t="0" r="0" b="0"/>
-          <wp:docPr id="16" name="image2.png"/>
+          <wp:docPr id="20" name="image2.png"/>
           <wp:cNvGraphicFramePr>
             <a:graphicFrameLocks xmlns:a="http://schemas.openxmlformats.org/drawingml/2006/main" noChangeAspect="1"/>
           </wp:cNvGraphicFramePr>
@@ -12279,7 +12820,7 @@
             <a:graphicData uri="http://schemas.openxmlformats.org/drawingml/2006/picture">
               <pic:pic xmlns:pic="http://schemas.openxmlformats.org/drawingml/2006/picture">
                 <pic:nvPicPr>
-                  <pic:cNvPr id="16" name="image2.png"/>
+                  <pic:cNvPr id="20" name="image2.png"/>
                   <pic:cNvPicPr>
                     <a:picLocks noChangeAspect="1" noChangeArrowheads="1"/>
                   </pic:cNvPicPr>
@@ -12379,7 +12920,7 @@
         <wp:inline distT="0" distB="0" distL="0" distR="0">
           <wp:extent cx="877570" cy="307340"/>
           <wp:effectExtent l="0" t="0" r="0" b="0"/>
-          <wp:docPr id="17" name="image2.png"/>
+          <wp:docPr id="21" name="image2.png"/>
           <wp:cNvGraphicFramePr>
             <a:graphicFrameLocks xmlns:a="http://schemas.openxmlformats.org/drawingml/2006/main" noChangeAspect="1"/>
           </wp:cNvGraphicFramePr>
@@ -12387,7 +12928,7 @@
             <a:graphicData uri="http://schemas.openxmlformats.org/drawingml/2006/picture">
               <pic:pic xmlns:pic="http://schemas.openxmlformats.org/drawingml/2006/picture">
                 <pic:nvPicPr>
-                  <pic:cNvPr id="17" name="image2.png"/>
+                  <pic:cNvPr id="21" name="image2.png"/>
                   <pic:cNvPicPr>
                     <a:picLocks noChangeAspect="1" noChangeArrowheads="1"/>
                   </pic:cNvPicPr>
@@ -12500,7 +13041,7 @@
         <wp:inline distT="0" distB="0" distL="0" distR="0">
           <wp:extent cx="1190625" cy="190500"/>
           <wp:effectExtent l="0" t="0" r="0" b="0"/>
-          <wp:docPr id="12" name="image1.png"/>
+          <wp:docPr id="16" name="image1.png"/>
           <wp:cNvGraphicFramePr>
             <a:graphicFrameLocks xmlns:a="http://schemas.openxmlformats.org/drawingml/2006/main" noChangeAspect="1"/>
           </wp:cNvGraphicFramePr>
@@ -12508,7 +13049,7 @@
             <a:graphicData uri="http://schemas.openxmlformats.org/drawingml/2006/picture">
               <pic:pic xmlns:pic="http://schemas.openxmlformats.org/drawingml/2006/picture">
                 <pic:nvPicPr>
-                  <pic:cNvPr id="12" name="image1.png"/>
+                  <pic:cNvPr id="16" name="image1.png"/>
                   <pic:cNvPicPr>
                     <a:picLocks noChangeAspect="1" noChangeArrowheads="1"/>
                   </pic:cNvPicPr>
@@ -12547,7 +13088,7 @@
           <wp:extent cx="595630" cy="622935"/>
           <wp:effectExtent l="0" t="0" r="0" b="0"/>
           <wp:wrapNone/>
-          <wp:docPr id="13" name="image4.png"/>
+          <wp:docPr id="17" name="image4.png"/>
           <wp:cNvGraphicFramePr>
             <a:graphicFrameLocks xmlns:a="http://schemas.openxmlformats.org/drawingml/2006/main" noChangeAspect="1"/>
           </wp:cNvGraphicFramePr>
@@ -12555,14 +13096,14 @@
             <a:graphicData uri="http://schemas.openxmlformats.org/drawingml/2006/picture">
               <pic:pic xmlns:pic="http://schemas.openxmlformats.org/drawingml/2006/picture">
                 <pic:nvPicPr>
-                  <pic:cNvPr id="13" name="image4.png"/>
+                  <pic:cNvPr id="17" name="image4.png"/>
                   <pic:cNvPicPr>
                     <a:picLocks noChangeAspect="1" noChangeArrowheads="1"/>
                   </pic:cNvPicPr>
                 </pic:nvPicPr>
                 <pic:blipFill>
                   <a:blip r:embed="rId2"/>
-                  <a:srcRect l="0" t="0" r="60809" b="0"/>
+                  <a:srcRect l="0" t="0" r="60816" b="0"/>
                   <a:stretch>
                     <a:fillRect/>
                   </a:stretch>
@@ -12609,7 +13150,7 @@
         <wp:inline distT="0" distB="0" distL="0" distR="0">
           <wp:extent cx="1190625" cy="190500"/>
           <wp:effectExtent l="0" t="0" r="0" b="0"/>
-          <wp:docPr id="14" name="image1.png"/>
+          <wp:docPr id="18" name="image1.png"/>
           <wp:cNvGraphicFramePr>
             <a:graphicFrameLocks xmlns:a="http://schemas.openxmlformats.org/drawingml/2006/main" noChangeAspect="1"/>
           </wp:cNvGraphicFramePr>
@@ -12617,7 +13158,7 @@
             <a:graphicData uri="http://schemas.openxmlformats.org/drawingml/2006/picture">
               <pic:pic xmlns:pic="http://schemas.openxmlformats.org/drawingml/2006/picture">
                 <pic:nvPicPr>
-                  <pic:cNvPr id="14" name="image1.png"/>
+                  <pic:cNvPr id="18" name="image1.png"/>
                   <pic:cNvPicPr>
                     <a:picLocks noChangeAspect="1" noChangeArrowheads="1"/>
                   </pic:cNvPicPr>
@@ -12656,7 +13197,7 @@
           <wp:extent cx="595630" cy="622935"/>
           <wp:effectExtent l="0" t="0" r="0" b="0"/>
           <wp:wrapNone/>
-          <wp:docPr id="15" name="image4.png"/>
+          <wp:docPr id="19" name="image4.png"/>
           <wp:cNvGraphicFramePr>
             <a:graphicFrameLocks xmlns:a="http://schemas.openxmlformats.org/drawingml/2006/main" noChangeAspect="1"/>
           </wp:cNvGraphicFramePr>
@@ -12664,14 +13205,14 @@
             <a:graphicData uri="http://schemas.openxmlformats.org/drawingml/2006/picture">
               <pic:pic xmlns:pic="http://schemas.openxmlformats.org/drawingml/2006/picture">
                 <pic:nvPicPr>
-                  <pic:cNvPr id="15" name="image4.png"/>
+                  <pic:cNvPr id="19" name="image4.png"/>
                   <pic:cNvPicPr>
                     <a:picLocks noChangeAspect="1" noChangeArrowheads="1"/>
                   </pic:cNvPicPr>
                 </pic:nvPicPr>
                 <pic:blipFill>
                   <a:blip r:embed="rId2"/>
-                  <a:srcRect l="0" t="0" r="60809" b="0"/>
+                  <a:srcRect l="0" t="0" r="60816" b="0"/>
                   <a:stretch>
                     <a:fillRect/>
                   </a:stretch>

</xml_diff>

<commit_message>
Fix the request.form issuse for login. Now fix it that it get the data from the base and that "cursor.execute" things isn't work pls help shbie4abjkgr. ASlo fix the game form thing, i not piut stuff in tot he database.
</commit_message>
<xml_diff>
--- a/L3 Web Application Development Log.docx
+++ b/L3 Web Application Development Log.docx
@@ -361,107 +361,7 @@
                 <w:szCs w:val="22"/>
                 <w:lang w:val="en-US" w:eastAsia="zh-CN" w:bidi="hi-IN"/>
               </w:rPr>
-              <w:t xml:space="preserve">In this project or website Im making is about having pages of different type of games from different genres to help people find and show games they they might like. </w:t>
-            </w:r>
-            <w:r>
-              <w:rPr>
-                <w:rFonts w:eastAsia="Arial" w:cs="Arial"/>
-                <w:kern w:val="0"/>
-                <w:sz w:val="22"/>
-                <w:szCs w:val="22"/>
-                <w:lang w:val="en-US" w:eastAsia="zh-CN" w:bidi="hi-IN"/>
-              </w:rPr>
-              <w:t>The w</w:t>
-            </w:r>
-            <w:r>
-              <w:rPr>
-                <w:rFonts w:eastAsia="Arial" w:cs="Arial"/>
-                <w:kern w:val="0"/>
-                <w:sz w:val="22"/>
-                <w:szCs w:val="22"/>
-                <w:lang w:val="en-US" w:eastAsia="zh-CN" w:bidi="hi-IN"/>
-              </w:rPr>
-              <w:t xml:space="preserve">ebsite </w:t>
-            </w:r>
-            <w:r>
-              <w:rPr>
-                <w:rFonts w:eastAsia="Arial" w:cs="Arial"/>
-                <w:kern w:val="0"/>
-                <w:sz w:val="22"/>
-                <w:szCs w:val="22"/>
-                <w:lang w:val="en-US" w:eastAsia="zh-CN" w:bidi="hi-IN"/>
-              </w:rPr>
-              <w:t>is for</w:t>
-            </w:r>
-            <w:r>
-              <w:rPr>
-                <w:rFonts w:eastAsia="Arial" w:cs="Arial"/>
-                <w:kern w:val="0"/>
-                <w:sz w:val="22"/>
-                <w:szCs w:val="22"/>
-                <w:lang w:val="en-US" w:eastAsia="zh-CN" w:bidi="hi-IN"/>
-              </w:rPr>
-              <w:t xml:space="preserve"> </w:t>
-            </w:r>
-            <w:r>
-              <w:rPr>
-                <w:rFonts w:eastAsia="Arial" w:cs="Arial"/>
-                <w:kern w:val="0"/>
-                <w:sz w:val="22"/>
-                <w:szCs w:val="22"/>
-                <w:lang w:val="en-US" w:eastAsia="zh-CN" w:bidi="hi-IN"/>
-              </w:rPr>
-              <w:t>g</w:t>
-            </w:r>
-            <w:r>
-              <w:rPr>
-                <w:rFonts w:eastAsia="Arial" w:cs="Arial"/>
-                <w:kern w:val="0"/>
-                <w:sz w:val="22"/>
-                <w:szCs w:val="22"/>
-                <w:lang w:val="en-US" w:eastAsia="zh-CN" w:bidi="hi-IN"/>
-              </w:rPr>
-              <w:t>amer</w:t>
-            </w:r>
-            <w:r>
-              <w:rPr>
-                <w:rFonts w:eastAsia="Arial" w:cs="Arial"/>
-                <w:kern w:val="0"/>
-                <w:sz w:val="22"/>
-                <w:szCs w:val="22"/>
-                <w:lang w:val="en-US" w:eastAsia="zh-CN" w:bidi="hi-IN"/>
-              </w:rPr>
-              <w:t>s</w:t>
-            </w:r>
-            <w:r>
-              <w:rPr>
-                <w:rFonts w:eastAsia="Arial" w:cs="Arial"/>
-                <w:kern w:val="0"/>
-                <w:sz w:val="22"/>
-                <w:szCs w:val="22"/>
-                <w:lang w:val="en-US" w:eastAsia="zh-CN" w:bidi="hi-IN"/>
-              </w:rPr>
-              <w:t xml:space="preserve"> and like to talk about </w:t>
-            </w:r>
-            <w:r>
-              <w:rPr>
-                <w:rFonts w:eastAsia="Arial" w:cs="Arial"/>
-                <w:kern w:val="0"/>
-                <w:sz w:val="22"/>
-                <w:szCs w:val="22"/>
-                <w:lang w:val="en-US" w:eastAsia="zh-CN" w:bidi="hi-IN"/>
-              </w:rPr>
-              <w:t>their</w:t>
-            </w:r>
-            <w:r>
-              <w:rPr>
-                <w:rFonts w:eastAsia="Arial" w:cs="Arial"/>
-                <w:kern w:val="0"/>
-                <w:sz w:val="22"/>
-                <w:szCs w:val="22"/>
-                <w:lang w:val="en-US" w:eastAsia="zh-CN" w:bidi="hi-IN"/>
-              </w:rPr>
-              <w:t xml:space="preserve"> favourite game to people who like the similar game as say user.</w:t>
+              <w:t>In this project or website Im making is about having pages of different type of games from different genres to help people find and show games they they might like. The website is for gamers and like to talk about their favourite game to people who like the similar game as say user.</w:t>
             </w:r>
           </w:p>
           <w:p>
@@ -1613,8 +1513,8 @@
       </w:tblPr>
       <w:tblGrid>
         <w:gridCol w:w="3480"/>
-        <w:gridCol w:w="2467"/>
-        <w:gridCol w:w="3439"/>
+        <w:gridCol w:w="2466"/>
+        <w:gridCol w:w="3440"/>
         <w:gridCol w:w="1069"/>
       </w:tblGrid>
       <w:tr>
@@ -1658,7 +1558,7 @@
         </w:tc>
         <w:tc>
           <w:tcPr>
-            <w:tcW w:w="2467" w:type="dxa"/>
+            <w:tcW w:w="2466" w:type="dxa"/>
             <w:tcBorders>
               <w:top w:val="single" w:sz="8" w:space="0" w:color="000000"/>
               <w:start w:val="single" w:sz="8" w:space="0" w:color="000000"/>
@@ -1691,7 +1591,7 @@
         </w:tc>
         <w:tc>
           <w:tcPr>
-            <w:tcW w:w="3439" w:type="dxa"/>
+            <w:tcW w:w="3440" w:type="dxa"/>
             <w:tcBorders>
               <w:top w:val="single" w:sz="8" w:space="0" w:color="000000"/>
               <w:start w:val="single" w:sz="8" w:space="0" w:color="000000"/>
@@ -1798,7 +1698,7 @@
         </w:tc>
         <w:tc>
           <w:tcPr>
-            <w:tcW w:w="2467" w:type="dxa"/>
+            <w:tcW w:w="2466" w:type="dxa"/>
             <w:tcBorders>
               <w:top w:val="single" w:sz="8" w:space="0" w:color="000000"/>
               <w:start w:val="single" w:sz="8" w:space="0" w:color="000000"/>
@@ -1836,7 +1736,7 @@
         </w:tc>
         <w:tc>
           <w:tcPr>
-            <w:tcW w:w="3439" w:type="dxa"/>
+            <w:tcW w:w="3440" w:type="dxa"/>
             <w:tcBorders>
               <w:top w:val="single" w:sz="8" w:space="0" w:color="000000"/>
               <w:start w:val="single" w:sz="8" w:space="0" w:color="000000"/>
@@ -1948,7 +1848,7 @@
         </w:tc>
         <w:tc>
           <w:tcPr>
-            <w:tcW w:w="2467" w:type="dxa"/>
+            <w:tcW w:w="2466" w:type="dxa"/>
             <w:tcBorders>
               <w:top w:val="single" w:sz="8" w:space="0" w:color="000000"/>
               <w:start w:val="single" w:sz="8" w:space="0" w:color="000000"/>
@@ -1981,7 +1881,7 @@
         </w:tc>
         <w:tc>
           <w:tcPr>
-            <w:tcW w:w="3439" w:type="dxa"/>
+            <w:tcW w:w="3440" w:type="dxa"/>
             <w:tcBorders>
               <w:top w:val="single" w:sz="8" w:space="0" w:color="000000"/>
               <w:start w:val="single" w:sz="8" w:space="0" w:color="000000"/>
@@ -2078,7 +1978,7 @@
         </w:tc>
         <w:tc>
           <w:tcPr>
-            <w:tcW w:w="2467" w:type="dxa"/>
+            <w:tcW w:w="2466" w:type="dxa"/>
             <w:tcBorders>
               <w:top w:val="single" w:sz="8" w:space="0" w:color="000000"/>
               <w:start w:val="single" w:sz="8" w:space="0" w:color="000000"/>
@@ -2111,7 +2011,7 @@
         </w:tc>
         <w:tc>
           <w:tcPr>
-            <w:tcW w:w="3439" w:type="dxa"/>
+            <w:tcW w:w="3440" w:type="dxa"/>
             <w:tcBorders>
               <w:top w:val="single" w:sz="8" w:space="0" w:color="000000"/>
               <w:start w:val="single" w:sz="8" w:space="0" w:color="000000"/>
@@ -2206,7 +2106,7 @@
         </w:tc>
         <w:tc>
           <w:tcPr>
-            <w:tcW w:w="2467" w:type="dxa"/>
+            <w:tcW w:w="2466" w:type="dxa"/>
             <w:tcBorders>
               <w:top w:val="single" w:sz="8" w:space="0" w:color="000000"/>
               <w:start w:val="single" w:sz="8" w:space="0" w:color="000000"/>
@@ -2235,7 +2135,7 @@
         </w:tc>
         <w:tc>
           <w:tcPr>
-            <w:tcW w:w="3439" w:type="dxa"/>
+            <w:tcW w:w="3440" w:type="dxa"/>
             <w:tcBorders>
               <w:top w:val="single" w:sz="8" w:space="0" w:color="000000"/>
               <w:start w:val="single" w:sz="8" w:space="0" w:color="000000"/>
@@ -2259,7 +2159,7 @@
                 <w:rFonts w:eastAsia="Calibri" w:cs="Calibri" w:ascii="Calibri" w:hAnsi="Calibri"/>
               </w:rPr>
               <w:drawing>
-                <wp:anchor distT="0" distB="0" distL="0" distR="0" simplePos="0" relativeHeight="55" behindDoc="0" locked="0" layoutInCell="0" allowOverlap="1">
+                <wp:anchor distT="0" distB="0" distL="0" distR="0" simplePos="0" relativeHeight="55" behindDoc="0" locked="0" layoutInCell="1" allowOverlap="1">
                   <wp:simplePos x="0" y="0"/>
                   <wp:positionH relativeFrom="column">
                     <wp:posOffset>81915</wp:posOffset>
@@ -2380,7 +2280,7 @@
             </w:pPr>
             <w:r>
               <w:drawing>
-                <wp:anchor distT="0" distB="0" distL="0" distR="0" simplePos="0" relativeHeight="54" behindDoc="0" locked="0" layoutInCell="0" allowOverlap="1">
+                <wp:anchor distT="0" distB="0" distL="0" distR="0" simplePos="0" relativeHeight="54" behindDoc="0" locked="0" layoutInCell="1" allowOverlap="1">
                   <wp:simplePos x="0" y="0"/>
                   <wp:positionH relativeFrom="column">
                     <wp:posOffset>3728085</wp:posOffset>
@@ -2436,7 +2336,7 @@
         </w:tc>
         <w:tc>
           <w:tcPr>
-            <w:tcW w:w="2467" w:type="dxa"/>
+            <w:tcW w:w="2466" w:type="dxa"/>
             <w:tcBorders>
               <w:start w:val="single" w:sz="8" w:space="0" w:color="000000"/>
               <w:bottom w:val="single" w:sz="8" w:space="0" w:color="000000"/>
@@ -2464,7 +2364,7 @@
         </w:tc>
         <w:tc>
           <w:tcPr>
-            <w:tcW w:w="3439" w:type="dxa"/>
+            <w:tcW w:w="3440" w:type="dxa"/>
             <w:tcBorders>
               <w:start w:val="single" w:sz="8" w:space="0" w:color="000000"/>
               <w:bottom w:val="single" w:sz="8" w:space="0" w:color="000000"/>
@@ -3360,16 +3260,16 @@
         <w:tblLook w:val="0600" w:firstRow="0" w:noVBand="1" w:lastRow="0" w:firstColumn="0" w:lastColumn="0" w:noHBand="1"/>
       </w:tblPr>
       <w:tblGrid>
-        <w:gridCol w:w="3474"/>
-        <w:gridCol w:w="2826"/>
-        <w:gridCol w:w="2979"/>
-        <w:gridCol w:w="1056"/>
+        <w:gridCol w:w="2607"/>
+        <w:gridCol w:w="2782"/>
+        <w:gridCol w:w="3889"/>
+        <w:gridCol w:w="1057"/>
       </w:tblGrid>
       <w:tr>
         <w:trPr/>
         <w:tc>
           <w:tcPr>
-            <w:tcW w:w="3474" w:type="dxa"/>
+            <w:tcW w:w="2607" w:type="dxa"/>
             <w:tcBorders>
               <w:top w:val="single" w:sz="8" w:space="0" w:color="000000"/>
               <w:start w:val="single" w:sz="8" w:space="0" w:color="000000"/>
@@ -3406,7 +3306,7 @@
         </w:tc>
         <w:tc>
           <w:tcPr>
-            <w:tcW w:w="2826" w:type="dxa"/>
+            <w:tcW w:w="2782" w:type="dxa"/>
             <w:tcBorders>
               <w:top w:val="single" w:sz="8" w:space="0" w:color="000000"/>
               <w:start w:val="single" w:sz="8" w:space="0" w:color="000000"/>
@@ -3439,7 +3339,7 @@
         </w:tc>
         <w:tc>
           <w:tcPr>
-            <w:tcW w:w="2979" w:type="dxa"/>
+            <w:tcW w:w="3889" w:type="dxa"/>
             <w:tcBorders>
               <w:top w:val="single" w:sz="8" w:space="0" w:color="000000"/>
               <w:start w:val="single" w:sz="8" w:space="0" w:color="000000"/>
@@ -3472,7 +3372,7 @@
         </w:tc>
         <w:tc>
           <w:tcPr>
-            <w:tcW w:w="1056" w:type="dxa"/>
+            <w:tcW w:w="1057" w:type="dxa"/>
             <w:tcBorders>
               <w:top w:val="single" w:sz="8" w:space="0" w:color="000000"/>
               <w:start w:val="single" w:sz="8" w:space="0" w:color="000000"/>
@@ -3508,7 +3408,7 @@
         <w:trPr/>
         <w:tc>
           <w:tcPr>
-            <w:tcW w:w="3474" w:type="dxa"/>
+            <w:tcW w:w="2607" w:type="dxa"/>
             <w:tcBorders>
               <w:top w:val="single" w:sz="8" w:space="0" w:color="000000"/>
               <w:start w:val="single" w:sz="8" w:space="0" w:color="000000"/>
@@ -3546,7 +3446,7 @@
         </w:tc>
         <w:tc>
           <w:tcPr>
-            <w:tcW w:w="2826" w:type="dxa"/>
+            <w:tcW w:w="2782" w:type="dxa"/>
             <w:tcBorders>
               <w:top w:val="single" w:sz="8" w:space="0" w:color="000000"/>
               <w:start w:val="single" w:sz="8" w:space="0" w:color="000000"/>
@@ -3584,7 +3484,7 @@
         </w:tc>
         <w:tc>
           <w:tcPr>
-            <w:tcW w:w="2979" w:type="dxa"/>
+            <w:tcW w:w="3889" w:type="dxa"/>
             <w:tcBorders>
               <w:top w:val="single" w:sz="8" w:space="0" w:color="000000"/>
               <w:start w:val="single" w:sz="8" w:space="0" w:color="000000"/>
@@ -3622,7 +3522,7 @@
         </w:tc>
         <w:tc>
           <w:tcPr>
-            <w:tcW w:w="1056" w:type="dxa"/>
+            <w:tcW w:w="1057" w:type="dxa"/>
             <w:tcBorders>
               <w:top w:val="single" w:sz="8" w:space="0" w:color="000000"/>
               <w:start w:val="single" w:sz="8" w:space="0" w:color="000000"/>
@@ -3663,70 +3563,40 @@
         <w:trPr/>
         <w:tc>
           <w:tcPr>
-            <w:tcW w:w="3474" w:type="dxa"/>
-            <w:tcBorders>
-              <w:top w:val="single" w:sz="8" w:space="0" w:color="000000"/>
-              <w:start w:val="single" w:sz="8" w:space="0" w:color="000000"/>
-              <w:bottom w:val="single" w:sz="8" w:space="0" w:color="000000"/>
-              <w:end w:val="single" w:sz="8" w:space="0" w:color="000000"/>
-            </w:tcBorders>
-          </w:tcPr>
-          <w:p>
-            <w:pPr>
-              <w:pStyle w:val="normal1"/>
-              <w:widowControl w:val="false"/>
-              <w:suppressAutoHyphens w:val="true"/>
-              <w:spacing w:lineRule="auto" w:line="240" w:before="0" w:after="0"/>
-              <w:jc w:val="start"/>
-              <w:rPr>
-                <w:rFonts w:ascii="Calibri" w:hAnsi="Calibri" w:eastAsia="Calibri" w:cs="Calibri"/>
-              </w:rPr>
-            </w:pPr>
-            <w:r>
-              <w:rPr>
-                <w:rFonts w:eastAsia="Calibri" w:cs="Calibri" w:ascii="Calibri" w:hAnsi="Calibri"/>
-                <w:kern w:val="0"/>
-                <w:sz w:val="22"/>
-                <w:szCs w:val="22"/>
-                <w:lang w:val="en-US" w:eastAsia="zh-CN" w:bidi="hi-IN"/>
-              </w:rPr>
-              <w:t>Text box</w:t>
-            </w:r>
-            <w:r>
-              <w:rPr>
-                <w:rFonts w:eastAsia="Calibri" w:cs="Calibri" w:ascii="Calibri" w:hAnsi="Calibri"/>
-                <w:kern w:val="0"/>
-                <w:sz w:val="22"/>
-                <w:szCs w:val="22"/>
-                <w:lang w:val="en-US" w:eastAsia="zh-CN" w:bidi="hi-IN"/>
-              </w:rPr>
-              <w:t xml:space="preserve"> | </w:t>
-            </w:r>
-            <w:r>
-              <w:rPr>
-                <w:rFonts w:eastAsia="Calibri" w:cs="Calibri" w:ascii="Calibri" w:hAnsi="Calibri"/>
-                <w:kern w:val="0"/>
-                <w:sz w:val="22"/>
-                <w:szCs w:val="22"/>
-                <w:lang w:val="en-US" w:eastAsia="zh-CN" w:bidi="hi-IN"/>
-              </w:rPr>
-              <w:t>grid</w:t>
-            </w:r>
-            <w:r>
-              <w:rPr>
-                <w:rFonts w:eastAsia="Calibri" w:cs="Calibri" w:ascii="Calibri" w:hAnsi="Calibri"/>
-                <w:kern w:val="0"/>
-                <w:sz w:val="22"/>
-                <w:szCs w:val="22"/>
-                <w:lang w:val="en-US" w:eastAsia="zh-CN" w:bidi="hi-IN"/>
-              </w:rPr>
-              <w:t xml:space="preserve"> area</w:t>
-            </w:r>
-          </w:p>
-        </w:tc>
-        <w:tc>
-          <w:tcPr>
-            <w:tcW w:w="2826" w:type="dxa"/>
+            <w:tcW w:w="2607" w:type="dxa"/>
+            <w:tcBorders>
+              <w:top w:val="single" w:sz="8" w:space="0" w:color="000000"/>
+              <w:start w:val="single" w:sz="8" w:space="0" w:color="000000"/>
+              <w:bottom w:val="single" w:sz="8" w:space="0" w:color="000000"/>
+              <w:end w:val="single" w:sz="8" w:space="0" w:color="000000"/>
+            </w:tcBorders>
+          </w:tcPr>
+          <w:p>
+            <w:pPr>
+              <w:pStyle w:val="normal1"/>
+              <w:widowControl w:val="false"/>
+              <w:suppressAutoHyphens w:val="true"/>
+              <w:spacing w:lineRule="auto" w:line="240" w:before="0" w:after="0"/>
+              <w:jc w:val="start"/>
+              <w:rPr>
+                <w:rFonts w:ascii="Calibri" w:hAnsi="Calibri" w:eastAsia="Calibri" w:cs="Calibri"/>
+              </w:rPr>
+            </w:pPr>
+            <w:r>
+              <w:rPr>
+                <w:rFonts w:eastAsia="Calibri" w:cs="Calibri" w:ascii="Calibri" w:hAnsi="Calibri"/>
+                <w:kern w:val="0"/>
+                <w:sz w:val="22"/>
+                <w:szCs w:val="22"/>
+                <w:lang w:val="en-US" w:eastAsia="zh-CN" w:bidi="hi-IN"/>
+              </w:rPr>
+              <w:t>Text box | grid area</w:t>
+            </w:r>
+          </w:p>
+        </w:tc>
+        <w:tc>
+          <w:tcPr>
+            <w:tcW w:w="2782" w:type="dxa"/>
             <w:tcBorders>
               <w:top w:val="single" w:sz="8" w:space="0" w:color="000000"/>
               <w:start w:val="single" w:sz="8" w:space="0" w:color="000000"/>
@@ -3755,7 +3625,7 @@
         </w:tc>
         <w:tc>
           <w:tcPr>
-            <w:tcW w:w="2979" w:type="dxa"/>
+            <w:tcW w:w="3889" w:type="dxa"/>
             <w:tcBorders>
               <w:top w:val="single" w:sz="8" w:space="0" w:color="000000"/>
               <w:start w:val="single" w:sz="8" w:space="0" w:color="000000"/>
@@ -3829,7 +3699,7 @@
         </w:tc>
         <w:tc>
           <w:tcPr>
-            <w:tcW w:w="1056" w:type="dxa"/>
+            <w:tcW w:w="1057" w:type="dxa"/>
             <w:tcBorders>
               <w:top w:val="single" w:sz="8" w:space="0" w:color="000000"/>
               <w:start w:val="single" w:sz="8" w:space="0" w:color="000000"/>
@@ -3861,65 +3731,38 @@
         <w:trPr/>
         <w:tc>
           <w:tcPr>
-            <w:tcW w:w="3474" w:type="dxa"/>
-            <w:tcBorders>
-              <w:start w:val="single" w:sz="8" w:space="0" w:color="000000"/>
-              <w:bottom w:val="single" w:sz="8" w:space="0" w:color="000000"/>
-              <w:end w:val="single" w:sz="8" w:space="0" w:color="000000"/>
-            </w:tcBorders>
-          </w:tcPr>
-          <w:p>
-            <w:pPr>
-              <w:pStyle w:val="normal1"/>
-              <w:widowControl w:val="false"/>
-              <w:suppressAutoHyphens w:val="true"/>
-              <w:spacing w:lineRule="auto" w:line="240" w:before="0" w:after="0"/>
-              <w:jc w:val="start"/>
-              <w:rPr>
-                <w:rFonts w:ascii="Calibri" w:hAnsi="Calibri" w:eastAsia="Calibri" w:cs="Calibri"/>
-              </w:rPr>
-            </w:pPr>
-            <w:r>
-              <w:rPr>
-                <w:kern w:val="0"/>
-                <w:sz w:val="22"/>
-                <w:szCs w:val="22"/>
-                <w:lang w:val="en-US" w:eastAsia="zh-CN" w:bidi="hi-IN"/>
-              </w:rPr>
-              <w:t>Text box</w:t>
-            </w:r>
-            <w:r>
-              <w:rPr>
-                <w:kern w:val="0"/>
-                <w:sz w:val="22"/>
-                <w:szCs w:val="22"/>
-                <w:lang w:val="en-US" w:eastAsia="zh-CN" w:bidi="hi-IN"/>
-              </w:rPr>
-              <w:t xml:space="preserve"> | </w:t>
-            </w:r>
-            <w:r>
-              <w:rPr>
-                <w:kern w:val="0"/>
-                <w:sz w:val="22"/>
-                <w:szCs w:val="22"/>
-                <w:lang w:val="en-US" w:eastAsia="zh-CN" w:bidi="hi-IN"/>
-              </w:rPr>
-              <w:t>grid</w:t>
-            </w:r>
-            <w:r>
-              <w:rPr>
-                <w:kern w:val="0"/>
-                <w:sz w:val="22"/>
-                <w:szCs w:val="22"/>
-                <w:lang w:val="en-US" w:eastAsia="zh-CN" w:bidi="hi-IN"/>
-              </w:rPr>
-              <w:t xml:space="preserve"> area</w:t>
-            </w:r>
-          </w:p>
-        </w:tc>
-        <w:tc>
-          <w:tcPr>
-            <w:tcW w:w="2826" w:type="dxa"/>
+            <w:tcW w:w="2607" w:type="dxa"/>
+            <w:tcBorders>
+              <w:start w:val="single" w:sz="8" w:space="0" w:color="000000"/>
+              <w:bottom w:val="single" w:sz="8" w:space="0" w:color="000000"/>
+              <w:end w:val="single" w:sz="8" w:space="0" w:color="000000"/>
+            </w:tcBorders>
+          </w:tcPr>
+          <w:p>
+            <w:pPr>
+              <w:pStyle w:val="normal1"/>
+              <w:widowControl w:val="false"/>
+              <w:suppressAutoHyphens w:val="true"/>
+              <w:spacing w:lineRule="auto" w:line="240" w:before="0" w:after="0"/>
+              <w:jc w:val="start"/>
+              <w:rPr>
+                <w:rFonts w:ascii="Calibri" w:hAnsi="Calibri" w:eastAsia="Calibri" w:cs="Calibri"/>
+              </w:rPr>
+            </w:pPr>
+            <w:r>
+              <w:rPr>
+                <w:kern w:val="0"/>
+                <w:sz w:val="22"/>
+                <w:szCs w:val="22"/>
+                <w:lang w:val="en-US" w:eastAsia="zh-CN" w:bidi="hi-IN"/>
+              </w:rPr>
+              <w:t>Text box | grid area</w:t>
+            </w:r>
+          </w:p>
+        </w:tc>
+        <w:tc>
+          <w:tcPr>
+            <w:tcW w:w="2782" w:type="dxa"/>
             <w:tcBorders>
               <w:start w:val="single" w:sz="8" w:space="0" w:color="000000"/>
               <w:bottom w:val="single" w:sz="8" w:space="0" w:color="000000"/>
@@ -3947,7 +3790,7 @@
         </w:tc>
         <w:tc>
           <w:tcPr>
-            <w:tcW w:w="2979" w:type="dxa"/>
+            <w:tcW w:w="3889" w:type="dxa"/>
             <w:tcBorders>
               <w:start w:val="single" w:sz="8" w:space="0" w:color="000000"/>
               <w:bottom w:val="single" w:sz="8" w:space="0" w:color="000000"/>
@@ -3970,7 +3813,7 @@
                 <w:rFonts w:eastAsia="Calibri" w:cs="Calibri" w:ascii="Calibri" w:hAnsi="Calibri"/>
               </w:rPr>
               <w:drawing>
-                <wp:anchor distT="0" distB="0" distL="0" distR="0" simplePos="0" relativeHeight="57" behindDoc="0" locked="0" layoutInCell="0" allowOverlap="1">
+                <wp:anchor distT="0" distB="0" distL="0" distR="0" simplePos="0" relativeHeight="57" behindDoc="0" locked="0" layoutInCell="1" allowOverlap="1">
                   <wp:simplePos x="0" y="0"/>
                   <wp:positionH relativeFrom="column">
                     <wp:align>center</wp:align>
@@ -4020,7 +3863,7 @@
         </w:tc>
         <w:tc>
           <w:tcPr>
-            <w:tcW w:w="1056" w:type="dxa"/>
+            <w:tcW w:w="1057" w:type="dxa"/>
             <w:tcBorders>
               <w:start w:val="single" w:sz="8" w:space="0" w:color="000000"/>
               <w:bottom w:val="single" w:sz="8" w:space="0" w:color="000000"/>
@@ -4051,65 +3894,38 @@
         <w:trPr/>
         <w:tc>
           <w:tcPr>
-            <w:tcW w:w="3474" w:type="dxa"/>
-            <w:tcBorders>
-              <w:start w:val="single" w:sz="8" w:space="0" w:color="000000"/>
-              <w:bottom w:val="single" w:sz="8" w:space="0" w:color="000000"/>
-              <w:end w:val="single" w:sz="8" w:space="0" w:color="000000"/>
-            </w:tcBorders>
-          </w:tcPr>
-          <w:p>
-            <w:pPr>
-              <w:pStyle w:val="normal1"/>
-              <w:widowControl w:val="false"/>
-              <w:suppressAutoHyphens w:val="true"/>
-              <w:spacing w:lineRule="auto" w:line="240" w:before="0" w:after="0"/>
-              <w:jc w:val="start"/>
-              <w:rPr>
-                <w:rFonts w:ascii="Calibri" w:hAnsi="Calibri" w:eastAsia="Calibri" w:cs="Calibri"/>
-              </w:rPr>
-            </w:pPr>
-            <w:r>
-              <w:rPr>
-                <w:kern w:val="0"/>
-                <w:sz w:val="22"/>
-                <w:szCs w:val="22"/>
-                <w:lang w:val="en-US" w:eastAsia="zh-CN" w:bidi="hi-IN"/>
-              </w:rPr>
-              <w:t>Text box</w:t>
-            </w:r>
-            <w:r>
-              <w:rPr>
-                <w:kern w:val="0"/>
-                <w:sz w:val="22"/>
-                <w:szCs w:val="22"/>
-                <w:lang w:val="en-US" w:eastAsia="zh-CN" w:bidi="hi-IN"/>
-              </w:rPr>
-              <w:t xml:space="preserve"> | </w:t>
-            </w:r>
-            <w:r>
-              <w:rPr>
-                <w:kern w:val="0"/>
-                <w:sz w:val="22"/>
-                <w:szCs w:val="22"/>
-                <w:lang w:val="en-US" w:eastAsia="zh-CN" w:bidi="hi-IN"/>
-              </w:rPr>
-              <w:t>grid</w:t>
-            </w:r>
-            <w:r>
-              <w:rPr>
-                <w:kern w:val="0"/>
-                <w:sz w:val="22"/>
-                <w:szCs w:val="22"/>
-                <w:lang w:val="en-US" w:eastAsia="zh-CN" w:bidi="hi-IN"/>
-              </w:rPr>
-              <w:t xml:space="preserve"> area</w:t>
-            </w:r>
-          </w:p>
-        </w:tc>
-        <w:tc>
-          <w:tcPr>
-            <w:tcW w:w="2826" w:type="dxa"/>
+            <w:tcW w:w="2607" w:type="dxa"/>
+            <w:tcBorders>
+              <w:start w:val="single" w:sz="8" w:space="0" w:color="000000"/>
+              <w:bottom w:val="single" w:sz="8" w:space="0" w:color="000000"/>
+              <w:end w:val="single" w:sz="8" w:space="0" w:color="000000"/>
+            </w:tcBorders>
+          </w:tcPr>
+          <w:p>
+            <w:pPr>
+              <w:pStyle w:val="normal1"/>
+              <w:widowControl w:val="false"/>
+              <w:suppressAutoHyphens w:val="true"/>
+              <w:spacing w:lineRule="auto" w:line="240" w:before="0" w:after="0"/>
+              <w:jc w:val="start"/>
+              <w:rPr>
+                <w:rFonts w:ascii="Calibri" w:hAnsi="Calibri" w:eastAsia="Calibri" w:cs="Calibri"/>
+              </w:rPr>
+            </w:pPr>
+            <w:r>
+              <w:rPr>
+                <w:kern w:val="0"/>
+                <w:sz w:val="22"/>
+                <w:szCs w:val="22"/>
+                <w:lang w:val="en-US" w:eastAsia="zh-CN" w:bidi="hi-IN"/>
+              </w:rPr>
+              <w:t>Text box | grid area</w:t>
+            </w:r>
+          </w:p>
+        </w:tc>
+        <w:tc>
+          <w:tcPr>
+            <w:tcW w:w="2782" w:type="dxa"/>
             <w:tcBorders>
               <w:start w:val="single" w:sz="8" w:space="0" w:color="000000"/>
               <w:bottom w:val="single" w:sz="8" w:space="0" w:color="000000"/>
@@ -4137,7 +3953,7 @@
         </w:tc>
         <w:tc>
           <w:tcPr>
-            <w:tcW w:w="2979" w:type="dxa"/>
+            <w:tcW w:w="3889" w:type="dxa"/>
             <w:tcBorders>
               <w:start w:val="single" w:sz="8" w:space="0" w:color="000000"/>
               <w:bottom w:val="single" w:sz="8" w:space="0" w:color="000000"/>
@@ -4160,7 +3976,7 @@
                 <w:rFonts w:eastAsia="Calibri" w:cs="Calibri" w:ascii="Calibri" w:hAnsi="Calibri"/>
               </w:rPr>
               <w:drawing>
-                <wp:anchor distT="0" distB="0" distL="0" distR="0" simplePos="0" relativeHeight="56" behindDoc="0" locked="0" layoutInCell="0" allowOverlap="1">
+                <wp:anchor distT="0" distB="0" distL="0" distR="0" simplePos="0" relativeHeight="56" behindDoc="0" locked="0" layoutInCell="1" allowOverlap="1">
                   <wp:simplePos x="0" y="0"/>
                   <wp:positionH relativeFrom="column">
                     <wp:align>center</wp:align>
@@ -4210,7 +4026,7 @@
         </w:tc>
         <w:tc>
           <w:tcPr>
-            <w:tcW w:w="1056" w:type="dxa"/>
+            <w:tcW w:w="1057" w:type="dxa"/>
             <w:tcBorders>
               <w:start w:val="single" w:sz="8" w:space="0" w:color="000000"/>
               <w:bottom w:val="single" w:sz="8" w:space="0" w:color="000000"/>
@@ -4241,7 +4057,7 @@
         <w:trPr/>
         <w:tc>
           <w:tcPr>
-            <w:tcW w:w="3474" w:type="dxa"/>
+            <w:tcW w:w="2607" w:type="dxa"/>
             <w:tcBorders>
               <w:top w:val="single" w:sz="8" w:space="0" w:color="000000"/>
               <w:start w:val="single" w:sz="8" w:space="0" w:color="000000"/>
@@ -4274,56 +4090,27 @@
         </w:tc>
         <w:tc>
           <w:tcPr>
-            <w:tcW w:w="2826" w:type="dxa"/>
-            <w:tcBorders>
-              <w:top w:val="single" w:sz="8" w:space="0" w:color="000000"/>
-              <w:start w:val="single" w:sz="8" w:space="0" w:color="000000"/>
-              <w:bottom w:val="single" w:sz="8" w:space="0" w:color="000000"/>
-              <w:end w:val="single" w:sz="8" w:space="0" w:color="000000"/>
-            </w:tcBorders>
-          </w:tcPr>
-          <w:p>
-            <w:pPr>
-              <w:pStyle w:val="normal1"/>
-              <w:widowControl w:val="false"/>
-              <w:suppressAutoHyphens w:val="true"/>
-              <w:spacing w:lineRule="auto" w:line="240" w:before="0" w:after="0"/>
-              <w:jc w:val="start"/>
-              <w:rPr>
-                <w:rFonts w:ascii="Calibri" w:hAnsi="Calibri" w:eastAsia="Calibri" w:cs="Calibri"/>
-              </w:rPr>
-            </w:pPr>
-            <w:r>
-              <w:rPr>
-                <w:rFonts w:eastAsia="Calibri" w:cs="Calibri" w:ascii="Calibri" w:hAnsi="Calibri"/>
-              </w:rPr>
-            </w:r>
-          </w:p>
-        </w:tc>
-        <w:tc>
-          <w:tcPr>
-            <w:tcW w:w="2979" w:type="dxa"/>
-            <w:tcBorders>
-              <w:top w:val="single" w:sz="8" w:space="0" w:color="000000"/>
-              <w:start w:val="single" w:sz="8" w:space="0" w:color="000000"/>
-              <w:bottom w:val="single" w:sz="8" w:space="0" w:color="000000"/>
-              <w:end w:val="single" w:sz="8" w:space="0" w:color="000000"/>
-            </w:tcBorders>
-          </w:tcPr>
-          <w:p>
-            <w:pPr>
-              <w:pStyle w:val="normal1"/>
-              <w:widowControl w:val="false"/>
-              <w:suppressAutoHyphens w:val="true"/>
-              <w:spacing w:lineRule="auto" w:line="240" w:before="0" w:after="0"/>
-              <w:jc w:val="start"/>
-              <w:rPr>
-                <w:rFonts w:ascii="Calibri" w:hAnsi="Calibri" w:eastAsia="Calibri" w:cs="Calibri"/>
-              </w:rPr>
-            </w:pPr>
-            <w:r>
-              <w:rPr>
-                <w:rFonts w:eastAsia="Calibri" w:cs="Calibri" w:ascii="Calibri" w:hAnsi="Calibri"/>
+            <w:tcW w:w="2782" w:type="dxa"/>
+            <w:tcBorders>
+              <w:top w:val="single" w:sz="8" w:space="0" w:color="000000"/>
+              <w:start w:val="single" w:sz="8" w:space="0" w:color="000000"/>
+              <w:bottom w:val="single" w:sz="8" w:space="0" w:color="000000"/>
+              <w:end w:val="single" w:sz="8" w:space="0" w:color="000000"/>
+            </w:tcBorders>
+          </w:tcPr>
+          <w:p>
+            <w:pPr>
+              <w:pStyle w:val="normal1"/>
+              <w:widowControl w:val="false"/>
+              <w:suppressAutoHyphens w:val="true"/>
+              <w:spacing w:lineRule="auto" w:line="240" w:before="0" w:after="0"/>
+              <w:jc w:val="start"/>
+              <w:rPr>
+                <w:rFonts w:ascii="Calibri" w:hAnsi="Calibri" w:eastAsia="Calibri" w:cs="Calibri"/>
+              </w:rPr>
+            </w:pPr>
+            <w:r>
+              <w:rPr>
                 <w:kern w:val="0"/>
                 <w:sz w:val="22"/>
                 <w:szCs w:val="22"/>
@@ -4335,7 +4122,33 @@
         </w:tc>
         <w:tc>
           <w:tcPr>
-            <w:tcW w:w="1056" w:type="dxa"/>
+            <w:tcW w:w="3889" w:type="dxa"/>
+            <w:tcBorders>
+              <w:top w:val="single" w:sz="8" w:space="0" w:color="000000"/>
+              <w:start w:val="single" w:sz="8" w:space="0" w:color="000000"/>
+              <w:bottom w:val="single" w:sz="8" w:space="0" w:color="000000"/>
+              <w:end w:val="single" w:sz="8" w:space="0" w:color="000000"/>
+            </w:tcBorders>
+          </w:tcPr>
+          <w:p>
+            <w:pPr>
+              <w:pStyle w:val="normal1"/>
+              <w:widowControl w:val="false"/>
+              <w:suppressAutoHyphens w:val="true"/>
+              <w:spacing w:lineRule="auto" w:line="240" w:before="0" w:after="0"/>
+              <w:jc w:val="start"/>
+              <w:rPr>
+                <w:rFonts w:ascii="Calibri" w:hAnsi="Calibri" w:eastAsia="Calibri" w:cs="Calibri"/>
+              </w:rPr>
+            </w:pPr>
+            <w:r>
+              <w:rPr/>
+            </w:r>
+          </w:p>
+        </w:tc>
+        <w:tc>
+          <w:tcPr>
+            <w:tcW w:w="1057" w:type="dxa"/>
             <w:tcBorders>
               <w:top w:val="single" w:sz="8" w:space="0" w:color="000000"/>
               <w:start w:val="single" w:sz="8" w:space="0" w:color="000000"/>
@@ -4371,7 +4184,7 @@
         <w:trPr/>
         <w:tc>
           <w:tcPr>
-            <w:tcW w:w="3474" w:type="dxa"/>
+            <w:tcW w:w="2607" w:type="dxa"/>
             <w:tcBorders>
               <w:top w:val="single" w:sz="8" w:space="0" w:color="000000"/>
               <w:start w:val="single" w:sz="8" w:space="0" w:color="000000"/>
@@ -4404,63 +4217,114 @@
         </w:tc>
         <w:tc>
           <w:tcPr>
-            <w:tcW w:w="2826" w:type="dxa"/>
-            <w:tcBorders>
-              <w:top w:val="single" w:sz="8" w:space="0" w:color="000000"/>
-              <w:start w:val="single" w:sz="8" w:space="0" w:color="000000"/>
-              <w:bottom w:val="single" w:sz="8" w:space="0" w:color="000000"/>
-              <w:end w:val="single" w:sz="8" w:space="0" w:color="000000"/>
-            </w:tcBorders>
-          </w:tcPr>
-          <w:p>
-            <w:pPr>
-              <w:pStyle w:val="normal1"/>
-              <w:widowControl w:val="false"/>
-              <w:suppressAutoHyphens w:val="true"/>
-              <w:spacing w:lineRule="auto" w:line="240" w:before="0" w:after="0"/>
-              <w:jc w:val="start"/>
-              <w:rPr>
-                <w:rFonts w:ascii="Calibri" w:hAnsi="Calibri" w:eastAsia="Calibri" w:cs="Calibri"/>
-              </w:rPr>
-            </w:pPr>
-            <w:r>
-              <w:rPr>
-                <w:rFonts w:eastAsia="Calibri" w:cs="Calibri" w:ascii="Calibri" w:hAnsi="Calibri"/>
-              </w:rPr>
-            </w:r>
-          </w:p>
-        </w:tc>
-        <w:tc>
-          <w:tcPr>
-            <w:tcW w:w="2979" w:type="dxa"/>
-            <w:tcBorders>
-              <w:top w:val="single" w:sz="8" w:space="0" w:color="000000"/>
-              <w:start w:val="single" w:sz="8" w:space="0" w:color="000000"/>
-              <w:bottom w:val="single" w:sz="8" w:space="0" w:color="000000"/>
-              <w:end w:val="single" w:sz="8" w:space="0" w:color="000000"/>
-            </w:tcBorders>
-          </w:tcPr>
-          <w:p>
-            <w:pPr>
-              <w:pStyle w:val="normal1"/>
-              <w:widowControl w:val="false"/>
-              <w:suppressAutoHyphens w:val="true"/>
-              <w:spacing w:lineRule="auto" w:line="240" w:before="0" w:after="0"/>
-              <w:jc w:val="start"/>
-              <w:rPr>
-                <w:rFonts w:ascii="Calibri" w:hAnsi="Calibri" w:eastAsia="Calibri" w:cs="Calibri"/>
-              </w:rPr>
-            </w:pPr>
-            <w:r>
-              <w:rPr>
-                <w:rFonts w:eastAsia="Calibri" w:cs="Calibri" w:ascii="Calibri" w:hAnsi="Calibri"/>
-              </w:rPr>
-            </w:r>
-          </w:p>
-        </w:tc>
-        <w:tc>
-          <w:tcPr>
-            <w:tcW w:w="1056" w:type="dxa"/>
+            <w:tcW w:w="2782" w:type="dxa"/>
+            <w:tcBorders>
+              <w:top w:val="single" w:sz="8" w:space="0" w:color="000000"/>
+              <w:start w:val="single" w:sz="8" w:space="0" w:color="000000"/>
+              <w:bottom w:val="single" w:sz="8" w:space="0" w:color="000000"/>
+              <w:end w:val="single" w:sz="8" w:space="0" w:color="000000"/>
+            </w:tcBorders>
+          </w:tcPr>
+          <w:p>
+            <w:pPr>
+              <w:pStyle w:val="normal1"/>
+              <w:widowControl w:val="false"/>
+              <w:suppressAutoHyphens w:val="true"/>
+              <w:spacing w:lineRule="auto" w:line="240" w:before="0" w:after="0"/>
+              <w:jc w:val="start"/>
+              <w:rPr>
+                <w:rFonts w:ascii="Calibri" w:hAnsi="Calibri" w:eastAsia="Calibri" w:cs="Calibri"/>
+              </w:rPr>
+            </w:pPr>
+            <w:r>
+              <w:rPr>
+                <w:rFonts w:eastAsia="Calibri" w:cs="Calibri" w:ascii="Calibri" w:hAnsi="Calibri"/>
+              </w:rPr>
+            </w:r>
+          </w:p>
+        </w:tc>
+        <w:tc>
+          <w:tcPr>
+            <w:tcW w:w="3889" w:type="dxa"/>
+            <w:tcBorders>
+              <w:top w:val="single" w:sz="8" w:space="0" w:color="000000"/>
+              <w:start w:val="single" w:sz="8" w:space="0" w:color="000000"/>
+              <w:bottom w:val="single" w:sz="8" w:space="0" w:color="000000"/>
+              <w:end w:val="single" w:sz="8" w:space="0" w:color="000000"/>
+            </w:tcBorders>
+          </w:tcPr>
+          <w:p>
+            <w:pPr>
+              <w:pStyle w:val="normal1"/>
+              <w:widowControl w:val="false"/>
+              <w:suppressAutoHyphens w:val="true"/>
+              <w:spacing w:lineRule="auto" w:line="240" w:before="0" w:after="0"/>
+              <w:jc w:val="start"/>
+              <w:rPr>
+                <w:rFonts w:ascii="Calibri" w:hAnsi="Calibri" w:eastAsia="Calibri" w:cs="Calibri"/>
+              </w:rPr>
+            </w:pPr>
+            <w:r>
+              <w:rPr>
+                <w:rFonts w:eastAsia="Calibri" w:cs="Calibri" w:ascii="Calibri" w:hAnsi="Calibri"/>
+              </w:rPr>
+            </w:r>
+          </w:p>
+          <w:p>
+            <w:pPr>
+              <w:pStyle w:val="normal1"/>
+              <w:widowControl w:val="false"/>
+              <w:suppressAutoHyphens w:val="true"/>
+              <w:spacing w:lineRule="auto" w:line="240" w:before="0" w:after="0"/>
+              <w:jc w:val="start"/>
+              <w:rPr>
+                <w:rFonts w:ascii="Calibri" w:hAnsi="Calibri" w:eastAsia="Calibri" w:cs="Calibri"/>
+              </w:rPr>
+            </w:pPr>
+            <w:r>
+              <w:rPr>
+                <w:rFonts w:eastAsia="Calibri" w:cs="Calibri" w:ascii="Calibri" w:hAnsi="Calibri"/>
+              </w:rPr>
+            </w:r>
+          </w:p>
+          <w:p>
+            <w:pPr>
+              <w:pStyle w:val="normal1"/>
+              <w:widowControl w:val="false"/>
+              <w:suppressAutoHyphens w:val="true"/>
+              <w:spacing w:lineRule="auto" w:line="240" w:before="0" w:after="0"/>
+              <w:jc w:val="start"/>
+              <w:rPr>
+                <w:rFonts w:ascii="Calibri" w:hAnsi="Calibri" w:eastAsia="Calibri" w:cs="Calibri"/>
+              </w:rPr>
+            </w:pPr>
+            <w:r>
+              <w:rPr>
+                <w:rFonts w:eastAsia="Calibri" w:cs="Calibri" w:ascii="Calibri" w:hAnsi="Calibri"/>
+              </w:rPr>
+            </w:r>
+          </w:p>
+          <w:p>
+            <w:pPr>
+              <w:pStyle w:val="normal1"/>
+              <w:widowControl w:val="false"/>
+              <w:suppressAutoHyphens w:val="true"/>
+              <w:spacing w:lineRule="auto" w:line="240" w:before="0" w:after="0"/>
+              <w:jc w:val="start"/>
+              <w:rPr>
+                <w:rFonts w:ascii="Calibri" w:hAnsi="Calibri" w:eastAsia="Calibri" w:cs="Calibri"/>
+              </w:rPr>
+            </w:pPr>
+            <w:r>
+              <w:rPr>
+                <w:rFonts w:eastAsia="Calibri" w:cs="Calibri" w:ascii="Calibri" w:hAnsi="Calibri"/>
+              </w:rPr>
+            </w:r>
+          </w:p>
+        </w:tc>
+        <w:tc>
+          <w:tcPr>
+            <w:tcW w:w="1057" w:type="dxa"/>
             <w:tcBorders>
               <w:top w:val="single" w:sz="8" w:space="0" w:color="000000"/>
               <w:start w:val="single" w:sz="8" w:space="0" w:color="000000"/>
@@ -4491,91 +4355,91 @@
         <w:trPr/>
         <w:tc>
           <w:tcPr>
-            <w:tcW w:w="3474" w:type="dxa"/>
-            <w:tcBorders>
-              <w:top w:val="single" w:sz="8" w:space="0" w:color="000000"/>
-              <w:start w:val="single" w:sz="8" w:space="0" w:color="000000"/>
-              <w:bottom w:val="single" w:sz="8" w:space="0" w:color="000000"/>
-              <w:end w:val="single" w:sz="8" w:space="0" w:color="000000"/>
-            </w:tcBorders>
-          </w:tcPr>
-          <w:p>
-            <w:pPr>
-              <w:pStyle w:val="normal1"/>
-              <w:widowControl w:val="false"/>
-              <w:suppressAutoHyphens w:val="true"/>
-              <w:spacing w:lineRule="auto" w:line="240" w:before="0" w:after="0"/>
-              <w:jc w:val="start"/>
-              <w:rPr>
-                <w:rFonts w:ascii="Calibri" w:hAnsi="Calibri" w:eastAsia="Calibri" w:cs="Calibri"/>
-              </w:rPr>
-            </w:pPr>
-            <w:r>
-              <w:rPr>
-                <w:rFonts w:eastAsia="Calibri" w:cs="Calibri" w:ascii="Calibri" w:hAnsi="Calibri"/>
-              </w:rPr>
-            </w:r>
-          </w:p>
-        </w:tc>
-        <w:tc>
-          <w:tcPr>
-            <w:tcW w:w="2826" w:type="dxa"/>
-            <w:tcBorders>
-              <w:top w:val="single" w:sz="8" w:space="0" w:color="000000"/>
-              <w:start w:val="single" w:sz="8" w:space="0" w:color="000000"/>
-              <w:bottom w:val="single" w:sz="8" w:space="0" w:color="000000"/>
-              <w:end w:val="single" w:sz="8" w:space="0" w:color="000000"/>
-            </w:tcBorders>
-          </w:tcPr>
-          <w:p>
-            <w:pPr>
-              <w:pStyle w:val="normal1"/>
-              <w:widowControl w:val="false"/>
-              <w:suppressAutoHyphens w:val="true"/>
-              <w:spacing w:lineRule="auto" w:line="240" w:before="0" w:after="0"/>
-              <w:jc w:val="start"/>
-              <w:rPr>
-                <w:rFonts w:ascii="Calibri" w:hAnsi="Calibri" w:eastAsia="Calibri" w:cs="Calibri"/>
-              </w:rPr>
-            </w:pPr>
-            <w:r>
-              <w:rPr>
-                <w:rFonts w:eastAsia="Calibri" w:cs="Calibri" w:ascii="Calibri" w:hAnsi="Calibri"/>
-              </w:rPr>
-            </w:r>
-          </w:p>
-        </w:tc>
-        <w:tc>
-          <w:tcPr>
-            <w:tcW w:w="2979" w:type="dxa"/>
-            <w:tcBorders>
-              <w:top w:val="single" w:sz="8" w:space="0" w:color="000000"/>
-              <w:start w:val="single" w:sz="8" w:space="0" w:color="000000"/>
-              <w:bottom w:val="single" w:sz="8" w:space="0" w:color="000000"/>
-              <w:end w:val="single" w:sz="8" w:space="0" w:color="000000"/>
-            </w:tcBorders>
-          </w:tcPr>
-          <w:p>
-            <w:pPr>
-              <w:pStyle w:val="normal1"/>
-              <w:widowControl w:val="false"/>
-              <w:suppressAutoHyphens w:val="true"/>
-              <w:spacing w:lineRule="auto" w:line="240" w:before="0" w:after="0"/>
-              <w:jc w:val="start"/>
-              <w:rPr>
-                <w:rFonts w:ascii="Calibri" w:hAnsi="Calibri" w:eastAsia="Calibri" w:cs="Calibri"/>
-              </w:rPr>
-            </w:pPr>
-            <w:r>
-              <w:rPr>
-                <w:rFonts w:eastAsia="Calibri" w:cs="Calibri" w:ascii="Calibri" w:hAnsi="Calibri"/>
-              </w:rPr>
-            </w:r>
-          </w:p>
-        </w:tc>
-        <w:tc>
-          <w:tcPr>
-            <w:tcW w:w="1056" w:type="dxa"/>
+            <w:tcW w:w="2607" w:type="dxa"/>
+            <w:tcBorders>
+              <w:top w:val="single" w:sz="8" w:space="0" w:color="000000"/>
+              <w:start w:val="single" w:sz="8" w:space="0" w:color="000000"/>
+              <w:bottom w:val="single" w:sz="8" w:space="0" w:color="000000"/>
+              <w:end w:val="single" w:sz="8" w:space="0" w:color="000000"/>
+            </w:tcBorders>
+          </w:tcPr>
+          <w:p>
+            <w:pPr>
+              <w:pStyle w:val="normal1"/>
+              <w:widowControl w:val="false"/>
+              <w:suppressAutoHyphens w:val="true"/>
+              <w:spacing w:lineRule="auto" w:line="240" w:before="0" w:after="0"/>
+              <w:jc w:val="start"/>
+              <w:rPr>
+                <w:rFonts w:ascii="Calibri" w:hAnsi="Calibri" w:eastAsia="Calibri" w:cs="Calibri"/>
+              </w:rPr>
+            </w:pPr>
+            <w:r>
+              <w:rPr>
+                <w:rFonts w:eastAsia="Calibri" w:cs="Calibri" w:ascii="Calibri" w:hAnsi="Calibri"/>
+              </w:rPr>
+            </w:r>
+          </w:p>
+        </w:tc>
+        <w:tc>
+          <w:tcPr>
+            <w:tcW w:w="2782" w:type="dxa"/>
+            <w:tcBorders>
+              <w:top w:val="single" w:sz="8" w:space="0" w:color="000000"/>
+              <w:start w:val="single" w:sz="8" w:space="0" w:color="000000"/>
+              <w:bottom w:val="single" w:sz="8" w:space="0" w:color="000000"/>
+              <w:end w:val="single" w:sz="8" w:space="0" w:color="000000"/>
+            </w:tcBorders>
+          </w:tcPr>
+          <w:p>
+            <w:pPr>
+              <w:pStyle w:val="normal1"/>
+              <w:widowControl w:val="false"/>
+              <w:suppressAutoHyphens w:val="true"/>
+              <w:spacing w:lineRule="auto" w:line="240" w:before="0" w:after="0"/>
+              <w:jc w:val="start"/>
+              <w:rPr>
+                <w:rFonts w:ascii="Calibri" w:hAnsi="Calibri" w:eastAsia="Calibri" w:cs="Calibri"/>
+              </w:rPr>
+            </w:pPr>
+            <w:r>
+              <w:rPr>
+                <w:rFonts w:eastAsia="Calibri" w:cs="Calibri" w:ascii="Calibri" w:hAnsi="Calibri"/>
+              </w:rPr>
+            </w:r>
+          </w:p>
+        </w:tc>
+        <w:tc>
+          <w:tcPr>
+            <w:tcW w:w="3889" w:type="dxa"/>
+            <w:tcBorders>
+              <w:top w:val="single" w:sz="8" w:space="0" w:color="000000"/>
+              <w:start w:val="single" w:sz="8" w:space="0" w:color="000000"/>
+              <w:bottom w:val="single" w:sz="8" w:space="0" w:color="000000"/>
+              <w:end w:val="single" w:sz="8" w:space="0" w:color="000000"/>
+            </w:tcBorders>
+          </w:tcPr>
+          <w:p>
+            <w:pPr>
+              <w:pStyle w:val="normal1"/>
+              <w:widowControl w:val="false"/>
+              <w:suppressAutoHyphens w:val="true"/>
+              <w:spacing w:lineRule="auto" w:line="240" w:before="0" w:after="0"/>
+              <w:jc w:val="start"/>
+              <w:rPr>
+                <w:rFonts w:ascii="Calibri" w:hAnsi="Calibri" w:eastAsia="Calibri" w:cs="Calibri"/>
+              </w:rPr>
+            </w:pPr>
+            <w:r>
+              <w:rPr>
+                <w:rFonts w:eastAsia="Calibri" w:cs="Calibri" w:ascii="Calibri" w:hAnsi="Calibri"/>
+              </w:rPr>
+            </w:r>
+          </w:p>
+        </w:tc>
+        <w:tc>
+          <w:tcPr>
+            <w:tcW w:w="1057" w:type="dxa"/>
             <w:tcBorders>
               <w:top w:val="single" w:sz="8" w:space="0" w:color="000000"/>
               <w:start w:val="single" w:sz="8" w:space="0" w:color="000000"/>
@@ -6212,8 +6076,8 @@
         <w:tblLook w:val="0600" w:firstRow="0" w:noVBand="1" w:lastRow="0" w:firstColumn="0" w:lastColumn="0" w:noHBand="1"/>
       </w:tblPr>
       <w:tblGrid>
-        <w:gridCol w:w="3474"/>
-        <w:gridCol w:w="2826"/>
+        <w:gridCol w:w="3473"/>
+        <w:gridCol w:w="2827"/>
         <w:gridCol w:w="3402"/>
         <w:gridCol w:w="633"/>
       </w:tblGrid>
@@ -6221,7 +6085,7 @@
         <w:trPr/>
         <w:tc>
           <w:tcPr>
-            <w:tcW w:w="3474" w:type="dxa"/>
+            <w:tcW w:w="3473" w:type="dxa"/>
             <w:tcBorders>
               <w:top w:val="single" w:sz="8" w:space="0" w:color="000000"/>
               <w:start w:val="single" w:sz="8" w:space="0" w:color="000000"/>
@@ -6258,7 +6122,7 @@
         </w:tc>
         <w:tc>
           <w:tcPr>
-            <w:tcW w:w="2826" w:type="dxa"/>
+            <w:tcW w:w="2827" w:type="dxa"/>
             <w:tcBorders>
               <w:top w:val="single" w:sz="8" w:space="0" w:color="000000"/>
               <w:start w:val="single" w:sz="8" w:space="0" w:color="000000"/>
@@ -6360,7 +6224,7 @@
         <w:trPr/>
         <w:tc>
           <w:tcPr>
-            <w:tcW w:w="3474" w:type="dxa"/>
+            <w:tcW w:w="3473" w:type="dxa"/>
             <w:tcBorders>
               <w:top w:val="single" w:sz="8" w:space="0" w:color="000000"/>
               <w:start w:val="single" w:sz="8" w:space="0" w:color="000000"/>
@@ -6398,7 +6262,7 @@
         </w:tc>
         <w:tc>
           <w:tcPr>
-            <w:tcW w:w="2826" w:type="dxa"/>
+            <w:tcW w:w="2827" w:type="dxa"/>
             <w:tcBorders>
               <w:top w:val="single" w:sz="8" w:space="0" w:color="000000"/>
               <w:start w:val="single" w:sz="8" w:space="0" w:color="000000"/>
@@ -6515,7 +6379,7 @@
         <w:trPr/>
         <w:tc>
           <w:tcPr>
-            <w:tcW w:w="3474" w:type="dxa"/>
+            <w:tcW w:w="3473" w:type="dxa"/>
             <w:tcBorders>
               <w:top w:val="single" w:sz="8" w:space="0" w:color="000000"/>
               <w:start w:val="single" w:sz="8" w:space="0" w:color="000000"/>
@@ -6544,29 +6408,30 @@
         </w:tc>
         <w:tc>
           <w:tcPr>
-            <w:tcW w:w="2826" w:type="dxa"/>
-            <w:tcBorders>
-              <w:top w:val="single" w:sz="8" w:space="0" w:color="000000"/>
-              <w:start w:val="single" w:sz="8" w:space="0" w:color="000000"/>
-              <w:bottom w:val="single" w:sz="8" w:space="0" w:color="000000"/>
-              <w:end w:val="single" w:sz="8" w:space="0" w:color="000000"/>
-            </w:tcBorders>
-          </w:tcPr>
-          <w:p>
-            <w:pPr>
-              <w:pStyle w:val="normal1"/>
-              <w:widowControl w:val="false"/>
-              <w:suppressAutoHyphens w:val="true"/>
-              <w:spacing w:lineRule="auto" w:line="240" w:before="0" w:after="0"/>
-              <w:jc w:val="start"/>
-              <w:rPr>
-                <w:rFonts w:ascii="Calibri" w:hAnsi="Calibri" w:eastAsia="Calibri" w:cs="Calibri"/>
-              </w:rPr>
-            </w:pPr>
-            <w:r>
-              <w:rPr>
-                <w:rFonts w:eastAsia="Calibri" w:cs="Calibri" w:ascii="Calibri" w:hAnsi="Calibri"/>
-              </w:rPr>
+            <w:tcW w:w="2827" w:type="dxa"/>
+            <w:tcBorders>
+              <w:top w:val="single" w:sz="8" w:space="0" w:color="000000"/>
+              <w:start w:val="single" w:sz="8" w:space="0" w:color="000000"/>
+              <w:bottom w:val="single" w:sz="8" w:space="0" w:color="000000"/>
+              <w:end w:val="single" w:sz="8" w:space="0" w:color="000000"/>
+            </w:tcBorders>
+          </w:tcPr>
+          <w:p>
+            <w:pPr>
+              <w:pStyle w:val="normal1"/>
+              <w:widowControl w:val="false"/>
+              <w:suppressAutoHyphens w:val="true"/>
+              <w:spacing w:lineRule="auto" w:line="240" w:before="0" w:after="0"/>
+              <w:jc w:val="start"/>
+              <w:rPr>
+                <w:rFonts w:ascii="Calibri" w:hAnsi="Calibri" w:eastAsia="Calibri" w:cs="Calibri"/>
+              </w:rPr>
+            </w:pPr>
+            <w:r>
+              <w:rPr>
+                <w:rFonts w:eastAsia="Calibri" w:cs="Calibri" w:ascii="Calibri" w:hAnsi="Calibri"/>
+              </w:rPr>
+              <w:t>Doing the form for sign up</w:t>
             </w:r>
           </w:p>
         </w:tc>
@@ -6677,7 +6542,7 @@
         <w:trPr/>
         <w:tc>
           <w:tcPr>
-            <w:tcW w:w="3474" w:type="dxa"/>
+            <w:tcW w:w="3473" w:type="dxa"/>
             <w:tcBorders>
               <w:start w:val="single" w:sz="8" w:space="0" w:color="000000"/>
               <w:bottom w:val="single" w:sz="8" w:space="0" w:color="000000"/>
@@ -6705,28 +6570,29 @@
         </w:tc>
         <w:tc>
           <w:tcPr>
-            <w:tcW w:w="2826" w:type="dxa"/>
-            <w:tcBorders>
-              <w:start w:val="single" w:sz="8" w:space="0" w:color="000000"/>
-              <w:bottom w:val="single" w:sz="8" w:space="0" w:color="000000"/>
-              <w:end w:val="single" w:sz="8" w:space="0" w:color="000000"/>
-            </w:tcBorders>
-          </w:tcPr>
-          <w:p>
-            <w:pPr>
-              <w:pStyle w:val="normal1"/>
-              <w:widowControl w:val="false"/>
-              <w:suppressAutoHyphens w:val="true"/>
-              <w:spacing w:lineRule="auto" w:line="240" w:before="0" w:after="0"/>
-              <w:jc w:val="start"/>
-              <w:rPr>
-                <w:rFonts w:ascii="Calibri" w:hAnsi="Calibri" w:eastAsia="Calibri" w:cs="Calibri"/>
-              </w:rPr>
-            </w:pPr>
-            <w:r>
-              <w:rPr>
-                <w:rFonts w:eastAsia="Calibri" w:cs="Calibri" w:ascii="Calibri" w:hAnsi="Calibri"/>
-              </w:rPr>
+            <w:tcW w:w="2827" w:type="dxa"/>
+            <w:tcBorders>
+              <w:start w:val="single" w:sz="8" w:space="0" w:color="000000"/>
+              <w:bottom w:val="single" w:sz="8" w:space="0" w:color="000000"/>
+              <w:end w:val="single" w:sz="8" w:space="0" w:color="000000"/>
+            </w:tcBorders>
+          </w:tcPr>
+          <w:p>
+            <w:pPr>
+              <w:pStyle w:val="normal1"/>
+              <w:widowControl w:val="false"/>
+              <w:suppressAutoHyphens w:val="true"/>
+              <w:spacing w:lineRule="auto" w:line="240" w:before="0" w:after="0"/>
+              <w:jc w:val="start"/>
+              <w:rPr>
+                <w:rFonts w:ascii="Calibri" w:hAnsi="Calibri" w:eastAsia="Calibri" w:cs="Calibri"/>
+              </w:rPr>
+            </w:pPr>
+            <w:r>
+              <w:rPr>
+                <w:rFonts w:eastAsia="Calibri" w:cs="Calibri" w:ascii="Calibri" w:hAnsi="Calibri"/>
+              </w:rPr>
+              <w:t>Doing the form for sign up</w:t>
             </w:r>
           </w:p>
         </w:tc>
@@ -6838,7 +6704,7 @@
         </w:trPr>
         <w:tc>
           <w:tcPr>
-            <w:tcW w:w="3474" w:type="dxa"/>
+            <w:tcW w:w="3473" w:type="dxa"/>
             <w:tcBorders>
               <w:top w:val="single" w:sz="8" w:space="0" w:color="000000"/>
               <w:start w:val="single" w:sz="8" w:space="0" w:color="000000"/>
@@ -6867,29 +6733,30 @@
         </w:tc>
         <w:tc>
           <w:tcPr>
-            <w:tcW w:w="2826" w:type="dxa"/>
-            <w:tcBorders>
-              <w:top w:val="single" w:sz="8" w:space="0" w:color="000000"/>
-              <w:start w:val="single" w:sz="8" w:space="0" w:color="000000"/>
-              <w:bottom w:val="single" w:sz="8" w:space="0" w:color="000000"/>
-              <w:end w:val="single" w:sz="8" w:space="0" w:color="000000"/>
-            </w:tcBorders>
-          </w:tcPr>
-          <w:p>
-            <w:pPr>
-              <w:pStyle w:val="normal1"/>
-              <w:widowControl w:val="false"/>
-              <w:suppressAutoHyphens w:val="true"/>
-              <w:spacing w:lineRule="auto" w:line="240" w:before="0" w:after="0"/>
-              <w:jc w:val="start"/>
-              <w:rPr>
-                <w:rFonts w:ascii="Calibri" w:hAnsi="Calibri" w:eastAsia="Calibri" w:cs="Calibri"/>
-              </w:rPr>
-            </w:pPr>
-            <w:r>
-              <w:rPr>
-                <w:rFonts w:eastAsia="Calibri" w:cs="Calibri" w:ascii="Calibri" w:hAnsi="Calibri"/>
-              </w:rPr>
+            <w:tcW w:w="2827" w:type="dxa"/>
+            <w:tcBorders>
+              <w:top w:val="single" w:sz="8" w:space="0" w:color="000000"/>
+              <w:start w:val="single" w:sz="8" w:space="0" w:color="000000"/>
+              <w:bottom w:val="single" w:sz="8" w:space="0" w:color="000000"/>
+              <w:end w:val="single" w:sz="8" w:space="0" w:color="000000"/>
+            </w:tcBorders>
+          </w:tcPr>
+          <w:p>
+            <w:pPr>
+              <w:pStyle w:val="normal1"/>
+              <w:widowControl w:val="false"/>
+              <w:suppressAutoHyphens w:val="true"/>
+              <w:spacing w:lineRule="auto" w:line="240" w:before="0" w:after="0"/>
+              <w:jc w:val="start"/>
+              <w:rPr>
+                <w:rFonts w:ascii="Calibri" w:hAnsi="Calibri" w:eastAsia="Calibri" w:cs="Calibri"/>
+              </w:rPr>
+            </w:pPr>
+            <w:r>
+              <w:rPr>
+                <w:rFonts w:eastAsia="Calibri" w:cs="Calibri" w:ascii="Calibri" w:hAnsi="Calibri"/>
+              </w:rPr>
+              <w:t>Doing the form for sign up</w:t>
             </w:r>
           </w:p>
         </w:tc>
@@ -6992,6 +6859,7 @@
               <w:rPr>
                 <w:rFonts w:eastAsia="Calibri" w:cs="Calibri" w:ascii="Calibri" w:hAnsi="Calibri"/>
               </w:rPr>
+              <w:t>Fail</w:t>
             </w:r>
           </w:p>
         </w:tc>
@@ -7000,7 +6868,7 @@
         <w:trPr/>
         <w:tc>
           <w:tcPr>
-            <w:tcW w:w="3474" w:type="dxa"/>
+            <w:tcW w:w="3473" w:type="dxa"/>
             <w:tcBorders>
               <w:top w:val="single" w:sz="8" w:space="0" w:color="000000"/>
               <w:start w:val="single" w:sz="8" w:space="0" w:color="000000"/>
@@ -7029,29 +6897,30 @@
         </w:tc>
         <w:tc>
           <w:tcPr>
-            <w:tcW w:w="2826" w:type="dxa"/>
-            <w:tcBorders>
-              <w:top w:val="single" w:sz="8" w:space="0" w:color="000000"/>
-              <w:start w:val="single" w:sz="8" w:space="0" w:color="000000"/>
-              <w:bottom w:val="single" w:sz="8" w:space="0" w:color="000000"/>
-              <w:end w:val="single" w:sz="8" w:space="0" w:color="000000"/>
-            </w:tcBorders>
-          </w:tcPr>
-          <w:p>
-            <w:pPr>
-              <w:pStyle w:val="normal1"/>
-              <w:widowControl w:val="false"/>
-              <w:suppressAutoHyphens w:val="true"/>
-              <w:spacing w:lineRule="auto" w:line="240" w:before="0" w:after="0"/>
-              <w:jc w:val="start"/>
-              <w:rPr>
-                <w:rFonts w:ascii="Calibri" w:hAnsi="Calibri" w:eastAsia="Calibri" w:cs="Calibri"/>
-              </w:rPr>
-            </w:pPr>
-            <w:r>
-              <w:rPr>
-                <w:rFonts w:eastAsia="Calibri" w:cs="Calibri" w:ascii="Calibri" w:hAnsi="Calibri"/>
-              </w:rPr>
+            <w:tcW w:w="2827" w:type="dxa"/>
+            <w:tcBorders>
+              <w:top w:val="single" w:sz="8" w:space="0" w:color="000000"/>
+              <w:start w:val="single" w:sz="8" w:space="0" w:color="000000"/>
+              <w:bottom w:val="single" w:sz="8" w:space="0" w:color="000000"/>
+              <w:end w:val="single" w:sz="8" w:space="0" w:color="000000"/>
+            </w:tcBorders>
+          </w:tcPr>
+          <w:p>
+            <w:pPr>
+              <w:pStyle w:val="normal1"/>
+              <w:widowControl w:val="false"/>
+              <w:suppressAutoHyphens w:val="true"/>
+              <w:spacing w:lineRule="auto" w:line="240" w:before="0" w:after="0"/>
+              <w:jc w:val="start"/>
+              <w:rPr>
+                <w:rFonts w:ascii="Calibri" w:hAnsi="Calibri" w:eastAsia="Calibri" w:cs="Calibri"/>
+              </w:rPr>
+            </w:pPr>
+            <w:r>
+              <w:rPr>
+                <w:rFonts w:eastAsia="Calibri" w:cs="Calibri" w:ascii="Calibri" w:hAnsi="Calibri"/>
+              </w:rPr>
+              <w:t>Doing the form for sign up</w:t>
             </w:r>
           </w:p>
         </w:tc>
@@ -7163,7 +7032,7 @@
         <w:trPr/>
         <w:tc>
           <w:tcPr>
-            <w:tcW w:w="3474" w:type="dxa"/>
+            <w:tcW w:w="3473" w:type="dxa"/>
             <w:tcBorders>
               <w:top w:val="single" w:sz="8" w:space="0" w:color="000000"/>
               <w:start w:val="single" w:sz="8" w:space="0" w:color="000000"/>
@@ -7192,7 +7061,7 @@
         </w:tc>
         <w:tc>
           <w:tcPr>
-            <w:tcW w:w="2826" w:type="dxa"/>
+            <w:tcW w:w="2827" w:type="dxa"/>
             <w:tcBorders>
               <w:top w:val="single" w:sz="8" w:space="0" w:color="000000"/>
               <w:start w:val="single" w:sz="8" w:space="0" w:color="000000"/>
@@ -7330,35 +7199,35 @@
         <w:trPr/>
         <w:tc>
           <w:tcPr>
-            <w:tcW w:w="3474" w:type="dxa"/>
-            <w:tcBorders>
-              <w:top w:val="single" w:sz="8" w:space="0" w:color="000000"/>
-              <w:start w:val="single" w:sz="8" w:space="0" w:color="000000"/>
-              <w:bottom w:val="single" w:sz="8" w:space="0" w:color="000000"/>
-              <w:end w:val="single" w:sz="8" w:space="0" w:color="000000"/>
-            </w:tcBorders>
-          </w:tcPr>
-          <w:p>
-            <w:pPr>
-              <w:pStyle w:val="normal1"/>
-              <w:widowControl w:val="false"/>
-              <w:suppressAutoHyphens w:val="true"/>
-              <w:spacing w:lineRule="auto" w:line="240" w:before="0" w:after="0"/>
-              <w:jc w:val="start"/>
-              <w:rPr>
-                <w:rFonts w:ascii="Calibri" w:hAnsi="Calibri" w:eastAsia="Calibri" w:cs="Calibri"/>
-              </w:rPr>
-            </w:pPr>
-            <w:r>
-              <w:rPr>
-                <w:rFonts w:eastAsia="Calibri" w:cs="Calibri" w:ascii="Calibri" w:hAnsi="Calibri"/>
-              </w:rPr>
-            </w:r>
-          </w:p>
-        </w:tc>
-        <w:tc>
-          <w:tcPr>
-            <w:tcW w:w="2826" w:type="dxa"/>
+            <w:tcW w:w="3473" w:type="dxa"/>
+            <w:tcBorders>
+              <w:top w:val="single" w:sz="8" w:space="0" w:color="000000"/>
+              <w:start w:val="single" w:sz="8" w:space="0" w:color="000000"/>
+              <w:bottom w:val="single" w:sz="8" w:space="0" w:color="000000"/>
+              <w:end w:val="single" w:sz="8" w:space="0" w:color="000000"/>
+            </w:tcBorders>
+          </w:tcPr>
+          <w:p>
+            <w:pPr>
+              <w:pStyle w:val="normal1"/>
+              <w:widowControl w:val="false"/>
+              <w:suppressAutoHyphens w:val="true"/>
+              <w:spacing w:lineRule="auto" w:line="240" w:before="0" w:after="0"/>
+              <w:jc w:val="start"/>
+              <w:rPr>
+                <w:rFonts w:ascii="Calibri" w:hAnsi="Calibri" w:eastAsia="Calibri" w:cs="Calibri"/>
+              </w:rPr>
+            </w:pPr>
+            <w:r>
+              <w:rPr>
+                <w:rFonts w:eastAsia="Calibri" w:cs="Calibri" w:ascii="Calibri" w:hAnsi="Calibri"/>
+              </w:rPr>
+            </w:r>
+          </w:p>
+        </w:tc>
+        <w:tc>
+          <w:tcPr>
+            <w:tcW w:w="2827" w:type="dxa"/>
             <w:tcBorders>
               <w:top w:val="single" w:sz="8" w:space="0" w:color="000000"/>
               <w:start w:val="single" w:sz="8" w:space="0" w:color="000000"/>
@@ -7445,35 +7314,35 @@
         <w:trPr/>
         <w:tc>
           <w:tcPr>
-            <w:tcW w:w="3474" w:type="dxa"/>
-            <w:tcBorders>
-              <w:top w:val="single" w:sz="8" w:space="0" w:color="000000"/>
-              <w:start w:val="single" w:sz="8" w:space="0" w:color="000000"/>
-              <w:bottom w:val="single" w:sz="8" w:space="0" w:color="000000"/>
-              <w:end w:val="single" w:sz="8" w:space="0" w:color="000000"/>
-            </w:tcBorders>
-          </w:tcPr>
-          <w:p>
-            <w:pPr>
-              <w:pStyle w:val="normal1"/>
-              <w:widowControl w:val="false"/>
-              <w:suppressAutoHyphens w:val="true"/>
-              <w:spacing w:lineRule="auto" w:line="240" w:before="0" w:after="0"/>
-              <w:jc w:val="start"/>
-              <w:rPr>
-                <w:rFonts w:ascii="Calibri" w:hAnsi="Calibri" w:eastAsia="Calibri" w:cs="Calibri"/>
-              </w:rPr>
-            </w:pPr>
-            <w:r>
-              <w:rPr>
-                <w:rFonts w:eastAsia="Calibri" w:cs="Calibri" w:ascii="Calibri" w:hAnsi="Calibri"/>
-              </w:rPr>
-            </w:r>
-          </w:p>
-        </w:tc>
-        <w:tc>
-          <w:tcPr>
-            <w:tcW w:w="2826" w:type="dxa"/>
+            <w:tcW w:w="3473" w:type="dxa"/>
+            <w:tcBorders>
+              <w:top w:val="single" w:sz="8" w:space="0" w:color="000000"/>
+              <w:start w:val="single" w:sz="8" w:space="0" w:color="000000"/>
+              <w:bottom w:val="single" w:sz="8" w:space="0" w:color="000000"/>
+              <w:end w:val="single" w:sz="8" w:space="0" w:color="000000"/>
+            </w:tcBorders>
+          </w:tcPr>
+          <w:p>
+            <w:pPr>
+              <w:pStyle w:val="normal1"/>
+              <w:widowControl w:val="false"/>
+              <w:suppressAutoHyphens w:val="true"/>
+              <w:spacing w:lineRule="auto" w:line="240" w:before="0" w:after="0"/>
+              <w:jc w:val="start"/>
+              <w:rPr>
+                <w:rFonts w:ascii="Calibri" w:hAnsi="Calibri" w:eastAsia="Calibri" w:cs="Calibri"/>
+              </w:rPr>
+            </w:pPr>
+            <w:r>
+              <w:rPr>
+                <w:rFonts w:eastAsia="Calibri" w:cs="Calibri" w:ascii="Calibri" w:hAnsi="Calibri"/>
+              </w:rPr>
+            </w:r>
+          </w:p>
+        </w:tc>
+        <w:tc>
+          <w:tcPr>
+            <w:tcW w:w="2827" w:type="dxa"/>
             <w:tcBorders>
               <w:top w:val="single" w:sz="8" w:space="0" w:color="000000"/>
               <w:start w:val="single" w:sz="8" w:space="0" w:color="000000"/>
@@ -8530,8 +8399,8 @@
       </w:tblPr>
       <w:tblGrid>
         <w:gridCol w:w="4425"/>
-        <w:gridCol w:w="4944"/>
-        <w:gridCol w:w="546"/>
+        <w:gridCol w:w="4943"/>
+        <w:gridCol w:w="547"/>
       </w:tblGrid>
       <w:tr>
         <w:trPr/>
@@ -8574,7 +8443,7 @@
         </w:tc>
         <w:tc>
           <w:tcPr>
-            <w:tcW w:w="4944" w:type="dxa"/>
+            <w:tcW w:w="4943" w:type="dxa"/>
             <w:tcBorders>
               <w:top w:val="single" w:sz="8" w:space="0" w:color="000000"/>
               <w:start w:val="single" w:sz="8" w:space="0" w:color="000000"/>
@@ -8611,7 +8480,7 @@
         </w:tc>
         <w:tc>
           <w:tcPr>
-            <w:tcW w:w="546" w:type="dxa"/>
+            <w:tcW w:w="547" w:type="dxa"/>
             <w:tcBorders>
               <w:top w:val="single" w:sz="8" w:space="0" w:color="000000"/>
               <w:start w:val="single" w:sz="8" w:space="0" w:color="000000"/>
@@ -8683,7 +8552,7 @@
         </w:tc>
         <w:tc>
           <w:tcPr>
-            <w:tcW w:w="4944" w:type="dxa"/>
+            <w:tcW w:w="4943" w:type="dxa"/>
             <w:tcBorders>
               <w:top w:val="single" w:sz="8" w:space="0" w:color="000000"/>
               <w:start w:val="single" w:sz="8" w:space="0" w:color="000000"/>
@@ -8717,7 +8586,7 @@
         </w:tc>
         <w:tc>
           <w:tcPr>
-            <w:tcW w:w="546" w:type="dxa"/>
+            <w:tcW w:w="547" w:type="dxa"/>
             <w:tcBorders>
               <w:top w:val="single" w:sz="8" w:space="0" w:color="000000"/>
               <w:start w:val="single" w:sz="8" w:space="0" w:color="000000"/>
@@ -8784,7 +8653,7 @@
         </w:tc>
         <w:tc>
           <w:tcPr>
-            <w:tcW w:w="4944" w:type="dxa"/>
+            <w:tcW w:w="4943" w:type="dxa"/>
             <w:tcBorders>
               <w:top w:val="single" w:sz="8" w:space="0" w:color="000000"/>
               <w:start w:val="single" w:sz="8" w:space="0" w:color="000000"/>
@@ -8883,7 +8752,7 @@
         </w:tc>
         <w:tc>
           <w:tcPr>
-            <w:tcW w:w="546" w:type="dxa"/>
+            <w:tcW w:w="547" w:type="dxa"/>
             <w:tcBorders>
               <w:top w:val="single" w:sz="8" w:space="0" w:color="000000"/>
               <w:start w:val="single" w:sz="8" w:space="0" w:color="000000"/>
@@ -8950,7 +8819,7 @@
         </w:tc>
         <w:tc>
           <w:tcPr>
-            <w:tcW w:w="4944" w:type="dxa"/>
+            <w:tcW w:w="4943" w:type="dxa"/>
             <w:tcBorders>
               <w:top w:val="single" w:sz="8" w:space="0" w:color="000000"/>
               <w:start w:val="single" w:sz="8" w:space="0" w:color="000000"/>
@@ -8984,7 +8853,7 @@
         </w:tc>
         <w:tc>
           <w:tcPr>
-            <w:tcW w:w="546" w:type="dxa"/>
+            <w:tcW w:w="547" w:type="dxa"/>
             <w:tcBorders>
               <w:top w:val="single" w:sz="8" w:space="0" w:color="000000"/>
               <w:start w:val="single" w:sz="8" w:space="0" w:color="000000"/>
@@ -9051,7 +8920,7 @@
         </w:tc>
         <w:tc>
           <w:tcPr>
-            <w:tcW w:w="4944" w:type="dxa"/>
+            <w:tcW w:w="4943" w:type="dxa"/>
             <w:tcBorders>
               <w:top w:val="single" w:sz="8" w:space="0" w:color="000000"/>
               <w:start w:val="single" w:sz="8" w:space="0" w:color="000000"/>
@@ -9085,7 +8954,7 @@
         </w:tc>
         <w:tc>
           <w:tcPr>
-            <w:tcW w:w="546" w:type="dxa"/>
+            <w:tcW w:w="547" w:type="dxa"/>
             <w:tcBorders>
               <w:top w:val="single" w:sz="8" w:space="0" w:color="000000"/>
               <w:start w:val="single" w:sz="8" w:space="0" w:color="000000"/>
@@ -9155,7 +9024,7 @@
         </w:tc>
         <w:tc>
           <w:tcPr>
-            <w:tcW w:w="4944" w:type="dxa"/>
+            <w:tcW w:w="4943" w:type="dxa"/>
             <w:tcBorders>
               <w:top w:val="single" w:sz="8" w:space="0" w:color="000000"/>
               <w:start w:val="single" w:sz="8" w:space="0" w:color="000000"/>
@@ -9186,7 +9055,7 @@
         </w:tc>
         <w:tc>
           <w:tcPr>
-            <w:tcW w:w="546" w:type="dxa"/>
+            <w:tcW w:w="547" w:type="dxa"/>
             <w:tcBorders>
               <w:top w:val="single" w:sz="8" w:space="0" w:color="000000"/>
               <w:start w:val="single" w:sz="8" w:space="0" w:color="000000"/>
@@ -9254,7 +9123,7 @@
         </w:tc>
         <w:tc>
           <w:tcPr>
-            <w:tcW w:w="4944" w:type="dxa"/>
+            <w:tcW w:w="4943" w:type="dxa"/>
             <w:tcBorders>
               <w:top w:val="single" w:sz="8" w:space="0" w:color="000000"/>
               <w:start w:val="single" w:sz="8" w:space="0" w:color="000000"/>
@@ -9311,7 +9180,7 @@
         </w:tc>
         <w:tc>
           <w:tcPr>
-            <w:tcW w:w="546" w:type="dxa"/>
+            <w:tcW w:w="547" w:type="dxa"/>
             <w:tcBorders>
               <w:top w:val="single" w:sz="8" w:space="0" w:color="000000"/>
               <w:start w:val="single" w:sz="8" w:space="0" w:color="000000"/>
@@ -9378,7 +9247,7 @@
         </w:tc>
         <w:tc>
           <w:tcPr>
-            <w:tcW w:w="4944" w:type="dxa"/>
+            <w:tcW w:w="4943" w:type="dxa"/>
             <w:tcBorders>
               <w:top w:val="single" w:sz="8" w:space="0" w:color="000000"/>
               <w:start w:val="single" w:sz="8" w:space="0" w:color="000000"/>
@@ -9435,7 +9304,7 @@
         </w:tc>
         <w:tc>
           <w:tcPr>
-            <w:tcW w:w="546" w:type="dxa"/>
+            <w:tcW w:w="547" w:type="dxa"/>
             <w:tcBorders>
               <w:top w:val="single" w:sz="8" w:space="0" w:color="000000"/>
               <w:start w:val="single" w:sz="8" w:space="0" w:color="000000"/>
@@ -9505,7 +9374,7 @@
         </w:tc>
         <w:tc>
           <w:tcPr>
-            <w:tcW w:w="4944" w:type="dxa"/>
+            <w:tcW w:w="4943" w:type="dxa"/>
             <w:tcBorders>
               <w:top w:val="single" w:sz="8" w:space="0" w:color="000000"/>
               <w:start w:val="single" w:sz="8" w:space="0" w:color="000000"/>
@@ -9536,7 +9405,7 @@
         </w:tc>
         <w:tc>
           <w:tcPr>
-            <w:tcW w:w="546" w:type="dxa"/>
+            <w:tcW w:w="547" w:type="dxa"/>
             <w:tcBorders>
               <w:top w:val="single" w:sz="8" w:space="0" w:color="000000"/>
               <w:start w:val="single" w:sz="8" w:space="0" w:color="000000"/>
@@ -9604,7 +9473,7 @@
         </w:tc>
         <w:tc>
           <w:tcPr>
-            <w:tcW w:w="4944" w:type="dxa"/>
+            <w:tcW w:w="4943" w:type="dxa"/>
             <w:tcBorders>
               <w:top w:val="single" w:sz="8" w:space="0" w:color="000000"/>
               <w:start w:val="single" w:sz="8" w:space="0" w:color="000000"/>
@@ -9638,7 +9507,7 @@
         </w:tc>
         <w:tc>
           <w:tcPr>
-            <w:tcW w:w="546" w:type="dxa"/>
+            <w:tcW w:w="547" w:type="dxa"/>
             <w:tcBorders>
               <w:top w:val="single" w:sz="8" w:space="0" w:color="000000"/>
               <w:start w:val="single" w:sz="8" w:space="0" w:color="000000"/>
@@ -9708,7 +9577,7 @@
         </w:tc>
         <w:tc>
           <w:tcPr>
-            <w:tcW w:w="4944" w:type="dxa"/>
+            <w:tcW w:w="4943" w:type="dxa"/>
             <w:tcBorders>
               <w:top w:val="single" w:sz="8" w:space="0" w:color="000000"/>
               <w:start w:val="single" w:sz="8" w:space="0" w:color="000000"/>
@@ -9742,7 +9611,7 @@
         </w:tc>
         <w:tc>
           <w:tcPr>
-            <w:tcW w:w="546" w:type="dxa"/>
+            <w:tcW w:w="547" w:type="dxa"/>
             <w:tcBorders>
               <w:top w:val="single" w:sz="8" w:space="0" w:color="000000"/>
               <w:start w:val="single" w:sz="8" w:space="0" w:color="000000"/>
@@ -9810,7 +9679,7 @@
         </w:tc>
         <w:tc>
           <w:tcPr>
-            <w:tcW w:w="4944" w:type="dxa"/>
+            <w:tcW w:w="4943" w:type="dxa"/>
             <w:tcBorders>
               <w:top w:val="single" w:sz="8" w:space="0" w:color="000000"/>
               <w:start w:val="single" w:sz="8" w:space="0" w:color="000000"/>
@@ -9844,7 +9713,7 @@
         </w:tc>
         <w:tc>
           <w:tcPr>
-            <w:tcW w:w="546" w:type="dxa"/>
+            <w:tcW w:w="547" w:type="dxa"/>
             <w:tcBorders>
               <w:top w:val="single" w:sz="8" w:space="0" w:color="000000"/>
               <w:start w:val="single" w:sz="8" w:space="0" w:color="000000"/>
@@ -10030,15 +9899,15 @@
         <w:tblLook w:val="0600" w:firstRow="0" w:noVBand="1" w:lastRow="0" w:firstColumn="0" w:lastColumn="0" w:noHBand="1"/>
       </w:tblPr>
       <w:tblGrid>
-        <w:gridCol w:w="4494"/>
+        <w:gridCol w:w="4493"/>
         <w:gridCol w:w="4965"/>
-        <w:gridCol w:w="561"/>
+        <w:gridCol w:w="562"/>
       </w:tblGrid>
       <w:tr>
         <w:trPr/>
         <w:tc>
           <w:tcPr>
-            <w:tcW w:w="4494" w:type="dxa"/>
+            <w:tcW w:w="4493" w:type="dxa"/>
             <w:tcBorders>
               <w:top w:val="single" w:sz="8" w:space="0" w:color="000000"/>
               <w:start w:val="single" w:sz="8" w:space="0" w:color="000000"/>
@@ -10112,7 +9981,7 @@
         </w:tc>
         <w:tc>
           <w:tcPr>
-            <w:tcW w:w="561" w:type="dxa"/>
+            <w:tcW w:w="562" w:type="dxa"/>
             <w:tcBorders>
               <w:top w:val="single" w:sz="8" w:space="0" w:color="000000"/>
               <w:start w:val="single" w:sz="8" w:space="0" w:color="000000"/>
@@ -10146,7 +10015,7 @@
         <w:trPr/>
         <w:tc>
           <w:tcPr>
-            <w:tcW w:w="4494" w:type="dxa"/>
+            <w:tcW w:w="4493" w:type="dxa"/>
             <w:tcBorders>
               <w:top w:val="single" w:sz="8" w:space="0" w:color="000000"/>
               <w:start w:val="single" w:sz="8" w:space="0" w:color="000000"/>
@@ -10214,7 +10083,7 @@
         </w:tc>
         <w:tc>
           <w:tcPr>
-            <w:tcW w:w="561" w:type="dxa"/>
+            <w:tcW w:w="562" w:type="dxa"/>
             <w:tcBorders>
               <w:top w:val="single" w:sz="8" w:space="0" w:color="000000"/>
               <w:start w:val="single" w:sz="8" w:space="0" w:color="000000"/>
@@ -10247,7 +10116,7 @@
         <w:trPr/>
         <w:tc>
           <w:tcPr>
-            <w:tcW w:w="4494" w:type="dxa"/>
+            <w:tcW w:w="4493" w:type="dxa"/>
             <w:tcBorders>
               <w:top w:val="single" w:sz="8" w:space="0" w:color="000000"/>
               <w:start w:val="single" w:sz="8" w:space="0" w:color="000000"/>
@@ -10315,7 +10184,7 @@
         </w:tc>
         <w:tc>
           <w:tcPr>
-            <w:tcW w:w="561" w:type="dxa"/>
+            <w:tcW w:w="562" w:type="dxa"/>
             <w:tcBorders>
               <w:top w:val="single" w:sz="8" w:space="0" w:color="000000"/>
               <w:start w:val="single" w:sz="8" w:space="0" w:color="000000"/>
@@ -10348,7 +10217,7 @@
         <w:trPr/>
         <w:tc>
           <w:tcPr>
-            <w:tcW w:w="4494" w:type="dxa"/>
+            <w:tcW w:w="4493" w:type="dxa"/>
             <w:tcBorders>
               <w:top w:val="single" w:sz="8" w:space="0" w:color="000000"/>
               <w:start w:val="single" w:sz="8" w:space="0" w:color="000000"/>
@@ -10416,7 +10285,7 @@
         </w:tc>
         <w:tc>
           <w:tcPr>
-            <w:tcW w:w="561" w:type="dxa"/>
+            <w:tcW w:w="562" w:type="dxa"/>
             <w:tcBorders>
               <w:top w:val="single" w:sz="8" w:space="0" w:color="000000"/>
               <w:start w:val="single" w:sz="8" w:space="0" w:color="000000"/>
@@ -10449,7 +10318,7 @@
         <w:trPr/>
         <w:tc>
           <w:tcPr>
-            <w:tcW w:w="4494" w:type="dxa"/>
+            <w:tcW w:w="4493" w:type="dxa"/>
             <w:tcBorders>
               <w:top w:val="single" w:sz="8" w:space="0" w:color="000000"/>
               <w:start w:val="single" w:sz="8" w:space="0" w:color="000000"/>
@@ -10517,7 +10386,7 @@
         </w:tc>
         <w:tc>
           <w:tcPr>
-            <w:tcW w:w="561" w:type="dxa"/>
+            <w:tcW w:w="562" w:type="dxa"/>
             <w:tcBorders>
               <w:top w:val="single" w:sz="8" w:space="0" w:color="000000"/>
               <w:start w:val="single" w:sz="8" w:space="0" w:color="000000"/>
@@ -10550,7 +10419,7 @@
         <w:trPr/>
         <w:tc>
           <w:tcPr>
-            <w:tcW w:w="4494" w:type="dxa"/>
+            <w:tcW w:w="4493" w:type="dxa"/>
             <w:tcBorders>
               <w:top w:val="single" w:sz="8" w:space="0" w:color="000000"/>
               <w:start w:val="single" w:sz="8" w:space="0" w:color="000000"/>
@@ -10618,7 +10487,7 @@
         </w:tc>
         <w:tc>
           <w:tcPr>
-            <w:tcW w:w="561" w:type="dxa"/>
+            <w:tcW w:w="562" w:type="dxa"/>
             <w:tcBorders>
               <w:top w:val="single" w:sz="8" w:space="0" w:color="000000"/>
               <w:start w:val="single" w:sz="8" w:space="0" w:color="000000"/>
@@ -10652,7 +10521,7 @@
         <w:trPr/>
         <w:tc>
           <w:tcPr>
-            <w:tcW w:w="4494" w:type="dxa"/>
+            <w:tcW w:w="4493" w:type="dxa"/>
             <w:tcBorders>
               <w:top w:val="single" w:sz="8" w:space="0" w:color="000000"/>
               <w:start w:val="single" w:sz="8" w:space="0" w:color="000000"/>
@@ -10720,7 +10589,7 @@
         </w:tc>
         <w:tc>
           <w:tcPr>
-            <w:tcW w:w="561" w:type="dxa"/>
+            <w:tcW w:w="562" w:type="dxa"/>
             <w:tcBorders>
               <w:top w:val="single" w:sz="8" w:space="0" w:color="000000"/>
               <w:start w:val="single" w:sz="8" w:space="0" w:color="000000"/>
@@ -10753,7 +10622,7 @@
         <w:trPr/>
         <w:tc>
           <w:tcPr>
-            <w:tcW w:w="4494" w:type="dxa"/>
+            <w:tcW w:w="4493" w:type="dxa"/>
             <w:tcBorders>
               <w:top w:val="single" w:sz="8" w:space="0" w:color="000000"/>
               <w:start w:val="single" w:sz="8" w:space="0" w:color="000000"/>
@@ -10821,7 +10690,7 @@
         </w:tc>
         <w:tc>
           <w:tcPr>
-            <w:tcW w:w="561" w:type="dxa"/>
+            <w:tcW w:w="562" w:type="dxa"/>
             <w:tcBorders>
               <w:top w:val="single" w:sz="8" w:space="0" w:color="000000"/>
               <w:start w:val="single" w:sz="8" w:space="0" w:color="000000"/>
@@ -10854,7 +10723,7 @@
         <w:trPr/>
         <w:tc>
           <w:tcPr>
-            <w:tcW w:w="4494" w:type="dxa"/>
+            <w:tcW w:w="4493" w:type="dxa"/>
             <w:tcBorders>
               <w:top w:val="single" w:sz="8" w:space="0" w:color="000000"/>
               <w:start w:val="single" w:sz="8" w:space="0" w:color="000000"/>
@@ -10924,7 +10793,7 @@
         </w:tc>
         <w:tc>
           <w:tcPr>
-            <w:tcW w:w="561" w:type="dxa"/>
+            <w:tcW w:w="562" w:type="dxa"/>
             <w:tcBorders>
               <w:top w:val="single" w:sz="8" w:space="0" w:color="000000"/>
               <w:start w:val="single" w:sz="8" w:space="0" w:color="000000"/>
@@ -10958,7 +10827,7 @@
         <w:trPr/>
         <w:tc>
           <w:tcPr>
-            <w:tcW w:w="4494" w:type="dxa"/>
+            <w:tcW w:w="4493" w:type="dxa"/>
             <w:tcBorders>
               <w:top w:val="single" w:sz="8" w:space="0" w:color="000000"/>
               <w:start w:val="single" w:sz="8" w:space="0" w:color="000000"/>
@@ -11026,7 +10895,7 @@
         </w:tc>
         <w:tc>
           <w:tcPr>
-            <w:tcW w:w="561" w:type="dxa"/>
+            <w:tcW w:w="562" w:type="dxa"/>
             <w:tcBorders>
               <w:top w:val="single" w:sz="8" w:space="0" w:color="000000"/>
               <w:start w:val="single" w:sz="8" w:space="0" w:color="000000"/>
@@ -11064,7 +10933,7 @@
         <w:trPr/>
         <w:tc>
           <w:tcPr>
-            <w:tcW w:w="4494" w:type="dxa"/>
+            <w:tcW w:w="4493" w:type="dxa"/>
             <w:tcBorders>
               <w:top w:val="single" w:sz="8" w:space="0" w:color="000000"/>
               <w:start w:val="single" w:sz="8" w:space="0" w:color="000000"/>
@@ -11132,7 +11001,7 @@
         </w:tc>
         <w:tc>
           <w:tcPr>
-            <w:tcW w:w="561" w:type="dxa"/>
+            <w:tcW w:w="562" w:type="dxa"/>
             <w:tcBorders>
               <w:top w:val="single" w:sz="8" w:space="0" w:color="000000"/>
               <w:start w:val="single" w:sz="8" w:space="0" w:color="000000"/>
@@ -11333,15 +11202,15 @@
         <w:tblLook w:val="0600" w:firstRow="0" w:noVBand="1" w:lastRow="0" w:firstColumn="0" w:lastColumn="0" w:noHBand="1"/>
       </w:tblPr>
       <w:tblGrid>
-        <w:gridCol w:w="4494"/>
-        <w:gridCol w:w="5046"/>
+        <w:gridCol w:w="4493"/>
+        <w:gridCol w:w="5047"/>
         <w:gridCol w:w="480"/>
       </w:tblGrid>
       <w:tr>
         <w:trPr/>
         <w:tc>
           <w:tcPr>
-            <w:tcW w:w="4494" w:type="dxa"/>
+            <w:tcW w:w="4493" w:type="dxa"/>
             <w:tcBorders>
               <w:top w:val="single" w:sz="8" w:space="0" w:color="000000"/>
               <w:start w:val="single" w:sz="8" w:space="0" w:color="000000"/>
@@ -11378,7 +11247,7 @@
         </w:tc>
         <w:tc>
           <w:tcPr>
-            <w:tcW w:w="5046" w:type="dxa"/>
+            <w:tcW w:w="5047" w:type="dxa"/>
             <w:tcBorders>
               <w:top w:val="single" w:sz="8" w:space="0" w:color="000000"/>
               <w:start w:val="single" w:sz="8" w:space="0" w:color="000000"/>
@@ -11449,7 +11318,7 @@
         <w:trPr/>
         <w:tc>
           <w:tcPr>
-            <w:tcW w:w="4494" w:type="dxa"/>
+            <w:tcW w:w="4493" w:type="dxa"/>
             <w:tcBorders>
               <w:top w:val="single" w:sz="8" w:space="0" w:color="000000"/>
               <w:start w:val="single" w:sz="8" w:space="0" w:color="000000"/>
@@ -11483,7 +11352,7 @@
         </w:tc>
         <w:tc>
           <w:tcPr>
-            <w:tcW w:w="5046" w:type="dxa"/>
+            <w:tcW w:w="5047" w:type="dxa"/>
             <w:tcBorders>
               <w:top w:val="single" w:sz="8" w:space="0" w:color="000000"/>
               <w:start w:val="single" w:sz="8" w:space="0" w:color="000000"/>
@@ -11550,7 +11419,7 @@
         <w:trPr/>
         <w:tc>
           <w:tcPr>
-            <w:tcW w:w="4494" w:type="dxa"/>
+            <w:tcW w:w="4493" w:type="dxa"/>
             <w:tcBorders>
               <w:top w:val="single" w:sz="8" w:space="0" w:color="000000"/>
               <w:start w:val="single" w:sz="8" w:space="0" w:color="000000"/>
@@ -11584,7 +11453,7 @@
         </w:tc>
         <w:tc>
           <w:tcPr>
-            <w:tcW w:w="5046" w:type="dxa"/>
+            <w:tcW w:w="5047" w:type="dxa"/>
             <w:tcBorders>
               <w:top w:val="single" w:sz="8" w:space="0" w:color="000000"/>
               <w:start w:val="single" w:sz="8" w:space="0" w:color="000000"/>
@@ -11727,7 +11596,7 @@
         <w:trPr/>
         <w:tc>
           <w:tcPr>
-            <w:tcW w:w="4494" w:type="dxa"/>
+            <w:tcW w:w="4493" w:type="dxa"/>
             <w:tcBorders>
               <w:top w:val="single" w:sz="8" w:space="0" w:color="000000"/>
               <w:start w:val="single" w:sz="8" w:space="0" w:color="000000"/>
@@ -11761,7 +11630,7 @@
         </w:tc>
         <w:tc>
           <w:tcPr>
-            <w:tcW w:w="5046" w:type="dxa"/>
+            <w:tcW w:w="5047" w:type="dxa"/>
             <w:tcBorders>
               <w:top w:val="single" w:sz="8" w:space="0" w:color="000000"/>
               <w:start w:val="single" w:sz="8" w:space="0" w:color="000000"/>
@@ -11828,7 +11697,7 @@
         <w:trPr/>
         <w:tc>
           <w:tcPr>
-            <w:tcW w:w="4494" w:type="dxa"/>
+            <w:tcW w:w="4493" w:type="dxa"/>
             <w:tcBorders>
               <w:top w:val="single" w:sz="8" w:space="0" w:color="000000"/>
               <w:start w:val="single" w:sz="8" w:space="0" w:color="000000"/>
@@ -11862,7 +11731,7 @@
         </w:tc>
         <w:tc>
           <w:tcPr>
-            <w:tcW w:w="5046" w:type="dxa"/>
+            <w:tcW w:w="5047" w:type="dxa"/>
             <w:tcBorders>
               <w:top w:val="single" w:sz="8" w:space="0" w:color="000000"/>
               <w:start w:val="single" w:sz="8" w:space="0" w:color="000000"/>
@@ -11929,7 +11798,7 @@
         <w:trPr/>
         <w:tc>
           <w:tcPr>
-            <w:tcW w:w="4494" w:type="dxa"/>
+            <w:tcW w:w="4493" w:type="dxa"/>
             <w:tcBorders>
               <w:top w:val="single" w:sz="8" w:space="0" w:color="000000"/>
               <w:start w:val="single" w:sz="8" w:space="0" w:color="000000"/>
@@ -11966,7 +11835,7 @@
         </w:tc>
         <w:tc>
           <w:tcPr>
-            <w:tcW w:w="5046" w:type="dxa"/>
+            <w:tcW w:w="5047" w:type="dxa"/>
             <w:tcBorders>
               <w:top w:val="single" w:sz="8" w:space="0" w:color="000000"/>
               <w:start w:val="single" w:sz="8" w:space="0" w:color="000000"/>
@@ -12031,7 +11900,7 @@
         <w:trPr/>
         <w:tc>
           <w:tcPr>
-            <w:tcW w:w="4494" w:type="dxa"/>
+            <w:tcW w:w="4493" w:type="dxa"/>
             <w:tcBorders>
               <w:top w:val="single" w:sz="8" w:space="0" w:color="000000"/>
               <w:start w:val="single" w:sz="8" w:space="0" w:color="000000"/>
@@ -12065,7 +11934,7 @@
         </w:tc>
         <w:tc>
           <w:tcPr>
-            <w:tcW w:w="5046" w:type="dxa"/>
+            <w:tcW w:w="5047" w:type="dxa"/>
             <w:tcBorders>
               <w:top w:val="single" w:sz="8" w:space="0" w:color="000000"/>
               <w:start w:val="single" w:sz="8" w:space="0" w:color="000000"/>
@@ -12132,7 +12001,7 @@
         <w:trPr/>
         <w:tc>
           <w:tcPr>
-            <w:tcW w:w="4494" w:type="dxa"/>
+            <w:tcW w:w="4493" w:type="dxa"/>
             <w:tcBorders>
               <w:top w:val="single" w:sz="8" w:space="0" w:color="000000"/>
               <w:start w:val="single" w:sz="8" w:space="0" w:color="000000"/>
@@ -12168,7 +12037,7 @@
         </w:tc>
         <w:tc>
           <w:tcPr>
-            <w:tcW w:w="5046" w:type="dxa"/>
+            <w:tcW w:w="5047" w:type="dxa"/>
             <w:tcBorders>
               <w:top w:val="single" w:sz="8" w:space="0" w:color="000000"/>
               <w:start w:val="single" w:sz="8" w:space="0" w:color="000000"/>
@@ -12235,7 +12104,7 @@
         <w:trPr/>
         <w:tc>
           <w:tcPr>
-            <w:tcW w:w="4494" w:type="dxa"/>
+            <w:tcW w:w="4493" w:type="dxa"/>
             <w:tcBorders>
               <w:top w:val="single" w:sz="8" w:space="0" w:color="000000"/>
               <w:start w:val="single" w:sz="8" w:space="0" w:color="000000"/>
@@ -12269,7 +12138,7 @@
         </w:tc>
         <w:tc>
           <w:tcPr>
-            <w:tcW w:w="5046" w:type="dxa"/>
+            <w:tcW w:w="5047" w:type="dxa"/>
             <w:tcBorders>
               <w:top w:val="single" w:sz="8" w:space="0" w:color="000000"/>
               <w:start w:val="single" w:sz="8" w:space="0" w:color="000000"/>
@@ -12336,7 +12205,7 @@
         <w:trPr/>
         <w:tc>
           <w:tcPr>
-            <w:tcW w:w="4494" w:type="dxa"/>
+            <w:tcW w:w="4493" w:type="dxa"/>
             <w:tcBorders>
               <w:top w:val="single" w:sz="8" w:space="0" w:color="000000"/>
               <w:start w:val="single" w:sz="8" w:space="0" w:color="000000"/>
@@ -12373,7 +12242,7 @@
         </w:tc>
         <w:tc>
           <w:tcPr>
-            <w:tcW w:w="5046" w:type="dxa"/>
+            <w:tcW w:w="5047" w:type="dxa"/>
             <w:tcBorders>
               <w:top w:val="single" w:sz="8" w:space="0" w:color="000000"/>
               <w:start w:val="single" w:sz="8" w:space="0" w:color="000000"/>
@@ -12438,7 +12307,7 @@
         <w:trPr/>
         <w:tc>
           <w:tcPr>
-            <w:tcW w:w="4494" w:type="dxa"/>
+            <w:tcW w:w="4493" w:type="dxa"/>
             <w:tcBorders>
               <w:top w:val="single" w:sz="8" w:space="0" w:color="000000"/>
               <w:start w:val="single" w:sz="8" w:space="0" w:color="000000"/>
@@ -12472,7 +12341,7 @@
         </w:tc>
         <w:tc>
           <w:tcPr>
-            <w:tcW w:w="5046" w:type="dxa"/>
+            <w:tcW w:w="5047" w:type="dxa"/>
             <w:tcBorders>
               <w:top w:val="single" w:sz="8" w:space="0" w:color="000000"/>
               <w:start w:val="single" w:sz="8" w:space="0" w:color="000000"/>
@@ -12540,7 +12409,7 @@
         <w:trPr/>
         <w:tc>
           <w:tcPr>
-            <w:tcW w:w="4494" w:type="dxa"/>
+            <w:tcW w:w="4493" w:type="dxa"/>
             <w:tcBorders>
               <w:top w:val="single" w:sz="8" w:space="0" w:color="000000"/>
               <w:start w:val="single" w:sz="8" w:space="0" w:color="000000"/>
@@ -12574,7 +12443,7 @@
         </w:tc>
         <w:tc>
           <w:tcPr>
-            <w:tcW w:w="5046" w:type="dxa"/>
+            <w:tcW w:w="5047" w:type="dxa"/>
             <w:tcBorders>
               <w:top w:val="single" w:sz="8" w:space="0" w:color="000000"/>
               <w:start w:val="single" w:sz="8" w:space="0" w:color="000000"/>
@@ -12642,7 +12511,7 @@
         <w:trPr/>
         <w:tc>
           <w:tcPr>
-            <w:tcW w:w="4494" w:type="dxa"/>
+            <w:tcW w:w="4493" w:type="dxa"/>
             <w:tcBorders>
               <w:top w:val="single" w:sz="8" w:space="0" w:color="000000"/>
               <w:start w:val="single" w:sz="8" w:space="0" w:color="000000"/>
@@ -12676,7 +12545,7 @@
         </w:tc>
         <w:tc>
           <w:tcPr>
-            <w:tcW w:w="5046" w:type="dxa"/>
+            <w:tcW w:w="5047" w:type="dxa"/>
             <w:tcBorders>
               <w:top w:val="single" w:sz="8" w:space="0" w:color="000000"/>
               <w:start w:val="single" w:sz="8" w:space="0" w:color="000000"/>
@@ -13077,7 +12946,7 @@
         </wp:inline>
       </w:drawing>
       <w:drawing>
-        <wp:anchor distT="0" distB="0" distL="0" distR="0" simplePos="0" relativeHeight="15" behindDoc="1" locked="0" layoutInCell="1" allowOverlap="1">
+        <wp:anchor distT="0" distB="0" distL="0" distR="0" simplePos="0" relativeHeight="30" behindDoc="1" locked="0" layoutInCell="1" allowOverlap="1">
           <wp:simplePos x="0" y="0"/>
           <wp:positionH relativeFrom="column">
             <wp:posOffset>6045200</wp:posOffset>
@@ -13103,7 +12972,7 @@
                 </pic:nvPicPr>
                 <pic:blipFill>
                   <a:blip r:embed="rId2"/>
-                  <a:srcRect l="0" t="0" r="60816" b="0"/>
+                  <a:srcRect l="0" t="0" r="60825" b="0"/>
                   <a:stretch>
                     <a:fillRect/>
                   </a:stretch>
@@ -13186,7 +13055,7 @@
         </wp:inline>
       </w:drawing>
       <w:drawing>
-        <wp:anchor distT="0" distB="0" distL="0" distR="0" simplePos="0" relativeHeight="15" behindDoc="1" locked="0" layoutInCell="1" allowOverlap="1">
+        <wp:anchor distT="0" distB="0" distL="0" distR="0" simplePos="0" relativeHeight="30" behindDoc="1" locked="0" layoutInCell="1" allowOverlap="1">
           <wp:simplePos x="0" y="0"/>
           <wp:positionH relativeFrom="column">
             <wp:posOffset>6045200</wp:posOffset>
@@ -13212,7 +13081,7 @@
                 </pic:nvPicPr>
                 <pic:blipFill>
                   <a:blip r:embed="rId2"/>
-                  <a:srcRect l="0" t="0" r="60816" b="0"/>
+                  <a:srcRect l="0" t="0" r="60825" b="0"/>
                   <a:stretch>
                     <a:fillRect/>
                   </a:stretch>

</xml_diff>

<commit_message>
21/09 - user fav list pls do. Also add stuff to sprints, work on the three one tho.
</commit_message>
<xml_diff>
--- a/L3 Web Application Development Log.docx
+++ b/L3 Web Application Development Log.docx
@@ -626,40 +626,6 @@
                   </a:graphic>
                 </wp:anchor>
               </w:drawing>
-            </w:r>
-          </w:p>
-          <w:p>
-            <w:pPr>
-              <w:pStyle w:val="normal1"/>
-              <w:widowControl w:val="false"/>
-              <w:suppressAutoHyphens w:val="true"/>
-              <w:spacing w:lineRule="auto" w:line="240" w:before="0" w:after="0"/>
-              <w:jc w:val="start"/>
-              <w:rPr>
-                <w:rFonts w:ascii="Calibri" w:hAnsi="Calibri" w:eastAsia="Calibri" w:cs="Calibri"/>
-              </w:rPr>
-            </w:pPr>
-            <w:r>
-              <w:rPr>
-                <w:rFonts w:eastAsia="Calibri" w:cs="Calibri" w:ascii="Calibri" w:hAnsi="Calibri"/>
-              </w:rPr>
-            </w:r>
-          </w:p>
-          <w:p>
-            <w:pPr>
-              <w:pStyle w:val="normal1"/>
-              <w:widowControl w:val="false"/>
-              <w:suppressAutoHyphens w:val="true"/>
-              <w:spacing w:lineRule="auto" w:line="240" w:before="0" w:after="0"/>
-              <w:jc w:val="start"/>
-              <w:rPr>
-                <w:rFonts w:ascii="Calibri" w:hAnsi="Calibri" w:eastAsia="Calibri" w:cs="Calibri"/>
-              </w:rPr>
-            </w:pPr>
-            <w:r>
-              <w:rPr>
-                <w:rFonts w:eastAsia="Calibri" w:cs="Calibri" w:ascii="Calibri" w:hAnsi="Calibri"/>
-              </w:rPr>
             </w:r>
           </w:p>
           <w:p>
@@ -1466,7 +1432,8 @@
     </w:tbl>
     <w:p>
       <w:pPr>
-        <w:pStyle w:val="normal1"/>
+        <w:pStyle w:val="Heading4"/>
+        <w:spacing w:lineRule="auto" w:line="276"/>
         <w:rPr/>
       </w:pPr>
       <w:r>
@@ -1513,8 +1480,8 @@
       </w:tblPr>
       <w:tblGrid>
         <w:gridCol w:w="3480"/>
-        <w:gridCol w:w="2466"/>
-        <w:gridCol w:w="3440"/>
+        <w:gridCol w:w="2465"/>
+        <w:gridCol w:w="3441"/>
         <w:gridCol w:w="1069"/>
       </w:tblGrid>
       <w:tr>
@@ -1558,7 +1525,7 @@
         </w:tc>
         <w:tc>
           <w:tcPr>
-            <w:tcW w:w="2466" w:type="dxa"/>
+            <w:tcW w:w="2465" w:type="dxa"/>
             <w:tcBorders>
               <w:top w:val="single" w:sz="8" w:space="0" w:color="000000"/>
               <w:start w:val="single" w:sz="8" w:space="0" w:color="000000"/>
@@ -1591,7 +1558,7 @@
         </w:tc>
         <w:tc>
           <w:tcPr>
-            <w:tcW w:w="3440" w:type="dxa"/>
+            <w:tcW w:w="3441" w:type="dxa"/>
             <w:tcBorders>
               <w:top w:val="single" w:sz="8" w:space="0" w:color="000000"/>
               <w:start w:val="single" w:sz="8" w:space="0" w:color="000000"/>
@@ -1698,7 +1665,7 @@
         </w:tc>
         <w:tc>
           <w:tcPr>
-            <w:tcW w:w="2466" w:type="dxa"/>
+            <w:tcW w:w="2465" w:type="dxa"/>
             <w:tcBorders>
               <w:top w:val="single" w:sz="8" w:space="0" w:color="000000"/>
               <w:start w:val="single" w:sz="8" w:space="0" w:color="000000"/>
@@ -1736,7 +1703,7 @@
         </w:tc>
         <w:tc>
           <w:tcPr>
-            <w:tcW w:w="3440" w:type="dxa"/>
+            <w:tcW w:w="3441" w:type="dxa"/>
             <w:tcBorders>
               <w:top w:val="single" w:sz="8" w:space="0" w:color="000000"/>
               <w:start w:val="single" w:sz="8" w:space="0" w:color="000000"/>
@@ -1848,7 +1815,7 @@
         </w:tc>
         <w:tc>
           <w:tcPr>
-            <w:tcW w:w="2466" w:type="dxa"/>
+            <w:tcW w:w="2465" w:type="dxa"/>
             <w:tcBorders>
               <w:top w:val="single" w:sz="8" w:space="0" w:color="000000"/>
               <w:start w:val="single" w:sz="8" w:space="0" w:color="000000"/>
@@ -1881,7 +1848,7 @@
         </w:tc>
         <w:tc>
           <w:tcPr>
-            <w:tcW w:w="3440" w:type="dxa"/>
+            <w:tcW w:w="3441" w:type="dxa"/>
             <w:tcBorders>
               <w:top w:val="single" w:sz="8" w:space="0" w:color="000000"/>
               <w:start w:val="single" w:sz="8" w:space="0" w:color="000000"/>
@@ -1978,7 +1945,7 @@
         </w:tc>
         <w:tc>
           <w:tcPr>
-            <w:tcW w:w="2466" w:type="dxa"/>
+            <w:tcW w:w="2465" w:type="dxa"/>
             <w:tcBorders>
               <w:top w:val="single" w:sz="8" w:space="0" w:color="000000"/>
               <w:start w:val="single" w:sz="8" w:space="0" w:color="000000"/>
@@ -2011,7 +1978,7 @@
         </w:tc>
         <w:tc>
           <w:tcPr>
-            <w:tcW w:w="3440" w:type="dxa"/>
+            <w:tcW w:w="3441" w:type="dxa"/>
             <w:tcBorders>
               <w:top w:val="single" w:sz="8" w:space="0" w:color="000000"/>
               <w:start w:val="single" w:sz="8" w:space="0" w:color="000000"/>
@@ -2106,7 +2073,7 @@
         </w:tc>
         <w:tc>
           <w:tcPr>
-            <w:tcW w:w="2466" w:type="dxa"/>
+            <w:tcW w:w="2465" w:type="dxa"/>
             <w:tcBorders>
               <w:top w:val="single" w:sz="8" w:space="0" w:color="000000"/>
               <w:start w:val="single" w:sz="8" w:space="0" w:color="000000"/>
@@ -2135,7 +2102,7 @@
         </w:tc>
         <w:tc>
           <w:tcPr>
-            <w:tcW w:w="3440" w:type="dxa"/>
+            <w:tcW w:w="3441" w:type="dxa"/>
             <w:tcBorders>
               <w:top w:val="single" w:sz="8" w:space="0" w:color="000000"/>
               <w:start w:val="single" w:sz="8" w:space="0" w:color="000000"/>
@@ -2336,7 +2303,7 @@
         </w:tc>
         <w:tc>
           <w:tcPr>
-            <w:tcW w:w="2466" w:type="dxa"/>
+            <w:tcW w:w="2465" w:type="dxa"/>
             <w:tcBorders>
               <w:start w:val="single" w:sz="8" w:space="0" w:color="000000"/>
               <w:bottom w:val="single" w:sz="8" w:space="0" w:color="000000"/>
@@ -2364,7 +2331,7 @@
         </w:tc>
         <w:tc>
           <w:tcPr>
-            <w:tcW w:w="3440" w:type="dxa"/>
+            <w:tcW w:w="3441" w:type="dxa"/>
             <w:tcBorders>
               <w:start w:val="single" w:sz="8" w:space="0" w:color="000000"/>
               <w:bottom w:val="single" w:sz="8" w:space="0" w:color="000000"/>
@@ -2706,7 +2673,9 @@
         <w:gridCol w:w="10466"/>
       </w:tblGrid>
       <w:tr>
-        <w:trPr/>
+        <w:trPr>
+          <w:trHeight w:val="611" w:hRule="atLeast"/>
+        </w:trPr>
         <w:tc>
           <w:tcPr>
             <w:tcW w:w="10466" w:type="dxa"/>
@@ -3135,7 +3104,7 @@
                 <w:szCs w:val="22"/>
                 <w:lang w:val="en-US" w:eastAsia="zh-CN" w:bidi="hi-IN"/>
               </w:rPr>
-              <w:t>I add colour for fillaur. Is ugle</w:t>
+              <w:t>I add photos, though is just filler.</w:t>
             </w:r>
           </w:p>
           <w:p>
@@ -3260,16 +3229,16 @@
         <w:tblLook w:val="0600" w:firstRow="0" w:noVBand="1" w:lastRow="0" w:firstColumn="0" w:lastColumn="0" w:noHBand="1"/>
       </w:tblPr>
       <w:tblGrid>
-        <w:gridCol w:w="2607"/>
+        <w:gridCol w:w="2606"/>
         <w:gridCol w:w="2782"/>
         <w:gridCol w:w="3889"/>
-        <w:gridCol w:w="1057"/>
+        <w:gridCol w:w="1058"/>
       </w:tblGrid>
       <w:tr>
         <w:trPr/>
         <w:tc>
           <w:tcPr>
-            <w:tcW w:w="2607" w:type="dxa"/>
+            <w:tcW w:w="2606" w:type="dxa"/>
             <w:tcBorders>
               <w:top w:val="single" w:sz="8" w:space="0" w:color="000000"/>
               <w:start w:val="single" w:sz="8" w:space="0" w:color="000000"/>
@@ -3372,7 +3341,7 @@
         </w:tc>
         <w:tc>
           <w:tcPr>
-            <w:tcW w:w="1057" w:type="dxa"/>
+            <w:tcW w:w="1058" w:type="dxa"/>
             <w:tcBorders>
               <w:top w:val="single" w:sz="8" w:space="0" w:color="000000"/>
               <w:start w:val="single" w:sz="8" w:space="0" w:color="000000"/>
@@ -3408,7 +3377,7 @@
         <w:trPr/>
         <w:tc>
           <w:tcPr>
-            <w:tcW w:w="2607" w:type="dxa"/>
+            <w:tcW w:w="2606" w:type="dxa"/>
             <w:tcBorders>
               <w:top w:val="single" w:sz="8" w:space="0" w:color="000000"/>
               <w:start w:val="single" w:sz="8" w:space="0" w:color="000000"/>
@@ -3522,7 +3491,7 @@
         </w:tc>
         <w:tc>
           <w:tcPr>
-            <w:tcW w:w="1057" w:type="dxa"/>
+            <w:tcW w:w="1058" w:type="dxa"/>
             <w:tcBorders>
               <w:top w:val="single" w:sz="8" w:space="0" w:color="000000"/>
               <w:start w:val="single" w:sz="8" w:space="0" w:color="000000"/>
@@ -3563,7 +3532,7 @@
         <w:trPr/>
         <w:tc>
           <w:tcPr>
-            <w:tcW w:w="2607" w:type="dxa"/>
+            <w:tcW w:w="2606" w:type="dxa"/>
             <w:tcBorders>
               <w:top w:val="single" w:sz="8" w:space="0" w:color="000000"/>
               <w:start w:val="single" w:sz="8" w:space="0" w:color="000000"/>
@@ -3699,7 +3668,7 @@
         </w:tc>
         <w:tc>
           <w:tcPr>
-            <w:tcW w:w="1057" w:type="dxa"/>
+            <w:tcW w:w="1058" w:type="dxa"/>
             <w:tcBorders>
               <w:top w:val="single" w:sz="8" w:space="0" w:color="000000"/>
               <w:start w:val="single" w:sz="8" w:space="0" w:color="000000"/>
@@ -3731,7 +3700,7 @@
         <w:trPr/>
         <w:tc>
           <w:tcPr>
-            <w:tcW w:w="2607" w:type="dxa"/>
+            <w:tcW w:w="2606" w:type="dxa"/>
             <w:tcBorders>
               <w:start w:val="single" w:sz="8" w:space="0" w:color="000000"/>
               <w:bottom w:val="single" w:sz="8" w:space="0" w:color="000000"/>
@@ -3863,7 +3832,7 @@
         </w:tc>
         <w:tc>
           <w:tcPr>
-            <w:tcW w:w="1057" w:type="dxa"/>
+            <w:tcW w:w="1058" w:type="dxa"/>
             <w:tcBorders>
               <w:start w:val="single" w:sz="8" w:space="0" w:color="000000"/>
               <w:bottom w:val="single" w:sz="8" w:space="0" w:color="000000"/>
@@ -3894,7 +3863,7 @@
         <w:trPr/>
         <w:tc>
           <w:tcPr>
-            <w:tcW w:w="2607" w:type="dxa"/>
+            <w:tcW w:w="2606" w:type="dxa"/>
             <w:tcBorders>
               <w:start w:val="single" w:sz="8" w:space="0" w:color="000000"/>
               <w:bottom w:val="single" w:sz="8" w:space="0" w:color="000000"/>
@@ -4026,7 +3995,7 @@
         </w:tc>
         <w:tc>
           <w:tcPr>
-            <w:tcW w:w="1057" w:type="dxa"/>
+            <w:tcW w:w="1058" w:type="dxa"/>
             <w:tcBorders>
               <w:start w:val="single" w:sz="8" w:space="0" w:color="000000"/>
               <w:bottom w:val="single" w:sz="8" w:space="0" w:color="000000"/>
@@ -4057,7 +4026,7 @@
         <w:trPr/>
         <w:tc>
           <w:tcPr>
-            <w:tcW w:w="2607" w:type="dxa"/>
+            <w:tcW w:w="2606" w:type="dxa"/>
             <w:tcBorders>
               <w:top w:val="single" w:sz="8" w:space="0" w:color="000000"/>
               <w:start w:val="single" w:sz="8" w:space="0" w:color="000000"/>
@@ -4142,13 +4111,15 @@
               </w:rPr>
             </w:pPr>
             <w:r>
-              <w:rPr/>
-            </w:r>
-          </w:p>
-        </w:tc>
-        <w:tc>
-          <w:tcPr>
-            <w:tcW w:w="1057" w:type="dxa"/>
+              <w:rPr>
+                <w:rFonts w:eastAsia="Calibri" w:cs="Calibri" w:ascii="Calibri" w:hAnsi="Calibri"/>
+              </w:rPr>
+            </w:r>
+          </w:p>
+        </w:tc>
+        <w:tc>
+          <w:tcPr>
+            <w:tcW w:w="1058" w:type="dxa"/>
             <w:tcBorders>
               <w:top w:val="single" w:sz="8" w:space="0" w:color="000000"/>
               <w:start w:val="single" w:sz="8" w:space="0" w:color="000000"/>
@@ -4184,7 +4155,7 @@
         <w:trPr/>
         <w:tc>
           <w:tcPr>
-            <w:tcW w:w="2607" w:type="dxa"/>
+            <w:tcW w:w="2606" w:type="dxa"/>
             <w:tcBorders>
               <w:top w:val="single" w:sz="8" w:space="0" w:color="000000"/>
               <w:start w:val="single" w:sz="8" w:space="0" w:color="000000"/>
@@ -4324,7 +4295,7 @@
         </w:tc>
         <w:tc>
           <w:tcPr>
-            <w:tcW w:w="1057" w:type="dxa"/>
+            <w:tcW w:w="1058" w:type="dxa"/>
             <w:tcBorders>
               <w:top w:val="single" w:sz="8" w:space="0" w:color="000000"/>
               <w:start w:val="single" w:sz="8" w:space="0" w:color="000000"/>
@@ -4355,7 +4326,7 @@
         <w:trPr/>
         <w:tc>
           <w:tcPr>
-            <w:tcW w:w="2607" w:type="dxa"/>
+            <w:tcW w:w="2606" w:type="dxa"/>
             <w:tcBorders>
               <w:top w:val="single" w:sz="8" w:space="0" w:color="000000"/>
               <w:start w:val="single" w:sz="8" w:space="0" w:color="000000"/>
@@ -4439,7 +4410,7 @@
         </w:tc>
         <w:tc>
           <w:tcPr>
-            <w:tcW w:w="1057" w:type="dxa"/>
+            <w:tcW w:w="1058" w:type="dxa"/>
             <w:tcBorders>
               <w:top w:val="single" w:sz="8" w:space="0" w:color="000000"/>
               <w:start w:val="single" w:sz="8" w:space="0" w:color="000000"/>
@@ -4713,7 +4684,7 @@
                 <w:szCs w:val="22"/>
                 <w:lang w:val="en-US" w:eastAsia="zh-CN" w:bidi="hi-IN"/>
               </w:rPr>
-              <w:t xml:space="preserve">I should probably do more things on here because I am very far behind on what I support to be working on. I do hoping that I can fiinihs the sign up and logn in page, aswell as fixing the main page. </w:t>
+              <w:t xml:space="preserve">I should probably do more things on here because I am very far behind on what I support to be working on. I do hoping that I can finish the sign up and log in page, as well as fixing the main page. </w:t>
             </w:r>
           </w:p>
           <w:p>
@@ -4899,7 +4870,27 @@
                 <w:szCs w:val="22"/>
                 <w:lang w:val="en-US" w:eastAsia="zh-CN" w:bidi="hi-IN"/>
               </w:rPr>
-              <w:t>Goals for this sprint arr to start doing dymaitona rotiinh, sign up and in pages are working and can add to the data base, and to make the website more pleascabel to look at.</w:t>
+              <w:t xml:space="preserve">Goals for this sprint arr to start doing dynamic routing, sign up and in pages are working and can add to the data base, and to make the website more </w:t>
+            </w:r>
+            <w:r>
+              <w:rPr>
+                <w:rFonts w:eastAsia="Arial" w:cs="Arial"/>
+                <w:kern w:val="0"/>
+                <w:sz w:val="22"/>
+                <w:szCs w:val="22"/>
+                <w:lang w:val="en-US" w:eastAsia="zh-CN" w:bidi="hi-IN"/>
+              </w:rPr>
+              <w:t xml:space="preserve">nicer </w:t>
+            </w:r>
+            <w:r>
+              <w:rPr>
+                <w:rFonts w:eastAsia="Arial" w:cs="Arial"/>
+                <w:kern w:val="0"/>
+                <w:sz w:val="22"/>
+                <w:szCs w:val="22"/>
+                <w:lang w:val="en-US" w:eastAsia="zh-CN" w:bidi="hi-IN"/>
+              </w:rPr>
+              <w:t xml:space="preserve"> to look at.</w:t>
             </w:r>
           </w:p>
           <w:p>
@@ -5027,346 +5018,52 @@
               <w:rPr>
                 <w:rFonts w:eastAsia="Calibri" w:cs="Calibri" w:ascii="Calibri" w:hAnsi="Calibri"/>
               </w:rPr>
-            </w:r>
-          </w:p>
-          <w:p>
-            <w:pPr>
-              <w:pStyle w:val="normal1"/>
-              <w:widowControl w:val="false"/>
-              <w:suppressAutoHyphens w:val="true"/>
-              <w:spacing w:lineRule="auto" w:line="240" w:before="0" w:after="0"/>
-              <w:jc w:val="start"/>
-              <w:rPr>
-                <w:rFonts w:ascii="Calibri" w:hAnsi="Calibri" w:eastAsia="Calibri" w:cs="Calibri"/>
-              </w:rPr>
-            </w:pPr>
-            <w:r>
-              <w:rPr>
-                <w:rFonts w:eastAsia="Calibri" w:cs="Calibri" w:ascii="Calibri" w:hAnsi="Calibri"/>
-              </w:rPr>
-            </w:r>
-          </w:p>
-          <w:p>
-            <w:pPr>
-              <w:pStyle w:val="normal1"/>
-              <w:widowControl w:val="false"/>
-              <w:suppressAutoHyphens w:val="true"/>
-              <w:spacing w:lineRule="auto" w:line="240" w:before="0" w:after="0"/>
-              <w:jc w:val="start"/>
-              <w:rPr>
-                <w:rFonts w:ascii="Calibri" w:hAnsi="Calibri" w:eastAsia="Calibri" w:cs="Calibri"/>
-              </w:rPr>
-            </w:pPr>
-            <w:r>
-              <w:rPr>
-                <w:rFonts w:eastAsia="Calibri" w:cs="Calibri" w:ascii="Calibri" w:hAnsi="Calibri"/>
-              </w:rPr>
-            </w:r>
-          </w:p>
-          <w:p>
-            <w:pPr>
-              <w:pStyle w:val="normal1"/>
-              <w:widowControl w:val="false"/>
-              <w:suppressAutoHyphens w:val="true"/>
-              <w:spacing w:lineRule="auto" w:line="240" w:before="0" w:after="0"/>
-              <w:jc w:val="start"/>
-              <w:rPr>
-                <w:rFonts w:ascii="Calibri" w:hAnsi="Calibri" w:eastAsia="Calibri" w:cs="Calibri"/>
-              </w:rPr>
-            </w:pPr>
-            <w:r>
-              <w:rPr>
-                <w:rFonts w:eastAsia="Calibri" w:cs="Calibri" w:ascii="Calibri" w:hAnsi="Calibri"/>
-              </w:rPr>
-            </w:r>
-          </w:p>
-          <w:p>
-            <w:pPr>
-              <w:pStyle w:val="normal1"/>
-              <w:widowControl w:val="false"/>
-              <w:suppressAutoHyphens w:val="true"/>
-              <w:spacing w:lineRule="auto" w:line="240" w:before="0" w:after="0"/>
-              <w:jc w:val="start"/>
-              <w:rPr>
-                <w:rFonts w:ascii="Calibri" w:hAnsi="Calibri" w:eastAsia="Calibri" w:cs="Calibri"/>
-              </w:rPr>
-            </w:pPr>
-            <w:r>
-              <w:rPr>
-                <w:rFonts w:eastAsia="Calibri" w:cs="Calibri" w:ascii="Calibri" w:hAnsi="Calibri"/>
-              </w:rPr>
-            </w:r>
-          </w:p>
-          <w:p>
-            <w:pPr>
-              <w:pStyle w:val="normal1"/>
-              <w:widowControl w:val="false"/>
-              <w:suppressAutoHyphens w:val="true"/>
-              <w:spacing w:lineRule="auto" w:line="240" w:before="0" w:after="0"/>
-              <w:jc w:val="start"/>
-              <w:rPr>
-                <w:rFonts w:ascii="Calibri" w:hAnsi="Calibri" w:eastAsia="Calibri" w:cs="Calibri"/>
-              </w:rPr>
-            </w:pPr>
-            <w:r>
-              <w:rPr>
-                <w:rFonts w:eastAsia="Calibri" w:cs="Calibri" w:ascii="Calibri" w:hAnsi="Calibri"/>
-              </w:rPr>
-            </w:r>
-          </w:p>
-          <w:p>
-            <w:pPr>
-              <w:pStyle w:val="normal1"/>
-              <w:widowControl w:val="false"/>
-              <w:suppressAutoHyphens w:val="true"/>
-              <w:spacing w:lineRule="auto" w:line="240" w:before="0" w:after="0"/>
-              <w:jc w:val="start"/>
-              <w:rPr>
-                <w:rFonts w:ascii="Calibri" w:hAnsi="Calibri" w:eastAsia="Calibri" w:cs="Calibri"/>
-              </w:rPr>
-            </w:pPr>
-            <w:r>
-              <w:rPr>
-                <w:rFonts w:eastAsia="Calibri" w:cs="Calibri" w:ascii="Calibri" w:hAnsi="Calibri"/>
-              </w:rPr>
-            </w:r>
-          </w:p>
-          <w:p>
-            <w:pPr>
-              <w:pStyle w:val="normal1"/>
-              <w:widowControl w:val="false"/>
-              <w:suppressAutoHyphens w:val="true"/>
-              <w:spacing w:lineRule="auto" w:line="240" w:before="0" w:after="0"/>
-              <w:jc w:val="start"/>
-              <w:rPr>
-                <w:rFonts w:ascii="Calibri" w:hAnsi="Calibri" w:eastAsia="Calibri" w:cs="Calibri"/>
-              </w:rPr>
-            </w:pPr>
-            <w:r>
-              <w:rPr>
-                <w:rFonts w:eastAsia="Calibri" w:cs="Calibri" w:ascii="Calibri" w:hAnsi="Calibri"/>
-              </w:rPr>
-            </w:r>
-          </w:p>
-          <w:p>
-            <w:pPr>
-              <w:pStyle w:val="normal1"/>
-              <w:widowControl w:val="false"/>
-              <w:suppressAutoHyphens w:val="true"/>
-              <w:spacing w:lineRule="auto" w:line="240" w:before="0" w:after="0"/>
-              <w:jc w:val="start"/>
-              <w:rPr>
-                <w:rFonts w:ascii="Calibri" w:hAnsi="Calibri" w:eastAsia="Calibri" w:cs="Calibri"/>
-              </w:rPr>
-            </w:pPr>
-            <w:r>
-              <w:rPr>
-                <w:rFonts w:eastAsia="Calibri" w:cs="Calibri" w:ascii="Calibri" w:hAnsi="Calibri"/>
-              </w:rPr>
-            </w:r>
-          </w:p>
-          <w:p>
-            <w:pPr>
-              <w:pStyle w:val="normal1"/>
-              <w:widowControl w:val="false"/>
-              <w:suppressAutoHyphens w:val="true"/>
-              <w:spacing w:lineRule="auto" w:line="240" w:before="0" w:after="0"/>
-              <w:jc w:val="start"/>
-              <w:rPr>
-                <w:rFonts w:ascii="Calibri" w:hAnsi="Calibri" w:eastAsia="Calibri" w:cs="Calibri"/>
-              </w:rPr>
-            </w:pPr>
-            <w:r>
-              <w:rPr>
-                <w:rFonts w:eastAsia="Calibri" w:cs="Calibri" w:ascii="Calibri" w:hAnsi="Calibri"/>
-              </w:rPr>
-            </w:r>
-          </w:p>
-          <w:p>
-            <w:pPr>
-              <w:pStyle w:val="normal1"/>
-              <w:widowControl w:val="false"/>
-              <w:suppressAutoHyphens w:val="true"/>
-              <w:spacing w:lineRule="auto" w:line="240" w:before="0" w:after="0"/>
-              <w:jc w:val="start"/>
-              <w:rPr>
-                <w:rFonts w:ascii="Calibri" w:hAnsi="Calibri" w:eastAsia="Calibri" w:cs="Calibri"/>
-              </w:rPr>
-            </w:pPr>
-            <w:r>
-              <w:rPr>
-                <w:rFonts w:eastAsia="Calibri" w:cs="Calibri" w:ascii="Calibri" w:hAnsi="Calibri"/>
-              </w:rPr>
-            </w:r>
-          </w:p>
-          <w:p>
-            <w:pPr>
-              <w:pStyle w:val="normal1"/>
-              <w:widowControl w:val="false"/>
-              <w:suppressAutoHyphens w:val="true"/>
-              <w:spacing w:lineRule="auto" w:line="240" w:before="0" w:after="0"/>
-              <w:jc w:val="start"/>
-              <w:rPr>
-                <w:rFonts w:ascii="Calibri" w:hAnsi="Calibri" w:eastAsia="Calibri" w:cs="Calibri"/>
-              </w:rPr>
-            </w:pPr>
-            <w:r>
-              <w:rPr>
-                <w:rFonts w:eastAsia="Calibri" w:cs="Calibri" w:ascii="Calibri" w:hAnsi="Calibri"/>
-              </w:rPr>
-            </w:r>
-          </w:p>
-          <w:p>
-            <w:pPr>
-              <w:pStyle w:val="normal1"/>
-              <w:widowControl w:val="false"/>
-              <w:suppressAutoHyphens w:val="true"/>
-              <w:spacing w:lineRule="auto" w:line="240" w:before="0" w:after="0"/>
-              <w:jc w:val="start"/>
-              <w:rPr>
-                <w:rFonts w:ascii="Calibri" w:hAnsi="Calibri" w:eastAsia="Calibri" w:cs="Calibri"/>
-              </w:rPr>
-            </w:pPr>
-            <w:r>
-              <w:rPr>
-                <w:rFonts w:eastAsia="Calibri" w:cs="Calibri" w:ascii="Calibri" w:hAnsi="Calibri"/>
-              </w:rPr>
-            </w:r>
-          </w:p>
-          <w:p>
-            <w:pPr>
-              <w:pStyle w:val="normal1"/>
-              <w:widowControl w:val="false"/>
-              <w:suppressAutoHyphens w:val="true"/>
-              <w:spacing w:lineRule="auto" w:line="240" w:before="0" w:after="0"/>
-              <w:jc w:val="start"/>
-              <w:rPr>
-                <w:rFonts w:ascii="Calibri" w:hAnsi="Calibri" w:eastAsia="Calibri" w:cs="Calibri"/>
-              </w:rPr>
-            </w:pPr>
-            <w:r>
-              <w:rPr>
-                <w:rFonts w:eastAsia="Calibri" w:cs="Calibri" w:ascii="Calibri" w:hAnsi="Calibri"/>
-              </w:rPr>
-            </w:r>
-          </w:p>
-          <w:p>
-            <w:pPr>
-              <w:pStyle w:val="normal1"/>
-              <w:widowControl w:val="false"/>
-              <w:suppressAutoHyphens w:val="true"/>
-              <w:spacing w:lineRule="auto" w:line="240" w:before="0" w:after="0"/>
-              <w:jc w:val="start"/>
-              <w:rPr>
-                <w:rFonts w:ascii="Calibri" w:hAnsi="Calibri" w:eastAsia="Calibri" w:cs="Calibri"/>
-              </w:rPr>
-            </w:pPr>
-            <w:r>
-              <w:rPr>
-                <w:rFonts w:eastAsia="Calibri" w:cs="Calibri" w:ascii="Calibri" w:hAnsi="Calibri"/>
-              </w:rPr>
-            </w:r>
-          </w:p>
-          <w:p>
-            <w:pPr>
-              <w:pStyle w:val="normal1"/>
-              <w:widowControl w:val="false"/>
-              <w:suppressAutoHyphens w:val="true"/>
-              <w:spacing w:lineRule="auto" w:line="240" w:before="0" w:after="0"/>
-              <w:jc w:val="start"/>
-              <w:rPr>
-                <w:rFonts w:ascii="Calibri" w:hAnsi="Calibri" w:eastAsia="Calibri" w:cs="Calibri"/>
-              </w:rPr>
-            </w:pPr>
-            <w:r>
-              <w:rPr>
-                <w:rFonts w:eastAsia="Calibri" w:cs="Calibri" w:ascii="Calibri" w:hAnsi="Calibri"/>
-              </w:rPr>
-            </w:r>
-          </w:p>
-          <w:p>
-            <w:pPr>
-              <w:pStyle w:val="normal1"/>
-              <w:widowControl w:val="false"/>
-              <w:suppressAutoHyphens w:val="true"/>
-              <w:spacing w:lineRule="auto" w:line="240" w:before="0" w:after="0"/>
-              <w:jc w:val="start"/>
-              <w:rPr>
-                <w:rFonts w:ascii="Calibri" w:hAnsi="Calibri" w:eastAsia="Calibri" w:cs="Calibri"/>
-              </w:rPr>
-            </w:pPr>
-            <w:r>
-              <w:rPr>
-                <w:rFonts w:eastAsia="Calibri" w:cs="Calibri" w:ascii="Calibri" w:hAnsi="Calibri"/>
-              </w:rPr>
-            </w:r>
-          </w:p>
-          <w:p>
-            <w:pPr>
-              <w:pStyle w:val="normal1"/>
-              <w:widowControl w:val="false"/>
-              <w:suppressAutoHyphens w:val="true"/>
-              <w:spacing w:lineRule="auto" w:line="240" w:before="0" w:after="0"/>
-              <w:jc w:val="start"/>
-              <w:rPr>
-                <w:rFonts w:ascii="Calibri" w:hAnsi="Calibri" w:eastAsia="Calibri" w:cs="Calibri"/>
-              </w:rPr>
-            </w:pPr>
-            <w:r>
-              <w:rPr>
-                <w:rFonts w:eastAsia="Calibri" w:cs="Calibri" w:ascii="Calibri" w:hAnsi="Calibri"/>
-              </w:rPr>
-            </w:r>
-          </w:p>
-          <w:p>
-            <w:pPr>
-              <w:pStyle w:val="normal1"/>
-              <w:widowControl w:val="false"/>
-              <w:suppressAutoHyphens w:val="true"/>
-              <w:spacing w:lineRule="auto" w:line="240" w:before="0" w:after="0"/>
-              <w:jc w:val="start"/>
-              <w:rPr>
-                <w:rFonts w:ascii="Calibri" w:hAnsi="Calibri" w:eastAsia="Calibri" w:cs="Calibri"/>
-              </w:rPr>
-            </w:pPr>
-            <w:r>
-              <w:rPr>
-                <w:rFonts w:eastAsia="Calibri" w:cs="Calibri" w:ascii="Calibri" w:hAnsi="Calibri"/>
-              </w:rPr>
-            </w:r>
-          </w:p>
-          <w:p>
-            <w:pPr>
-              <w:pStyle w:val="normal1"/>
-              <w:widowControl w:val="false"/>
-              <w:suppressAutoHyphens w:val="true"/>
-              <w:spacing w:lineRule="auto" w:line="240" w:before="0" w:after="0"/>
-              <w:jc w:val="start"/>
-              <w:rPr>
-                <w:rFonts w:ascii="Calibri" w:hAnsi="Calibri" w:eastAsia="Calibri" w:cs="Calibri"/>
-              </w:rPr>
-            </w:pPr>
-            <w:r>
-              <w:rPr>
-                <w:rFonts w:eastAsia="Calibri" w:cs="Calibri" w:ascii="Calibri" w:hAnsi="Calibri"/>
-              </w:rPr>
-            </w:r>
-          </w:p>
-          <w:p>
-            <w:pPr>
-              <w:pStyle w:val="normal1"/>
-              <w:widowControl w:val="false"/>
-              <w:suppressAutoHyphens w:val="true"/>
-              <w:spacing w:lineRule="auto" w:line="240" w:before="0" w:after="0"/>
-              <w:jc w:val="start"/>
-              <w:rPr>
-                <w:rFonts w:ascii="Calibri" w:hAnsi="Calibri" w:eastAsia="Calibri" w:cs="Calibri"/>
-              </w:rPr>
-            </w:pPr>
-            <w:r>
-              <w:rPr>
-                <w:rFonts w:eastAsia="Calibri" w:cs="Calibri" w:ascii="Calibri" w:hAnsi="Calibri"/>
-              </w:rPr>
+              <w:drawing>
+                <wp:anchor distT="0" distB="0" distL="0" distR="0" simplePos="0" relativeHeight="58" behindDoc="0" locked="0" layoutInCell="1" allowOverlap="1">
+                  <wp:simplePos x="0" y="0"/>
+                  <wp:positionH relativeFrom="column">
+                    <wp:posOffset>-5080</wp:posOffset>
+                  </wp:positionH>
+                  <wp:positionV relativeFrom="paragraph">
+                    <wp:posOffset>178435</wp:posOffset>
+                  </wp:positionV>
+                  <wp:extent cx="6518910" cy="1334770"/>
+                  <wp:effectExtent l="0" t="0" r="0" b="0"/>
+                  <wp:wrapSquare wrapText="largest"/>
+                  <wp:docPr id="11" name="Image2 Copy 1"/>
+                  <wp:cNvGraphicFramePr>
+                    <a:graphicFrameLocks xmlns:a="http://schemas.openxmlformats.org/drawingml/2006/main" noChangeAspect="1"/>
+                  </wp:cNvGraphicFramePr>
+                  <a:graphic xmlns:a="http://schemas.openxmlformats.org/drawingml/2006/main">
+                    <a:graphicData uri="http://schemas.openxmlformats.org/drawingml/2006/picture">
+                      <pic:pic xmlns:pic="http://schemas.openxmlformats.org/drawingml/2006/picture">
+                        <pic:nvPicPr>
+                          <pic:cNvPr id="11" name="Image2 Copy 1"/>
+                          <pic:cNvPicPr>
+                            <a:picLocks noChangeAspect="1" noChangeArrowheads="1"/>
+                          </pic:cNvPicPr>
+                        </pic:nvPicPr>
+                        <pic:blipFill>
+                          <a:blip r:embed="rId12"/>
+                          <a:stretch>
+                            <a:fillRect/>
+                          </a:stretch>
+                        </pic:blipFill>
+                        <pic:spPr bwMode="auto">
+                          <a:xfrm>
+                            <a:off x="0" y="0"/>
+                            <a:ext cx="6518910" cy="1334770"/>
+                          </a:xfrm>
+                          <a:prstGeom prst="rect">
+                            <a:avLst/>
+                          </a:prstGeom>
+                          <a:noFill/>
+                        </pic:spPr>
+                      </pic:pic>
+                    </a:graphicData>
+                  </a:graphic>
+                </wp:anchor>
+              </w:drawing>
             </w:r>
           </w:p>
           <w:p>
@@ -6076,8 +5773,8 @@
         <w:tblLook w:val="0600" w:firstRow="0" w:noVBand="1" w:lastRow="0" w:firstColumn="0" w:lastColumn="0" w:noHBand="1"/>
       </w:tblPr>
       <w:tblGrid>
-        <w:gridCol w:w="3473"/>
-        <w:gridCol w:w="2827"/>
+        <w:gridCol w:w="3472"/>
+        <w:gridCol w:w="2828"/>
         <w:gridCol w:w="3402"/>
         <w:gridCol w:w="633"/>
       </w:tblGrid>
@@ -6085,7 +5782,7 @@
         <w:trPr/>
         <w:tc>
           <w:tcPr>
-            <w:tcW w:w="3473" w:type="dxa"/>
+            <w:tcW w:w="3472" w:type="dxa"/>
             <w:tcBorders>
               <w:top w:val="single" w:sz="8" w:space="0" w:color="000000"/>
               <w:start w:val="single" w:sz="8" w:space="0" w:color="000000"/>
@@ -6122,7 +5819,7 @@
         </w:tc>
         <w:tc>
           <w:tcPr>
-            <w:tcW w:w="2827" w:type="dxa"/>
+            <w:tcW w:w="2828" w:type="dxa"/>
             <w:tcBorders>
               <w:top w:val="single" w:sz="8" w:space="0" w:color="000000"/>
               <w:start w:val="single" w:sz="8" w:space="0" w:color="000000"/>
@@ -6224,7 +5921,7 @@
         <w:trPr/>
         <w:tc>
           <w:tcPr>
-            <w:tcW w:w="3473" w:type="dxa"/>
+            <w:tcW w:w="3472" w:type="dxa"/>
             <w:tcBorders>
               <w:top w:val="single" w:sz="8" w:space="0" w:color="000000"/>
               <w:start w:val="single" w:sz="8" w:space="0" w:color="000000"/>
@@ -6262,7 +5959,7 @@
         </w:tc>
         <w:tc>
           <w:tcPr>
-            <w:tcW w:w="2827" w:type="dxa"/>
+            <w:tcW w:w="2828" w:type="dxa"/>
             <w:tcBorders>
               <w:top w:val="single" w:sz="8" w:space="0" w:color="000000"/>
               <w:start w:val="single" w:sz="8" w:space="0" w:color="000000"/>
@@ -6379,7 +6076,7 @@
         <w:trPr/>
         <w:tc>
           <w:tcPr>
-            <w:tcW w:w="3473" w:type="dxa"/>
+            <w:tcW w:w="3472" w:type="dxa"/>
             <w:tcBorders>
               <w:top w:val="single" w:sz="8" w:space="0" w:color="000000"/>
               <w:start w:val="single" w:sz="8" w:space="0" w:color="000000"/>
@@ -6408,7 +6105,7 @@
         </w:tc>
         <w:tc>
           <w:tcPr>
-            <w:tcW w:w="2827" w:type="dxa"/>
+            <w:tcW w:w="2828" w:type="dxa"/>
             <w:tcBorders>
               <w:top w:val="single" w:sz="8" w:space="0" w:color="000000"/>
               <w:start w:val="single" w:sz="8" w:space="0" w:color="000000"/>
@@ -6472,7 +6169,7 @@
                   <wp:extent cx="2033270" cy="272415"/>
                   <wp:effectExtent l="0" t="0" r="0" b="0"/>
                   <wp:wrapSquare wrapText="largest"/>
-                  <wp:docPr id="11" name="Image11"/>
+                  <wp:docPr id="12" name="Image11"/>
                   <wp:cNvGraphicFramePr>
                     <a:graphicFrameLocks xmlns:a="http://schemas.openxmlformats.org/drawingml/2006/main" noChangeAspect="1"/>
                   </wp:cNvGraphicFramePr>
@@ -6480,13 +6177,13 @@
                     <a:graphicData uri="http://schemas.openxmlformats.org/drawingml/2006/picture">
                       <pic:pic xmlns:pic="http://schemas.openxmlformats.org/drawingml/2006/picture">
                         <pic:nvPicPr>
-                          <pic:cNvPr id="11" name="Image11"/>
+                          <pic:cNvPr id="12" name="Image11"/>
                           <pic:cNvPicPr>
                             <a:picLocks noChangeAspect="1" noChangeArrowheads="1"/>
                           </pic:cNvPicPr>
                         </pic:nvPicPr>
                         <pic:blipFill>
-                          <a:blip r:embed="rId12"/>
+                          <a:blip r:embed="rId13"/>
                           <a:stretch>
                             <a:fillRect/>
                           </a:stretch>
@@ -6542,7 +6239,7 @@
         <w:trPr/>
         <w:tc>
           <w:tcPr>
-            <w:tcW w:w="3473" w:type="dxa"/>
+            <w:tcW w:w="3472" w:type="dxa"/>
             <w:tcBorders>
               <w:start w:val="single" w:sz="8" w:space="0" w:color="000000"/>
               <w:bottom w:val="single" w:sz="8" w:space="0" w:color="000000"/>
@@ -6570,7 +6267,7 @@
         </w:tc>
         <w:tc>
           <w:tcPr>
-            <w:tcW w:w="2827" w:type="dxa"/>
+            <w:tcW w:w="2828" w:type="dxa"/>
             <w:tcBorders>
               <w:start w:val="single" w:sz="8" w:space="0" w:color="000000"/>
               <w:bottom w:val="single" w:sz="8" w:space="0" w:color="000000"/>
@@ -6632,7 +6329,7 @@
                   <wp:extent cx="2033270" cy="791210"/>
                   <wp:effectExtent l="0" t="0" r="0" b="0"/>
                   <wp:wrapSquare wrapText="largest"/>
-                  <wp:docPr id="12" name="Image7"/>
+                  <wp:docPr id="13" name="Image7"/>
                   <wp:cNvGraphicFramePr>
                     <a:graphicFrameLocks xmlns:a="http://schemas.openxmlformats.org/drawingml/2006/main" noChangeAspect="1"/>
                   </wp:cNvGraphicFramePr>
@@ -6640,13 +6337,13 @@
                     <a:graphicData uri="http://schemas.openxmlformats.org/drawingml/2006/picture">
                       <pic:pic xmlns:pic="http://schemas.openxmlformats.org/drawingml/2006/picture">
                         <pic:nvPicPr>
-                          <pic:cNvPr id="12" name="Image7"/>
+                          <pic:cNvPr id="13" name="Image7"/>
                           <pic:cNvPicPr>
                             <a:picLocks noChangeAspect="1" noChangeArrowheads="1"/>
                           </pic:cNvPicPr>
                         </pic:nvPicPr>
                         <pic:blipFill>
-                          <a:blip r:embed="rId13"/>
+                          <a:blip r:embed="rId14"/>
                           <a:stretch>
                             <a:fillRect/>
                           </a:stretch>
@@ -6704,7 +6401,7 @@
         </w:trPr>
         <w:tc>
           <w:tcPr>
-            <w:tcW w:w="3473" w:type="dxa"/>
+            <w:tcW w:w="3472" w:type="dxa"/>
             <w:tcBorders>
               <w:top w:val="single" w:sz="8" w:space="0" w:color="000000"/>
               <w:start w:val="single" w:sz="8" w:space="0" w:color="000000"/>
@@ -6733,7 +6430,7 @@
         </w:tc>
         <w:tc>
           <w:tcPr>
-            <w:tcW w:w="2827" w:type="dxa"/>
+            <w:tcW w:w="2828" w:type="dxa"/>
             <w:tcBorders>
               <w:top w:val="single" w:sz="8" w:space="0" w:color="000000"/>
               <w:start w:val="single" w:sz="8" w:space="0" w:color="000000"/>
@@ -6797,7 +6494,7 @@
                   <wp:extent cx="2033270" cy="1061720"/>
                   <wp:effectExtent l="0" t="0" r="0" b="0"/>
                   <wp:wrapSquare wrapText="largest"/>
-                  <wp:docPr id="13" name="Image9"/>
+                  <wp:docPr id="14" name="Image9"/>
                   <wp:cNvGraphicFramePr>
                     <a:graphicFrameLocks xmlns:a="http://schemas.openxmlformats.org/drawingml/2006/main" noChangeAspect="1"/>
                   </wp:cNvGraphicFramePr>
@@ -6805,13 +6502,13 @@
                     <a:graphicData uri="http://schemas.openxmlformats.org/drawingml/2006/picture">
                       <pic:pic xmlns:pic="http://schemas.openxmlformats.org/drawingml/2006/picture">
                         <pic:nvPicPr>
-                          <pic:cNvPr id="13" name="Image9"/>
+                          <pic:cNvPr id="14" name="Image9"/>
                           <pic:cNvPicPr>
                             <a:picLocks noChangeAspect="1" noChangeArrowheads="1"/>
                           </pic:cNvPicPr>
                         </pic:nvPicPr>
                         <pic:blipFill>
-                          <a:blip r:embed="rId14"/>
+                          <a:blip r:embed="rId15"/>
                           <a:stretch>
                             <a:fillRect/>
                           </a:stretch>
@@ -6868,7 +6565,7 @@
         <w:trPr/>
         <w:tc>
           <w:tcPr>
-            <w:tcW w:w="3473" w:type="dxa"/>
+            <w:tcW w:w="3472" w:type="dxa"/>
             <w:tcBorders>
               <w:top w:val="single" w:sz="8" w:space="0" w:color="000000"/>
               <w:start w:val="single" w:sz="8" w:space="0" w:color="000000"/>
@@ -6897,7 +6594,7 @@
         </w:tc>
         <w:tc>
           <w:tcPr>
-            <w:tcW w:w="2827" w:type="dxa"/>
+            <w:tcW w:w="2828" w:type="dxa"/>
             <w:tcBorders>
               <w:top w:val="single" w:sz="8" w:space="0" w:color="000000"/>
               <w:start w:val="single" w:sz="8" w:space="0" w:color="000000"/>
@@ -6961,7 +6658,7 @@
                   <wp:extent cx="2033270" cy="552450"/>
                   <wp:effectExtent l="0" t="0" r="0" b="0"/>
                   <wp:wrapSquare wrapText="largest"/>
-                  <wp:docPr id="14" name="Image8"/>
+                  <wp:docPr id="15" name="Image8"/>
                   <wp:cNvGraphicFramePr>
                     <a:graphicFrameLocks xmlns:a="http://schemas.openxmlformats.org/drawingml/2006/main" noChangeAspect="1"/>
                   </wp:cNvGraphicFramePr>
@@ -6969,13 +6666,13 @@
                     <a:graphicData uri="http://schemas.openxmlformats.org/drawingml/2006/picture">
                       <pic:pic xmlns:pic="http://schemas.openxmlformats.org/drawingml/2006/picture">
                         <pic:nvPicPr>
-                          <pic:cNvPr id="14" name="Image8"/>
+                          <pic:cNvPr id="15" name="Image8"/>
                           <pic:cNvPicPr>
                             <a:picLocks noChangeAspect="1" noChangeArrowheads="1"/>
                           </pic:cNvPicPr>
                         </pic:nvPicPr>
                         <pic:blipFill>
-                          <a:blip r:embed="rId15"/>
+                          <a:blip r:embed="rId16"/>
                           <a:stretch>
                             <a:fillRect/>
                           </a:stretch>
@@ -7032,7 +6729,7 @@
         <w:trPr/>
         <w:tc>
           <w:tcPr>
-            <w:tcW w:w="3473" w:type="dxa"/>
+            <w:tcW w:w="3472" w:type="dxa"/>
             <w:tcBorders>
               <w:top w:val="single" w:sz="8" w:space="0" w:color="000000"/>
               <w:start w:val="single" w:sz="8" w:space="0" w:color="000000"/>
@@ -7061,7 +6758,7 @@
         </w:tc>
         <w:tc>
           <w:tcPr>
-            <w:tcW w:w="2827" w:type="dxa"/>
+            <w:tcW w:w="2828" w:type="dxa"/>
             <w:tcBorders>
               <w:top w:val="single" w:sz="8" w:space="0" w:color="000000"/>
               <w:start w:val="single" w:sz="8" w:space="0" w:color="000000"/>
@@ -7122,7 +6819,7 @@
                   <wp:extent cx="2033270" cy="576580"/>
                   <wp:effectExtent l="0" t="0" r="0" b="0"/>
                   <wp:wrapSquare wrapText="largest"/>
-                  <wp:docPr id="15" name="Image1 Copy 1"/>
+                  <wp:docPr id="16" name="Image1 Copy 1"/>
                   <wp:cNvGraphicFramePr>
                     <a:graphicFrameLocks xmlns:a="http://schemas.openxmlformats.org/drawingml/2006/main" noChangeAspect="1"/>
                   </wp:cNvGraphicFramePr>
@@ -7130,13 +6827,13 @@
                     <a:graphicData uri="http://schemas.openxmlformats.org/drawingml/2006/picture">
                       <pic:pic xmlns:pic="http://schemas.openxmlformats.org/drawingml/2006/picture">
                         <pic:nvPicPr>
-                          <pic:cNvPr id="15" name="Image1 Copy 1"/>
+                          <pic:cNvPr id="16" name="Image1 Copy 1"/>
                           <pic:cNvPicPr>
                             <a:picLocks noChangeAspect="1" noChangeArrowheads="1"/>
                           </pic:cNvPicPr>
                         </pic:nvPicPr>
                         <pic:blipFill>
-                          <a:blip r:embed="rId16"/>
+                          <a:blip r:embed="rId17"/>
                           <a:stretch>
                             <a:fillRect/>
                           </a:stretch>
@@ -7199,35 +6896,35 @@
         <w:trPr/>
         <w:tc>
           <w:tcPr>
-            <w:tcW w:w="3473" w:type="dxa"/>
-            <w:tcBorders>
-              <w:top w:val="single" w:sz="8" w:space="0" w:color="000000"/>
-              <w:start w:val="single" w:sz="8" w:space="0" w:color="000000"/>
-              <w:bottom w:val="single" w:sz="8" w:space="0" w:color="000000"/>
-              <w:end w:val="single" w:sz="8" w:space="0" w:color="000000"/>
-            </w:tcBorders>
-          </w:tcPr>
-          <w:p>
-            <w:pPr>
-              <w:pStyle w:val="normal1"/>
-              <w:widowControl w:val="false"/>
-              <w:suppressAutoHyphens w:val="true"/>
-              <w:spacing w:lineRule="auto" w:line="240" w:before="0" w:after="0"/>
-              <w:jc w:val="start"/>
-              <w:rPr>
-                <w:rFonts w:ascii="Calibri" w:hAnsi="Calibri" w:eastAsia="Calibri" w:cs="Calibri"/>
-              </w:rPr>
-            </w:pPr>
-            <w:r>
-              <w:rPr>
-                <w:rFonts w:eastAsia="Calibri" w:cs="Calibri" w:ascii="Calibri" w:hAnsi="Calibri"/>
-              </w:rPr>
-            </w:r>
-          </w:p>
-        </w:tc>
-        <w:tc>
-          <w:tcPr>
-            <w:tcW w:w="2827" w:type="dxa"/>
+            <w:tcW w:w="3472" w:type="dxa"/>
+            <w:tcBorders>
+              <w:top w:val="single" w:sz="8" w:space="0" w:color="000000"/>
+              <w:start w:val="single" w:sz="8" w:space="0" w:color="000000"/>
+              <w:bottom w:val="single" w:sz="8" w:space="0" w:color="000000"/>
+              <w:end w:val="single" w:sz="8" w:space="0" w:color="000000"/>
+            </w:tcBorders>
+          </w:tcPr>
+          <w:p>
+            <w:pPr>
+              <w:pStyle w:val="normal1"/>
+              <w:widowControl w:val="false"/>
+              <w:suppressAutoHyphens w:val="true"/>
+              <w:spacing w:lineRule="auto" w:line="240" w:before="0" w:after="0"/>
+              <w:jc w:val="start"/>
+              <w:rPr>
+                <w:rFonts w:ascii="Calibri" w:hAnsi="Calibri" w:eastAsia="Calibri" w:cs="Calibri"/>
+              </w:rPr>
+            </w:pPr>
+            <w:r>
+              <w:rPr>
+                <w:rFonts w:eastAsia="Calibri" w:cs="Calibri" w:ascii="Calibri" w:hAnsi="Calibri"/>
+              </w:rPr>
+            </w:r>
+          </w:p>
+        </w:tc>
+        <w:tc>
+          <w:tcPr>
+            <w:tcW w:w="2828" w:type="dxa"/>
             <w:tcBorders>
               <w:top w:val="single" w:sz="8" w:space="0" w:color="000000"/>
               <w:start w:val="single" w:sz="8" w:space="0" w:color="000000"/>
@@ -7314,35 +7011,35 @@
         <w:trPr/>
         <w:tc>
           <w:tcPr>
-            <w:tcW w:w="3473" w:type="dxa"/>
-            <w:tcBorders>
-              <w:top w:val="single" w:sz="8" w:space="0" w:color="000000"/>
-              <w:start w:val="single" w:sz="8" w:space="0" w:color="000000"/>
-              <w:bottom w:val="single" w:sz="8" w:space="0" w:color="000000"/>
-              <w:end w:val="single" w:sz="8" w:space="0" w:color="000000"/>
-            </w:tcBorders>
-          </w:tcPr>
-          <w:p>
-            <w:pPr>
-              <w:pStyle w:val="normal1"/>
-              <w:widowControl w:val="false"/>
-              <w:suppressAutoHyphens w:val="true"/>
-              <w:spacing w:lineRule="auto" w:line="240" w:before="0" w:after="0"/>
-              <w:jc w:val="start"/>
-              <w:rPr>
-                <w:rFonts w:ascii="Calibri" w:hAnsi="Calibri" w:eastAsia="Calibri" w:cs="Calibri"/>
-              </w:rPr>
-            </w:pPr>
-            <w:r>
-              <w:rPr>
-                <w:rFonts w:eastAsia="Calibri" w:cs="Calibri" w:ascii="Calibri" w:hAnsi="Calibri"/>
-              </w:rPr>
-            </w:r>
-          </w:p>
-        </w:tc>
-        <w:tc>
-          <w:tcPr>
-            <w:tcW w:w="2827" w:type="dxa"/>
+            <w:tcW w:w="3472" w:type="dxa"/>
+            <w:tcBorders>
+              <w:top w:val="single" w:sz="8" w:space="0" w:color="000000"/>
+              <w:start w:val="single" w:sz="8" w:space="0" w:color="000000"/>
+              <w:bottom w:val="single" w:sz="8" w:space="0" w:color="000000"/>
+              <w:end w:val="single" w:sz="8" w:space="0" w:color="000000"/>
+            </w:tcBorders>
+          </w:tcPr>
+          <w:p>
+            <w:pPr>
+              <w:pStyle w:val="normal1"/>
+              <w:widowControl w:val="false"/>
+              <w:suppressAutoHyphens w:val="true"/>
+              <w:spacing w:lineRule="auto" w:line="240" w:before="0" w:after="0"/>
+              <w:jc w:val="start"/>
+              <w:rPr>
+                <w:rFonts w:ascii="Calibri" w:hAnsi="Calibri" w:eastAsia="Calibri" w:cs="Calibri"/>
+              </w:rPr>
+            </w:pPr>
+            <w:r>
+              <w:rPr>
+                <w:rFonts w:eastAsia="Calibri" w:cs="Calibri" w:ascii="Calibri" w:hAnsi="Calibri"/>
+              </w:rPr>
+            </w:r>
+          </w:p>
+        </w:tc>
+        <w:tc>
+          <w:tcPr>
+            <w:tcW w:w="2828" w:type="dxa"/>
             <w:tcBorders>
               <w:top w:val="single" w:sz="8" w:space="0" w:color="000000"/>
               <w:start w:val="single" w:sz="8" w:space="0" w:color="000000"/>
@@ -7426,6 +7123,32 @@
         </w:tc>
       </w:tr>
     </w:tbl>
+    <w:p>
+      <w:pPr>
+        <w:pStyle w:val="normal1"/>
+        <w:rPr>
+          <w:rFonts w:ascii="Calibri" w:hAnsi="Calibri" w:eastAsia="Calibri" w:cs="Calibri"/>
+        </w:rPr>
+      </w:pPr>
+      <w:r>
+        <w:rPr>
+          <w:rFonts w:eastAsia="Calibri" w:cs="Calibri" w:ascii="Calibri" w:hAnsi="Calibri"/>
+        </w:rPr>
+      </w:r>
+    </w:p>
+    <w:p>
+      <w:pPr>
+        <w:pStyle w:val="normal1"/>
+        <w:rPr>
+          <w:rFonts w:ascii="Calibri" w:hAnsi="Calibri" w:eastAsia="Calibri" w:cs="Calibri"/>
+        </w:rPr>
+      </w:pPr>
+      <w:r>
+        <w:rPr>
+          <w:rFonts w:eastAsia="Calibri" w:cs="Calibri" w:ascii="Calibri" w:hAnsi="Calibri"/>
+        </w:rPr>
+      </w:r>
+    </w:p>
     <w:p>
       <w:pPr>
         <w:pStyle w:val="normal1"/>
@@ -7594,23 +7317,7 @@
               <w:rPr>
                 <w:rFonts w:eastAsia="Calibri" w:cs="Calibri" w:ascii="Calibri" w:hAnsi="Calibri"/>
               </w:rPr>
-            </w:r>
-          </w:p>
-          <w:p>
-            <w:pPr>
-              <w:pStyle w:val="normal1"/>
-              <w:widowControl w:val="false"/>
-              <w:suppressAutoHyphens w:val="true"/>
-              <w:spacing w:lineRule="auto" w:line="240" w:before="0" w:after="0"/>
-              <w:jc w:val="start"/>
-              <w:rPr>
-                <w:rFonts w:ascii="Calibri" w:hAnsi="Calibri" w:eastAsia="Calibri" w:cs="Calibri"/>
-              </w:rPr>
-            </w:pPr>
-            <w:r>
-              <w:rPr>
-                <w:rFonts w:eastAsia="Calibri" w:cs="Calibri" w:ascii="Calibri" w:hAnsi="Calibri"/>
-              </w:rPr>
+              <w:t>Everything sucks</w:t>
             </w:r>
           </w:p>
           <w:p>
@@ -8353,7 +8060,7 @@
         </w:rPr>
         <w:tab/>
       </w:r>
-      <w:hyperlink r:id="rId17">
+      <w:hyperlink r:id="rId18">
         <w:r>
           <w:rPr>
             <w:rStyle w:val="Style3"/>
@@ -8399,8 +8106,8 @@
       </w:tblPr>
       <w:tblGrid>
         <w:gridCol w:w="4425"/>
-        <w:gridCol w:w="4943"/>
-        <w:gridCol w:w="547"/>
+        <w:gridCol w:w="4942"/>
+        <w:gridCol w:w="548"/>
       </w:tblGrid>
       <w:tr>
         <w:trPr/>
@@ -8443,7 +8150,7 @@
         </w:tc>
         <w:tc>
           <w:tcPr>
-            <w:tcW w:w="4943" w:type="dxa"/>
+            <w:tcW w:w="4942" w:type="dxa"/>
             <w:tcBorders>
               <w:top w:val="single" w:sz="8" w:space="0" w:color="000000"/>
               <w:start w:val="single" w:sz="8" w:space="0" w:color="000000"/>
@@ -8480,7 +8187,7 @@
         </w:tc>
         <w:tc>
           <w:tcPr>
-            <w:tcW w:w="547" w:type="dxa"/>
+            <w:tcW w:w="548" w:type="dxa"/>
             <w:tcBorders>
               <w:top w:val="single" w:sz="8" w:space="0" w:color="000000"/>
               <w:start w:val="single" w:sz="8" w:space="0" w:color="000000"/>
@@ -8552,7 +8259,7 @@
         </w:tc>
         <w:tc>
           <w:tcPr>
-            <w:tcW w:w="4943" w:type="dxa"/>
+            <w:tcW w:w="4942" w:type="dxa"/>
             <w:tcBorders>
               <w:top w:val="single" w:sz="8" w:space="0" w:color="000000"/>
               <w:start w:val="single" w:sz="8" w:space="0" w:color="000000"/>
@@ -8586,7 +8293,7 @@
         </w:tc>
         <w:tc>
           <w:tcPr>
-            <w:tcW w:w="547" w:type="dxa"/>
+            <w:tcW w:w="548" w:type="dxa"/>
             <w:tcBorders>
               <w:top w:val="single" w:sz="8" w:space="0" w:color="000000"/>
               <w:start w:val="single" w:sz="8" w:space="0" w:color="000000"/>
@@ -8653,7 +8360,7 @@
         </w:tc>
         <w:tc>
           <w:tcPr>
-            <w:tcW w:w="4943" w:type="dxa"/>
+            <w:tcW w:w="4942" w:type="dxa"/>
             <w:tcBorders>
               <w:top w:val="single" w:sz="8" w:space="0" w:color="000000"/>
               <w:start w:val="single" w:sz="8" w:space="0" w:color="000000"/>
@@ -8752,7 +8459,7 @@
         </w:tc>
         <w:tc>
           <w:tcPr>
-            <w:tcW w:w="547" w:type="dxa"/>
+            <w:tcW w:w="548" w:type="dxa"/>
             <w:tcBorders>
               <w:top w:val="single" w:sz="8" w:space="0" w:color="000000"/>
               <w:start w:val="single" w:sz="8" w:space="0" w:color="000000"/>
@@ -8819,7 +8526,7 @@
         </w:tc>
         <w:tc>
           <w:tcPr>
-            <w:tcW w:w="4943" w:type="dxa"/>
+            <w:tcW w:w="4942" w:type="dxa"/>
             <w:tcBorders>
               <w:top w:val="single" w:sz="8" w:space="0" w:color="000000"/>
               <w:start w:val="single" w:sz="8" w:space="0" w:color="000000"/>
@@ -8853,7 +8560,7 @@
         </w:tc>
         <w:tc>
           <w:tcPr>
-            <w:tcW w:w="547" w:type="dxa"/>
+            <w:tcW w:w="548" w:type="dxa"/>
             <w:tcBorders>
               <w:top w:val="single" w:sz="8" w:space="0" w:color="000000"/>
               <w:start w:val="single" w:sz="8" w:space="0" w:color="000000"/>
@@ -8920,7 +8627,7 @@
         </w:tc>
         <w:tc>
           <w:tcPr>
-            <w:tcW w:w="4943" w:type="dxa"/>
+            <w:tcW w:w="4942" w:type="dxa"/>
             <w:tcBorders>
               <w:top w:val="single" w:sz="8" w:space="0" w:color="000000"/>
               <w:start w:val="single" w:sz="8" w:space="0" w:color="000000"/>
@@ -8954,7 +8661,7 @@
         </w:tc>
         <w:tc>
           <w:tcPr>
-            <w:tcW w:w="547" w:type="dxa"/>
+            <w:tcW w:w="548" w:type="dxa"/>
             <w:tcBorders>
               <w:top w:val="single" w:sz="8" w:space="0" w:color="000000"/>
               <w:start w:val="single" w:sz="8" w:space="0" w:color="000000"/>
@@ -9024,7 +8731,7 @@
         </w:tc>
         <w:tc>
           <w:tcPr>
-            <w:tcW w:w="4943" w:type="dxa"/>
+            <w:tcW w:w="4942" w:type="dxa"/>
             <w:tcBorders>
               <w:top w:val="single" w:sz="8" w:space="0" w:color="000000"/>
               <w:start w:val="single" w:sz="8" w:space="0" w:color="000000"/>
@@ -9055,7 +8762,7 @@
         </w:tc>
         <w:tc>
           <w:tcPr>
-            <w:tcW w:w="547" w:type="dxa"/>
+            <w:tcW w:w="548" w:type="dxa"/>
             <w:tcBorders>
               <w:top w:val="single" w:sz="8" w:space="0" w:color="000000"/>
               <w:start w:val="single" w:sz="8" w:space="0" w:color="000000"/>
@@ -9123,7 +8830,7 @@
         </w:tc>
         <w:tc>
           <w:tcPr>
-            <w:tcW w:w="4943" w:type="dxa"/>
+            <w:tcW w:w="4942" w:type="dxa"/>
             <w:tcBorders>
               <w:top w:val="single" w:sz="8" w:space="0" w:color="000000"/>
               <w:start w:val="single" w:sz="8" w:space="0" w:color="000000"/>
@@ -9180,7 +8887,7 @@
         </w:tc>
         <w:tc>
           <w:tcPr>
-            <w:tcW w:w="547" w:type="dxa"/>
+            <w:tcW w:w="548" w:type="dxa"/>
             <w:tcBorders>
               <w:top w:val="single" w:sz="8" w:space="0" w:color="000000"/>
               <w:start w:val="single" w:sz="8" w:space="0" w:color="000000"/>
@@ -9247,7 +8954,7 @@
         </w:tc>
         <w:tc>
           <w:tcPr>
-            <w:tcW w:w="4943" w:type="dxa"/>
+            <w:tcW w:w="4942" w:type="dxa"/>
             <w:tcBorders>
               <w:top w:val="single" w:sz="8" w:space="0" w:color="000000"/>
               <w:start w:val="single" w:sz="8" w:space="0" w:color="000000"/>
@@ -9304,7 +9011,7 @@
         </w:tc>
         <w:tc>
           <w:tcPr>
-            <w:tcW w:w="547" w:type="dxa"/>
+            <w:tcW w:w="548" w:type="dxa"/>
             <w:tcBorders>
               <w:top w:val="single" w:sz="8" w:space="0" w:color="000000"/>
               <w:start w:val="single" w:sz="8" w:space="0" w:color="000000"/>
@@ -9374,7 +9081,7 @@
         </w:tc>
         <w:tc>
           <w:tcPr>
-            <w:tcW w:w="4943" w:type="dxa"/>
+            <w:tcW w:w="4942" w:type="dxa"/>
             <w:tcBorders>
               <w:top w:val="single" w:sz="8" w:space="0" w:color="000000"/>
               <w:start w:val="single" w:sz="8" w:space="0" w:color="000000"/>
@@ -9405,7 +9112,7 @@
         </w:tc>
         <w:tc>
           <w:tcPr>
-            <w:tcW w:w="547" w:type="dxa"/>
+            <w:tcW w:w="548" w:type="dxa"/>
             <w:tcBorders>
               <w:top w:val="single" w:sz="8" w:space="0" w:color="000000"/>
               <w:start w:val="single" w:sz="8" w:space="0" w:color="000000"/>
@@ -9473,7 +9180,7 @@
         </w:tc>
         <w:tc>
           <w:tcPr>
-            <w:tcW w:w="4943" w:type="dxa"/>
+            <w:tcW w:w="4942" w:type="dxa"/>
             <w:tcBorders>
               <w:top w:val="single" w:sz="8" w:space="0" w:color="000000"/>
               <w:start w:val="single" w:sz="8" w:space="0" w:color="000000"/>
@@ -9507,7 +9214,7 @@
         </w:tc>
         <w:tc>
           <w:tcPr>
-            <w:tcW w:w="547" w:type="dxa"/>
+            <w:tcW w:w="548" w:type="dxa"/>
             <w:tcBorders>
               <w:top w:val="single" w:sz="8" w:space="0" w:color="000000"/>
               <w:start w:val="single" w:sz="8" w:space="0" w:color="000000"/>
@@ -9577,7 +9284,7 @@
         </w:tc>
         <w:tc>
           <w:tcPr>
-            <w:tcW w:w="4943" w:type="dxa"/>
+            <w:tcW w:w="4942" w:type="dxa"/>
             <w:tcBorders>
               <w:top w:val="single" w:sz="8" w:space="0" w:color="000000"/>
               <w:start w:val="single" w:sz="8" w:space="0" w:color="000000"/>
@@ -9611,7 +9318,7 @@
         </w:tc>
         <w:tc>
           <w:tcPr>
-            <w:tcW w:w="547" w:type="dxa"/>
+            <w:tcW w:w="548" w:type="dxa"/>
             <w:tcBorders>
               <w:top w:val="single" w:sz="8" w:space="0" w:color="000000"/>
               <w:start w:val="single" w:sz="8" w:space="0" w:color="000000"/>
@@ -9679,7 +9386,7 @@
         </w:tc>
         <w:tc>
           <w:tcPr>
-            <w:tcW w:w="4943" w:type="dxa"/>
+            <w:tcW w:w="4942" w:type="dxa"/>
             <w:tcBorders>
               <w:top w:val="single" w:sz="8" w:space="0" w:color="000000"/>
               <w:start w:val="single" w:sz="8" w:space="0" w:color="000000"/>
@@ -9713,7 +9420,7 @@
         </w:tc>
         <w:tc>
           <w:tcPr>
-            <w:tcW w:w="547" w:type="dxa"/>
+            <w:tcW w:w="548" w:type="dxa"/>
             <w:tcBorders>
               <w:top w:val="single" w:sz="8" w:space="0" w:color="000000"/>
               <w:start w:val="single" w:sz="8" w:space="0" w:color="000000"/>
@@ -9847,7 +9554,7 @@
         </w:rPr>
         <w:tab/>
       </w:r>
-      <w:hyperlink r:id="rId18">
+      <w:hyperlink r:id="rId19">
         <w:r>
           <w:rPr>
             <w:rStyle w:val="Style3"/>
@@ -9899,15 +9606,15 @@
         <w:tblLook w:val="0600" w:firstRow="0" w:noVBand="1" w:lastRow="0" w:firstColumn="0" w:lastColumn="0" w:noHBand="1"/>
       </w:tblPr>
       <w:tblGrid>
-        <w:gridCol w:w="4493"/>
+        <w:gridCol w:w="4492"/>
         <w:gridCol w:w="4965"/>
-        <w:gridCol w:w="562"/>
+        <w:gridCol w:w="563"/>
       </w:tblGrid>
       <w:tr>
         <w:trPr/>
         <w:tc>
           <w:tcPr>
-            <w:tcW w:w="4493" w:type="dxa"/>
+            <w:tcW w:w="4492" w:type="dxa"/>
             <w:tcBorders>
               <w:top w:val="single" w:sz="8" w:space="0" w:color="000000"/>
               <w:start w:val="single" w:sz="8" w:space="0" w:color="000000"/>
@@ -9981,7 +9688,7 @@
         </w:tc>
         <w:tc>
           <w:tcPr>
-            <w:tcW w:w="562" w:type="dxa"/>
+            <w:tcW w:w="563" w:type="dxa"/>
             <w:tcBorders>
               <w:top w:val="single" w:sz="8" w:space="0" w:color="000000"/>
               <w:start w:val="single" w:sz="8" w:space="0" w:color="000000"/>
@@ -10015,7 +9722,7 @@
         <w:trPr/>
         <w:tc>
           <w:tcPr>
-            <w:tcW w:w="4493" w:type="dxa"/>
+            <w:tcW w:w="4492" w:type="dxa"/>
             <w:tcBorders>
               <w:top w:val="single" w:sz="8" w:space="0" w:color="000000"/>
               <w:start w:val="single" w:sz="8" w:space="0" w:color="000000"/>
@@ -10083,7 +9790,7 @@
         </w:tc>
         <w:tc>
           <w:tcPr>
-            <w:tcW w:w="562" w:type="dxa"/>
+            <w:tcW w:w="563" w:type="dxa"/>
             <w:tcBorders>
               <w:top w:val="single" w:sz="8" w:space="0" w:color="000000"/>
               <w:start w:val="single" w:sz="8" w:space="0" w:color="000000"/>
@@ -10116,7 +9823,7 @@
         <w:trPr/>
         <w:tc>
           <w:tcPr>
-            <w:tcW w:w="4493" w:type="dxa"/>
+            <w:tcW w:w="4492" w:type="dxa"/>
             <w:tcBorders>
               <w:top w:val="single" w:sz="8" w:space="0" w:color="000000"/>
               <w:start w:val="single" w:sz="8" w:space="0" w:color="000000"/>
@@ -10184,7 +9891,7 @@
         </w:tc>
         <w:tc>
           <w:tcPr>
-            <w:tcW w:w="562" w:type="dxa"/>
+            <w:tcW w:w="563" w:type="dxa"/>
             <w:tcBorders>
               <w:top w:val="single" w:sz="8" w:space="0" w:color="000000"/>
               <w:start w:val="single" w:sz="8" w:space="0" w:color="000000"/>
@@ -10217,7 +9924,7 @@
         <w:trPr/>
         <w:tc>
           <w:tcPr>
-            <w:tcW w:w="4493" w:type="dxa"/>
+            <w:tcW w:w="4492" w:type="dxa"/>
             <w:tcBorders>
               <w:top w:val="single" w:sz="8" w:space="0" w:color="000000"/>
               <w:start w:val="single" w:sz="8" w:space="0" w:color="000000"/>
@@ -10285,7 +9992,7 @@
         </w:tc>
         <w:tc>
           <w:tcPr>
-            <w:tcW w:w="562" w:type="dxa"/>
+            <w:tcW w:w="563" w:type="dxa"/>
             <w:tcBorders>
               <w:top w:val="single" w:sz="8" w:space="0" w:color="000000"/>
               <w:start w:val="single" w:sz="8" w:space="0" w:color="000000"/>
@@ -10318,7 +10025,7 @@
         <w:trPr/>
         <w:tc>
           <w:tcPr>
-            <w:tcW w:w="4493" w:type="dxa"/>
+            <w:tcW w:w="4492" w:type="dxa"/>
             <w:tcBorders>
               <w:top w:val="single" w:sz="8" w:space="0" w:color="000000"/>
               <w:start w:val="single" w:sz="8" w:space="0" w:color="000000"/>
@@ -10386,7 +10093,7 @@
         </w:tc>
         <w:tc>
           <w:tcPr>
-            <w:tcW w:w="562" w:type="dxa"/>
+            <w:tcW w:w="563" w:type="dxa"/>
             <w:tcBorders>
               <w:top w:val="single" w:sz="8" w:space="0" w:color="000000"/>
               <w:start w:val="single" w:sz="8" w:space="0" w:color="000000"/>
@@ -10419,7 +10126,7 @@
         <w:trPr/>
         <w:tc>
           <w:tcPr>
-            <w:tcW w:w="4493" w:type="dxa"/>
+            <w:tcW w:w="4492" w:type="dxa"/>
             <w:tcBorders>
               <w:top w:val="single" w:sz="8" w:space="0" w:color="000000"/>
               <w:start w:val="single" w:sz="8" w:space="0" w:color="000000"/>
@@ -10487,7 +10194,7 @@
         </w:tc>
         <w:tc>
           <w:tcPr>
-            <w:tcW w:w="562" w:type="dxa"/>
+            <w:tcW w:w="563" w:type="dxa"/>
             <w:tcBorders>
               <w:top w:val="single" w:sz="8" w:space="0" w:color="000000"/>
               <w:start w:val="single" w:sz="8" w:space="0" w:color="000000"/>
@@ -10521,7 +10228,7 @@
         <w:trPr/>
         <w:tc>
           <w:tcPr>
-            <w:tcW w:w="4493" w:type="dxa"/>
+            <w:tcW w:w="4492" w:type="dxa"/>
             <w:tcBorders>
               <w:top w:val="single" w:sz="8" w:space="0" w:color="000000"/>
               <w:start w:val="single" w:sz="8" w:space="0" w:color="000000"/>
@@ -10589,7 +10296,7 @@
         </w:tc>
         <w:tc>
           <w:tcPr>
-            <w:tcW w:w="562" w:type="dxa"/>
+            <w:tcW w:w="563" w:type="dxa"/>
             <w:tcBorders>
               <w:top w:val="single" w:sz="8" w:space="0" w:color="000000"/>
               <w:start w:val="single" w:sz="8" w:space="0" w:color="000000"/>
@@ -10622,7 +10329,7 @@
         <w:trPr/>
         <w:tc>
           <w:tcPr>
-            <w:tcW w:w="4493" w:type="dxa"/>
+            <w:tcW w:w="4492" w:type="dxa"/>
             <w:tcBorders>
               <w:top w:val="single" w:sz="8" w:space="0" w:color="000000"/>
               <w:start w:val="single" w:sz="8" w:space="0" w:color="000000"/>
@@ -10690,7 +10397,7 @@
         </w:tc>
         <w:tc>
           <w:tcPr>
-            <w:tcW w:w="562" w:type="dxa"/>
+            <w:tcW w:w="563" w:type="dxa"/>
             <w:tcBorders>
               <w:top w:val="single" w:sz="8" w:space="0" w:color="000000"/>
               <w:start w:val="single" w:sz="8" w:space="0" w:color="000000"/>
@@ -10723,7 +10430,7 @@
         <w:trPr/>
         <w:tc>
           <w:tcPr>
-            <w:tcW w:w="4493" w:type="dxa"/>
+            <w:tcW w:w="4492" w:type="dxa"/>
             <w:tcBorders>
               <w:top w:val="single" w:sz="8" w:space="0" w:color="000000"/>
               <w:start w:val="single" w:sz="8" w:space="0" w:color="000000"/>
@@ -10793,7 +10500,7 @@
         </w:tc>
         <w:tc>
           <w:tcPr>
-            <w:tcW w:w="562" w:type="dxa"/>
+            <w:tcW w:w="563" w:type="dxa"/>
             <w:tcBorders>
               <w:top w:val="single" w:sz="8" w:space="0" w:color="000000"/>
               <w:start w:val="single" w:sz="8" w:space="0" w:color="000000"/>
@@ -10827,7 +10534,7 @@
         <w:trPr/>
         <w:tc>
           <w:tcPr>
-            <w:tcW w:w="4493" w:type="dxa"/>
+            <w:tcW w:w="4492" w:type="dxa"/>
             <w:tcBorders>
               <w:top w:val="single" w:sz="8" w:space="0" w:color="000000"/>
               <w:start w:val="single" w:sz="8" w:space="0" w:color="000000"/>
@@ -10895,7 +10602,7 @@
         </w:tc>
         <w:tc>
           <w:tcPr>
-            <w:tcW w:w="562" w:type="dxa"/>
+            <w:tcW w:w="563" w:type="dxa"/>
             <w:tcBorders>
               <w:top w:val="single" w:sz="8" w:space="0" w:color="000000"/>
               <w:start w:val="single" w:sz="8" w:space="0" w:color="000000"/>
@@ -10933,7 +10640,7 @@
         <w:trPr/>
         <w:tc>
           <w:tcPr>
-            <w:tcW w:w="4493" w:type="dxa"/>
+            <w:tcW w:w="4492" w:type="dxa"/>
             <w:tcBorders>
               <w:top w:val="single" w:sz="8" w:space="0" w:color="000000"/>
               <w:start w:val="single" w:sz="8" w:space="0" w:color="000000"/>
@@ -11001,7 +10708,7 @@
         </w:tc>
         <w:tc>
           <w:tcPr>
-            <w:tcW w:w="562" w:type="dxa"/>
+            <w:tcW w:w="563" w:type="dxa"/>
             <w:tcBorders>
               <w:top w:val="single" w:sz="8" w:space="0" w:color="000000"/>
               <w:start w:val="single" w:sz="8" w:space="0" w:color="000000"/>
@@ -11150,7 +10857,7 @@
         </w:rPr>
         <w:tab/>
       </w:r>
-      <w:hyperlink r:id="rId19">
+      <w:hyperlink r:id="rId20">
         <w:r>
           <w:rPr>
             <w:rStyle w:val="Style3"/>
@@ -11202,15 +10909,15 @@
         <w:tblLook w:val="0600" w:firstRow="0" w:noVBand="1" w:lastRow="0" w:firstColumn="0" w:lastColumn="0" w:noHBand="1"/>
       </w:tblPr>
       <w:tblGrid>
-        <w:gridCol w:w="4493"/>
-        <w:gridCol w:w="5047"/>
+        <w:gridCol w:w="4492"/>
+        <w:gridCol w:w="5048"/>
         <w:gridCol w:w="480"/>
       </w:tblGrid>
       <w:tr>
         <w:trPr/>
         <w:tc>
           <w:tcPr>
-            <w:tcW w:w="4493" w:type="dxa"/>
+            <w:tcW w:w="4492" w:type="dxa"/>
             <w:tcBorders>
               <w:top w:val="single" w:sz="8" w:space="0" w:color="000000"/>
               <w:start w:val="single" w:sz="8" w:space="0" w:color="000000"/>
@@ -11247,7 +10954,7 @@
         </w:tc>
         <w:tc>
           <w:tcPr>
-            <w:tcW w:w="5047" w:type="dxa"/>
+            <w:tcW w:w="5048" w:type="dxa"/>
             <w:tcBorders>
               <w:top w:val="single" w:sz="8" w:space="0" w:color="000000"/>
               <w:start w:val="single" w:sz="8" w:space="0" w:color="000000"/>
@@ -11318,7 +11025,7 @@
         <w:trPr/>
         <w:tc>
           <w:tcPr>
-            <w:tcW w:w="4493" w:type="dxa"/>
+            <w:tcW w:w="4492" w:type="dxa"/>
             <w:tcBorders>
               <w:top w:val="single" w:sz="8" w:space="0" w:color="000000"/>
               <w:start w:val="single" w:sz="8" w:space="0" w:color="000000"/>
@@ -11352,7 +11059,7 @@
         </w:tc>
         <w:tc>
           <w:tcPr>
-            <w:tcW w:w="5047" w:type="dxa"/>
+            <w:tcW w:w="5048" w:type="dxa"/>
             <w:tcBorders>
               <w:top w:val="single" w:sz="8" w:space="0" w:color="000000"/>
               <w:start w:val="single" w:sz="8" w:space="0" w:color="000000"/>
@@ -11419,7 +11126,7 @@
         <w:trPr/>
         <w:tc>
           <w:tcPr>
-            <w:tcW w:w="4493" w:type="dxa"/>
+            <w:tcW w:w="4492" w:type="dxa"/>
             <w:tcBorders>
               <w:top w:val="single" w:sz="8" w:space="0" w:color="000000"/>
               <w:start w:val="single" w:sz="8" w:space="0" w:color="000000"/>
@@ -11453,7 +11160,7 @@
         </w:tc>
         <w:tc>
           <w:tcPr>
-            <w:tcW w:w="5047" w:type="dxa"/>
+            <w:tcW w:w="5048" w:type="dxa"/>
             <w:tcBorders>
               <w:top w:val="single" w:sz="8" w:space="0" w:color="000000"/>
               <w:start w:val="single" w:sz="8" w:space="0" w:color="000000"/>
@@ -11596,7 +11303,7 @@
         <w:trPr/>
         <w:tc>
           <w:tcPr>
-            <w:tcW w:w="4493" w:type="dxa"/>
+            <w:tcW w:w="4492" w:type="dxa"/>
             <w:tcBorders>
               <w:top w:val="single" w:sz="8" w:space="0" w:color="000000"/>
               <w:start w:val="single" w:sz="8" w:space="0" w:color="000000"/>
@@ -11630,7 +11337,7 @@
         </w:tc>
         <w:tc>
           <w:tcPr>
-            <w:tcW w:w="5047" w:type="dxa"/>
+            <w:tcW w:w="5048" w:type="dxa"/>
             <w:tcBorders>
               <w:top w:val="single" w:sz="8" w:space="0" w:color="000000"/>
               <w:start w:val="single" w:sz="8" w:space="0" w:color="000000"/>
@@ -11697,7 +11404,7 @@
         <w:trPr/>
         <w:tc>
           <w:tcPr>
-            <w:tcW w:w="4493" w:type="dxa"/>
+            <w:tcW w:w="4492" w:type="dxa"/>
             <w:tcBorders>
               <w:top w:val="single" w:sz="8" w:space="0" w:color="000000"/>
               <w:start w:val="single" w:sz="8" w:space="0" w:color="000000"/>
@@ -11731,7 +11438,7 @@
         </w:tc>
         <w:tc>
           <w:tcPr>
-            <w:tcW w:w="5047" w:type="dxa"/>
+            <w:tcW w:w="5048" w:type="dxa"/>
             <w:tcBorders>
               <w:top w:val="single" w:sz="8" w:space="0" w:color="000000"/>
               <w:start w:val="single" w:sz="8" w:space="0" w:color="000000"/>
@@ -11798,7 +11505,7 @@
         <w:trPr/>
         <w:tc>
           <w:tcPr>
-            <w:tcW w:w="4493" w:type="dxa"/>
+            <w:tcW w:w="4492" w:type="dxa"/>
             <w:tcBorders>
               <w:top w:val="single" w:sz="8" w:space="0" w:color="000000"/>
               <w:start w:val="single" w:sz="8" w:space="0" w:color="000000"/>
@@ -11835,7 +11542,7 @@
         </w:tc>
         <w:tc>
           <w:tcPr>
-            <w:tcW w:w="5047" w:type="dxa"/>
+            <w:tcW w:w="5048" w:type="dxa"/>
             <w:tcBorders>
               <w:top w:val="single" w:sz="8" w:space="0" w:color="000000"/>
               <w:start w:val="single" w:sz="8" w:space="0" w:color="000000"/>
@@ -11900,7 +11607,7 @@
         <w:trPr/>
         <w:tc>
           <w:tcPr>
-            <w:tcW w:w="4493" w:type="dxa"/>
+            <w:tcW w:w="4492" w:type="dxa"/>
             <w:tcBorders>
               <w:top w:val="single" w:sz="8" w:space="0" w:color="000000"/>
               <w:start w:val="single" w:sz="8" w:space="0" w:color="000000"/>
@@ -11934,7 +11641,7 @@
         </w:tc>
         <w:tc>
           <w:tcPr>
-            <w:tcW w:w="5047" w:type="dxa"/>
+            <w:tcW w:w="5048" w:type="dxa"/>
             <w:tcBorders>
               <w:top w:val="single" w:sz="8" w:space="0" w:color="000000"/>
               <w:start w:val="single" w:sz="8" w:space="0" w:color="000000"/>
@@ -12001,7 +11708,7 @@
         <w:trPr/>
         <w:tc>
           <w:tcPr>
-            <w:tcW w:w="4493" w:type="dxa"/>
+            <w:tcW w:w="4492" w:type="dxa"/>
             <w:tcBorders>
               <w:top w:val="single" w:sz="8" w:space="0" w:color="000000"/>
               <w:start w:val="single" w:sz="8" w:space="0" w:color="000000"/>
@@ -12037,7 +11744,7 @@
         </w:tc>
         <w:tc>
           <w:tcPr>
-            <w:tcW w:w="5047" w:type="dxa"/>
+            <w:tcW w:w="5048" w:type="dxa"/>
             <w:tcBorders>
               <w:top w:val="single" w:sz="8" w:space="0" w:color="000000"/>
               <w:start w:val="single" w:sz="8" w:space="0" w:color="000000"/>
@@ -12104,7 +11811,7 @@
         <w:trPr/>
         <w:tc>
           <w:tcPr>
-            <w:tcW w:w="4493" w:type="dxa"/>
+            <w:tcW w:w="4492" w:type="dxa"/>
             <w:tcBorders>
               <w:top w:val="single" w:sz="8" w:space="0" w:color="000000"/>
               <w:start w:val="single" w:sz="8" w:space="0" w:color="000000"/>
@@ -12138,7 +11845,7 @@
         </w:tc>
         <w:tc>
           <w:tcPr>
-            <w:tcW w:w="5047" w:type="dxa"/>
+            <w:tcW w:w="5048" w:type="dxa"/>
             <w:tcBorders>
               <w:top w:val="single" w:sz="8" w:space="0" w:color="000000"/>
               <w:start w:val="single" w:sz="8" w:space="0" w:color="000000"/>
@@ -12205,7 +11912,7 @@
         <w:trPr/>
         <w:tc>
           <w:tcPr>
-            <w:tcW w:w="4493" w:type="dxa"/>
+            <w:tcW w:w="4492" w:type="dxa"/>
             <w:tcBorders>
               <w:top w:val="single" w:sz="8" w:space="0" w:color="000000"/>
               <w:start w:val="single" w:sz="8" w:space="0" w:color="000000"/>
@@ -12242,7 +11949,7 @@
         </w:tc>
         <w:tc>
           <w:tcPr>
-            <w:tcW w:w="5047" w:type="dxa"/>
+            <w:tcW w:w="5048" w:type="dxa"/>
             <w:tcBorders>
               <w:top w:val="single" w:sz="8" w:space="0" w:color="000000"/>
               <w:start w:val="single" w:sz="8" w:space="0" w:color="000000"/>
@@ -12307,7 +12014,7 @@
         <w:trPr/>
         <w:tc>
           <w:tcPr>
-            <w:tcW w:w="4493" w:type="dxa"/>
+            <w:tcW w:w="4492" w:type="dxa"/>
             <w:tcBorders>
               <w:top w:val="single" w:sz="8" w:space="0" w:color="000000"/>
               <w:start w:val="single" w:sz="8" w:space="0" w:color="000000"/>
@@ -12341,7 +12048,7 @@
         </w:tc>
         <w:tc>
           <w:tcPr>
-            <w:tcW w:w="5047" w:type="dxa"/>
+            <w:tcW w:w="5048" w:type="dxa"/>
             <w:tcBorders>
               <w:top w:val="single" w:sz="8" w:space="0" w:color="000000"/>
               <w:start w:val="single" w:sz="8" w:space="0" w:color="000000"/>
@@ -12409,7 +12116,7 @@
         <w:trPr/>
         <w:tc>
           <w:tcPr>
-            <w:tcW w:w="4493" w:type="dxa"/>
+            <w:tcW w:w="4492" w:type="dxa"/>
             <w:tcBorders>
               <w:top w:val="single" w:sz="8" w:space="0" w:color="000000"/>
               <w:start w:val="single" w:sz="8" w:space="0" w:color="000000"/>
@@ -12443,7 +12150,7 @@
         </w:tc>
         <w:tc>
           <w:tcPr>
-            <w:tcW w:w="5047" w:type="dxa"/>
+            <w:tcW w:w="5048" w:type="dxa"/>
             <w:tcBorders>
               <w:top w:val="single" w:sz="8" w:space="0" w:color="000000"/>
               <w:start w:val="single" w:sz="8" w:space="0" w:color="000000"/>
@@ -12511,7 +12218,7 @@
         <w:trPr/>
         <w:tc>
           <w:tcPr>
-            <w:tcW w:w="4493" w:type="dxa"/>
+            <w:tcW w:w="4492" w:type="dxa"/>
             <w:tcBorders>
               <w:top w:val="single" w:sz="8" w:space="0" w:color="000000"/>
               <w:start w:val="single" w:sz="8" w:space="0" w:color="000000"/>
@@ -12545,7 +12252,7 @@
         </w:tc>
         <w:tc>
           <w:tcPr>
-            <w:tcW w:w="5047" w:type="dxa"/>
+            <w:tcW w:w="5048" w:type="dxa"/>
             <w:tcBorders>
               <w:top w:val="single" w:sz="8" w:space="0" w:color="000000"/>
               <w:start w:val="single" w:sz="8" w:space="0" w:color="000000"/>
@@ -12635,12 +12342,12 @@
       </w:r>
     </w:p>
     <w:sectPr>
-      <w:headerReference w:type="even" r:id="rId20"/>
-      <w:headerReference w:type="default" r:id="rId21"/>
-      <w:headerReference w:type="first" r:id="rId22"/>
-      <w:footerReference w:type="even" r:id="rId23"/>
-      <w:footerReference w:type="default" r:id="rId24"/>
-      <w:footerReference w:type="first" r:id="rId25"/>
+      <w:headerReference w:type="even" r:id="rId21"/>
+      <w:headerReference w:type="default" r:id="rId22"/>
+      <w:headerReference w:type="first" r:id="rId23"/>
+      <w:footerReference w:type="even" r:id="rId24"/>
+      <w:footerReference w:type="default" r:id="rId25"/>
+      <w:footerReference w:type="first" r:id="rId26"/>
       <w:type w:val="nextPage"/>
       <w:pgSz w:w="11906" w:h="16838"/>
       <w:pgMar w:left="720" w:right="720" w:gutter="0" w:header="720" w:top="777" w:footer="720" w:bottom="777"/>
@@ -12681,7 +12388,7 @@
         <wp:inline distT="0" distB="0" distL="0" distR="0">
           <wp:extent cx="877570" cy="307340"/>
           <wp:effectExtent l="0" t="0" r="0" b="0"/>
-          <wp:docPr id="20" name="image2.png"/>
+          <wp:docPr id="21" name="image2.png"/>
           <wp:cNvGraphicFramePr>
             <a:graphicFrameLocks xmlns:a="http://schemas.openxmlformats.org/drawingml/2006/main" noChangeAspect="1"/>
           </wp:cNvGraphicFramePr>
@@ -12689,7 +12396,7 @@
             <a:graphicData uri="http://schemas.openxmlformats.org/drawingml/2006/picture">
               <pic:pic xmlns:pic="http://schemas.openxmlformats.org/drawingml/2006/picture">
                 <pic:nvPicPr>
-                  <pic:cNvPr id="20" name="image2.png"/>
+                  <pic:cNvPr id="21" name="image2.png"/>
                   <pic:cNvPicPr>
                     <a:picLocks noChangeAspect="1" noChangeArrowheads="1"/>
                   </pic:cNvPicPr>
@@ -12789,7 +12496,7 @@
         <wp:inline distT="0" distB="0" distL="0" distR="0">
           <wp:extent cx="877570" cy="307340"/>
           <wp:effectExtent l="0" t="0" r="0" b="0"/>
-          <wp:docPr id="21" name="image2.png"/>
+          <wp:docPr id="22" name="image2.png"/>
           <wp:cNvGraphicFramePr>
             <a:graphicFrameLocks xmlns:a="http://schemas.openxmlformats.org/drawingml/2006/main" noChangeAspect="1"/>
           </wp:cNvGraphicFramePr>
@@ -12797,7 +12504,7 @@
             <a:graphicData uri="http://schemas.openxmlformats.org/drawingml/2006/picture">
               <pic:pic xmlns:pic="http://schemas.openxmlformats.org/drawingml/2006/picture">
                 <pic:nvPicPr>
-                  <pic:cNvPr id="21" name="image2.png"/>
+                  <pic:cNvPr id="22" name="image2.png"/>
                   <pic:cNvPicPr>
                     <a:picLocks noChangeAspect="1" noChangeArrowheads="1"/>
                   </pic:cNvPicPr>
@@ -12910,7 +12617,7 @@
         <wp:inline distT="0" distB="0" distL="0" distR="0">
           <wp:extent cx="1190625" cy="190500"/>
           <wp:effectExtent l="0" t="0" r="0" b="0"/>
-          <wp:docPr id="16" name="image1.png"/>
+          <wp:docPr id="17" name="image1.png"/>
           <wp:cNvGraphicFramePr>
             <a:graphicFrameLocks xmlns:a="http://schemas.openxmlformats.org/drawingml/2006/main" noChangeAspect="1"/>
           </wp:cNvGraphicFramePr>
@@ -12918,7 +12625,7 @@
             <a:graphicData uri="http://schemas.openxmlformats.org/drawingml/2006/picture">
               <pic:pic xmlns:pic="http://schemas.openxmlformats.org/drawingml/2006/picture">
                 <pic:nvPicPr>
-                  <pic:cNvPr id="16" name="image1.png"/>
+                  <pic:cNvPr id="17" name="image1.png"/>
                   <pic:cNvPicPr>
                     <a:picLocks noChangeAspect="1" noChangeArrowheads="1"/>
                   </pic:cNvPicPr>
@@ -12957,7 +12664,7 @@
           <wp:extent cx="595630" cy="622935"/>
           <wp:effectExtent l="0" t="0" r="0" b="0"/>
           <wp:wrapNone/>
-          <wp:docPr id="17" name="image4.png"/>
+          <wp:docPr id="18" name="image4.png"/>
           <wp:cNvGraphicFramePr>
             <a:graphicFrameLocks xmlns:a="http://schemas.openxmlformats.org/drawingml/2006/main" noChangeAspect="1"/>
           </wp:cNvGraphicFramePr>
@@ -12965,7 +12672,7 @@
             <a:graphicData uri="http://schemas.openxmlformats.org/drawingml/2006/picture">
               <pic:pic xmlns:pic="http://schemas.openxmlformats.org/drawingml/2006/picture">
                 <pic:nvPicPr>
-                  <pic:cNvPr id="17" name="image4.png"/>
+                  <pic:cNvPr id="18" name="image4.png"/>
                   <pic:cNvPicPr>
                     <a:picLocks noChangeAspect="1" noChangeArrowheads="1"/>
                   </pic:cNvPicPr>
@@ -12994,15 +12701,6 @@
       </w:drawing>
     </w:r>
   </w:p>
-  <w:p>
-    <w:pPr>
-      <w:pStyle w:val="normal1"/>
-      <w:rPr/>
-    </w:pPr>
-    <w:r>
-      <w:rPr/>
-    </w:r>
-  </w:p>
 </w:hdr>
 </file>
 
@@ -13019,7 +12717,7 @@
         <wp:inline distT="0" distB="0" distL="0" distR="0">
           <wp:extent cx="1190625" cy="190500"/>
           <wp:effectExtent l="0" t="0" r="0" b="0"/>
-          <wp:docPr id="18" name="image1.png"/>
+          <wp:docPr id="19" name="image1.png"/>
           <wp:cNvGraphicFramePr>
             <a:graphicFrameLocks xmlns:a="http://schemas.openxmlformats.org/drawingml/2006/main" noChangeAspect="1"/>
           </wp:cNvGraphicFramePr>
@@ -13027,7 +12725,7 @@
             <a:graphicData uri="http://schemas.openxmlformats.org/drawingml/2006/picture">
               <pic:pic xmlns:pic="http://schemas.openxmlformats.org/drawingml/2006/picture">
                 <pic:nvPicPr>
-                  <pic:cNvPr id="18" name="image1.png"/>
+                  <pic:cNvPr id="19" name="image1.png"/>
                   <pic:cNvPicPr>
                     <a:picLocks noChangeAspect="1" noChangeArrowheads="1"/>
                   </pic:cNvPicPr>
@@ -13066,7 +12764,7 @@
           <wp:extent cx="595630" cy="622935"/>
           <wp:effectExtent l="0" t="0" r="0" b="0"/>
           <wp:wrapNone/>
-          <wp:docPr id="19" name="image4.png"/>
+          <wp:docPr id="20" name="image4.png"/>
           <wp:cNvGraphicFramePr>
             <a:graphicFrameLocks xmlns:a="http://schemas.openxmlformats.org/drawingml/2006/main" noChangeAspect="1"/>
           </wp:cNvGraphicFramePr>
@@ -13074,7 +12772,7 @@
             <a:graphicData uri="http://schemas.openxmlformats.org/drawingml/2006/picture">
               <pic:pic xmlns:pic="http://schemas.openxmlformats.org/drawingml/2006/picture">
                 <pic:nvPicPr>
-                  <pic:cNvPr id="19" name="image4.png"/>
+                  <pic:cNvPr id="20" name="image4.png"/>
                   <pic:cNvPicPr>
                     <a:picLocks noChangeAspect="1" noChangeArrowheads="1"/>
                   </pic:cNvPicPr>
@@ -13101,15 +12799,6 @@
           </a:graphic>
         </wp:anchor>
       </w:drawing>
-    </w:r>
-  </w:p>
-  <w:p>
-    <w:pPr>
-      <w:pStyle w:val="normal1"/>
-      <w:rPr/>
-    </w:pPr>
-    <w:r>
-      <w:rPr/>
     </w:r>
   </w:p>
 </w:hdr>

</xml_diff>